<commit_message>
Update instructivo v01 and R34 Rev 05: remove section 8, fix actor name, add logo
Instructivo GE-SO-IXXX:
- Removed section 8 (Firmas de Aprobación)
- Removed Consolidado from section 6 (Documentos Relacionados)
- Renamed actor "Jefe / Supervisor de Área" to "Área Solicitante"

Formulario GE-SO-R34 Rev 05:
- Added 3A Core Materials logo to header

Co-Authored-By: Claude Sonnet 4.6 <noreply@anthropic.com>
Claude-Session: https://claude.ai/code/session_01Mu84mNMmRhshwom6voaTeY
</commit_message>
<xml_diff>
--- a/GE-SO-IXXX_Instructivo_Ingreso_Contratistas_v01.docx
+++ b/GE-SO-IXXX_Instructivo_Ingreso_Contratistas_v01.docx
@@ -153,372 +153,6 @@
                 <w:szCs w:val="20"/>
               </w:rPr>
               <w:t xml:space="preserve">GE-SO-IXXX</w:t>
-            </w:r>
-          </w:p>
-        </w:tc>
-      </w:tr>
-      <w:tr>
-        <w:tc>
-          <w:tcPr>
-            <w:vMerge w:val="continue"/>
-            <w:tcBorders>
-              <w:top w:val="single" w:color="1A3A6B" w:sz="8"/>
-              <w:left w:val="single" w:color="1A3A6B" w:sz="8"/>
-              <w:bottom w:val="single" w:color="1A3A6B" w:sz="8"/>
-              <w:right w:val="single" w:color="1A3A6B" w:sz="8"/>
-            </w:tcBorders>
-          </w:tcPr>
-          <w:p/>
-        </w:tc>
-        <w:tc>
-          <w:tcPr>
-            <w:tcW w:type="dxa" w:w="5200"/>
-            <w:tcBorders>
-              <w:top w:val="single" w:color="1A3A6B" w:sz="8"/>
-              <w:left w:val="single" w:color="1A3A6B" w:sz="8"/>
-              <w:bottom w:val="single" w:color="1A3A6B" w:sz="8"/>
-              <w:right w:val="single" w:color="1A3A6B" w:sz="8"/>
-            </w:tcBorders>
-            <w:shd w:fill="EBF5FB" w:val="clear"/>
-          </w:tcPr>
-          <w:p>
-            <w:pPr>
-              <w:spacing w:after="60" w:before="60"/>
-              <w:jc w:val="center"/>
-            </w:pPr>
-            <w:r>
-              <w:rPr>
-                <w:rFonts w:ascii="Arial" w:cs="Arial" w:eastAsia="Arial" w:hAnsi="Arial"/>
-                <w:color w:val="595959"/>
-                <w:sz w:val="18"/>
-                <w:szCs w:val="18"/>
-              </w:rPr>
-              <w:t xml:space="preserve">Plantabal S.A. / 3A Core Materials  |  Planta: Quevedo y Santo Domingo</w:t>
-            </w:r>
-          </w:p>
-        </w:tc>
-        <w:tc>
-          <w:tcPr>
-            <w:tcW w:type="dxa" w:w="2160"/>
-            <w:tcBorders>
-              <w:top w:val="single" w:color="1A3A6B" w:sz="8"/>
-              <w:left w:val="single" w:color="1A3A6B" w:sz="8"/>
-              <w:bottom w:val="single" w:color="1A3A6B" w:sz="8"/>
-              <w:right w:val="single" w:color="1A3A6B" w:sz="8"/>
-            </w:tcBorders>
-            <w:shd w:fill="F2F2F2" w:val="clear"/>
-          </w:tcPr>
-          <w:p>
-            <w:pPr>
-              <w:spacing w:after="0" w:before="40"/>
-              <w:jc w:val="center"/>
-            </w:pPr>
-            <w:r>
-              <w:rPr>
-                <w:rFonts w:ascii="Arial" w:cs="Arial" w:eastAsia="Arial" w:hAnsi="Arial"/>
-                <w:color w:val="000000"/>
-                <w:sz w:val="18"/>
-                <w:szCs w:val="18"/>
-              </w:rPr>
-              <w:t xml:space="preserve">Versión: 01</w:t>
-            </w:r>
-          </w:p>
-          <w:p>
-            <w:pPr>
-              <w:spacing w:after="40" w:before="0"/>
-              <w:jc w:val="center"/>
-            </w:pPr>
-            <w:r>
-              <w:rPr>
-                <w:rFonts w:ascii="Arial" w:cs="Arial" w:eastAsia="Arial" w:hAnsi="Arial"/>
-                <w:color w:val="000000"/>
-                <w:sz w:val="18"/>
-                <w:szCs w:val="18"/>
-              </w:rPr>
-              <w:t xml:space="preserve">Fecha: 31/10/2026</w:t>
-            </w:r>
-          </w:p>
-        </w:tc>
-      </w:tr>
-    </w:tbl>
-    <w:p>
-      <w:pPr>
-        <w:spacing w:after="40" w:before="0"/>
-      </w:pPr>
-      <w:r>
-        <w:rPr>
-          <w:sz w:val="20"/>
-          <w:szCs w:val="20"/>
-        </w:rPr>
-        <w:t xml:space="preserve"/>
-      </w:r>
-    </w:p>
-    <w:p>
-      <w:pPr>
-        <w:shd w:fill="2E6DB4" w:val="clear"/>
-        <w:spacing w:after="0" w:before="0"/>
-        <w:ind w:left="144"/>
-      </w:pPr>
-      <w:r>
-        <w:rPr>
-          <w:rFonts w:ascii="Arial" w:cs="Arial" w:eastAsia="Arial" w:hAnsi="Arial"/>
-          <w:b/>
-          <w:bCs/>
-          <w:color w:val="FFFFFF"/>
-          <w:sz w:val="24"/>
-          <w:szCs w:val="24"/>
-        </w:rPr>
-        <w:t xml:space="preserve">1.  OBJETIVO</w:t>
-      </w:r>
-    </w:p>
-    <w:p>
-      <w:pPr>
-        <w:spacing w:after="24" w:before="0"/>
-      </w:pPr>
-      <w:r>
-        <w:rPr>
-          <w:sz w:val="20"/>
-          <w:szCs w:val="20"/>
-        </w:rPr>
-        <w:t xml:space="preserve"/>
-      </w:r>
-    </w:p>
-    <w:p>
-      <w:pPr>
-        <w:spacing w:after="80" w:before="80"/>
-        <w:ind w:left="0"/>
-      </w:pPr>
-      <w:r>
-        <w:rPr>
-          <w:rFonts w:ascii="Arial" w:cs="Arial" w:eastAsia="Arial" w:hAnsi="Arial"/>
-          <w:b w:val="false"/>
-          <w:bCs w:val="false"/>
-          <w:sz w:val="20"/>
-          <w:szCs w:val="20"/>
-        </w:rPr>
-        <w:t xml:space="preserve">Establecer los requisitos documentales minimos que debe cumplir toda empresa contratista y su personal para obtener autorizacion de ingreso y permanencia en las instalaciones de Plantabal S.A., asegurando condiciones de seguridad, salud ocupacional y cumplimiento legal durante la ejecucion de sus actividades.</w:t>
-      </w:r>
-    </w:p>
-    <w:p>
-      <w:pPr>
-        <w:spacing w:after="40" w:before="0"/>
-      </w:pPr>
-      <w:r>
-        <w:rPr>
-          <w:sz w:val="20"/>
-          <w:szCs w:val="20"/>
-        </w:rPr>
-        <w:t xml:space="preserve"/>
-      </w:r>
-    </w:p>
-    <w:p>
-      <w:pPr>
-        <w:shd w:fill="2E6DB4" w:val="clear"/>
-        <w:spacing w:after="0" w:before="0"/>
-        <w:ind w:left="144"/>
-      </w:pPr>
-      <w:r>
-        <w:rPr>
-          <w:rFonts w:ascii="Arial" w:cs="Arial" w:eastAsia="Arial" w:hAnsi="Arial"/>
-          <w:b/>
-          <w:bCs/>
-          <w:color w:val="FFFFFF"/>
-          <w:sz w:val="24"/>
-          <w:szCs w:val="24"/>
-        </w:rPr>
-        <w:t xml:space="preserve">2.  ALCANCE</w:t>
-      </w:r>
-    </w:p>
-    <w:p>
-      <w:pPr>
-        <w:spacing w:after="24" w:before="0"/>
-      </w:pPr>
-      <w:r>
-        <w:rPr>
-          <w:sz w:val="20"/>
-          <w:szCs w:val="20"/>
-        </w:rPr>
-        <w:t xml:space="preserve"/>
-      </w:r>
-    </w:p>
-    <w:p>
-      <w:pPr>
-        <w:spacing w:after="60" w:before="80"/>
-        <w:ind w:left="0"/>
-      </w:pPr>
-      <w:r>
-        <w:rPr>
-          <w:rFonts w:ascii="Arial" w:cs="Arial" w:eastAsia="Arial" w:hAnsi="Arial"/>
-          <w:b w:val="false"/>
-          <w:bCs w:val="false"/>
-          <w:sz w:val="20"/>
-          <w:szCs w:val="20"/>
-        </w:rPr>
-        <w:t xml:space="preserve">Sitio: Plantabal S.A. - Planta Quevedo y Planta Santo Domingo</w:t>
-      </w:r>
-    </w:p>
-    <w:p>
-      <w:pPr>
-        <w:spacing w:after="60" w:before="60"/>
-        <w:ind w:left="0"/>
-      </w:pPr>
-      <w:r>
-        <w:rPr>
-          <w:rFonts w:ascii="Arial" w:cs="Arial" w:eastAsia="Arial" w:hAnsi="Arial"/>
-          <w:b w:val="false"/>
-          <w:bCs w:val="false"/>
-          <w:sz w:val="20"/>
-          <w:szCs w:val="20"/>
-        </w:rPr>
-        <w:t xml:space="preserve">Actividad inicial: Solicitud de ingreso de personal contratista al area de Seguridad.</w:t>
-      </w:r>
-    </w:p>
-    <w:p>
-      <w:pPr>
-        <w:spacing w:after="60" w:before="60"/>
-        <w:ind w:left="0"/>
-      </w:pPr>
-      <w:r>
-        <w:rPr>
-          <w:rFonts w:ascii="Arial" w:cs="Arial" w:eastAsia="Arial" w:hAnsi="Arial"/>
-          <w:b w:val="false"/>
-          <w:bCs w:val="false"/>
-          <w:sz w:val="20"/>
-          <w:szCs w:val="20"/>
-        </w:rPr>
-        <w:t xml:space="preserve">Actividad final: Registro en el Consolidado de Contratistas y emision de la autorizacion GE-SO-R34.</w:t>
-      </w:r>
-    </w:p>
-    <w:p>
-      <w:pPr>
-        <w:spacing w:after="80" w:before="60"/>
-        <w:ind w:left="0"/>
-      </w:pPr>
-      <w:r>
-        <w:rPr>
-          <w:rFonts w:ascii="Arial" w:cs="Arial" w:eastAsia="Arial" w:hAnsi="Arial"/>
-          <w:b w:val="false"/>
-          <w:bCs w:val="false"/>
-          <w:sz w:val="20"/>
-          <w:szCs w:val="20"/>
-        </w:rPr>
-        <w:t xml:space="preserve">Aplica a: Toda empresa contratista o persona natural que preste servicios dentro de las instalaciones de Plantabal S.A., independientemente de la duracion o tipo de trabajo.</w:t>
-      </w:r>
-    </w:p>
-    <w:p>
-      <w:pPr>
-        <w:spacing w:after="40" w:before="0"/>
-      </w:pPr>
-      <w:r>
-        <w:rPr>
-          <w:sz w:val="20"/>
-          <w:szCs w:val="20"/>
-        </w:rPr>
-        <w:t xml:space="preserve"/>
-      </w:r>
-    </w:p>
-    <w:p>
-      <w:pPr>
-        <w:shd w:fill="2E6DB4" w:val="clear"/>
-        <w:spacing w:after="0" w:before="0"/>
-        <w:ind w:left="144"/>
-      </w:pPr>
-      <w:r>
-        <w:rPr>
-          <w:rFonts w:ascii="Arial" w:cs="Arial" w:eastAsia="Arial" w:hAnsi="Arial"/>
-          <w:b/>
-          <w:bCs/>
-          <w:color w:val="FFFFFF"/>
-          <w:sz w:val="24"/>
-          <w:szCs w:val="24"/>
-        </w:rPr>
-        <w:t xml:space="preserve">3.  DEFINICIONES</w:t>
-      </w:r>
-    </w:p>
-    <w:p>
-      <w:pPr>
-        <w:spacing w:after="24" w:before="0"/>
-      </w:pPr>
-      <w:r>
-        <w:rPr>
-          <w:sz w:val="20"/>
-          <w:szCs w:val="20"/>
-        </w:rPr>
-        <w:t xml:space="preserve"/>
-      </w:r>
-    </w:p>
-    <w:tbl>
-      <w:tblPr>
-        <w:tblW w:type="dxa" w:w="9360"/>
-        <w:tblBorders>
-          <w:top w:val="single" w:color="auto" w:sz="4"/>
-          <w:left w:val="single" w:color="auto" w:sz="4"/>
-          <w:bottom w:val="single" w:color="auto" w:sz="4"/>
-          <w:right w:val="single" w:color="auto" w:sz="4"/>
-          <w:insideH w:val="single" w:color="auto" w:sz="4"/>
-          <w:insideV w:val="single" w:color="auto" w:sz="4"/>
-        </w:tblBorders>
-      </w:tblPr>
-      <w:tblGrid>
-        <w:gridCol w:w="2600"/>
-        <w:gridCol w:w="6760"/>
-      </w:tblGrid>
-      <w:tr>
-        <w:tc>
-          <w:tcPr>
-            <w:tcW w:type="dxa" w:w="2600"/>
-            <w:tcBorders>
-              <w:top w:val="single" w:color="2E6DB4" w:sz="8"/>
-              <w:left w:val="single" w:color="2E6DB4" w:sz="8"/>
-              <w:bottom w:val="single" w:color="2E6DB4" w:sz="8"/>
-              <w:right w:val="single" w:color="2E6DB4" w:sz="8"/>
-            </w:tcBorders>
-            <w:shd w:fill="2E6DB4" w:val="clear"/>
-          </w:tcPr>
-          <w:p>
-            <w:pPr>
-              <w:spacing w:after="80" w:before="80"/>
-              <w:jc w:val="center"/>
-            </w:pPr>
-            <w:r>
-              <w:rPr>
-                <w:rFonts w:ascii="Arial" w:cs="Arial" w:eastAsia="Arial" w:hAnsi="Arial"/>
-                <w:b/>
-                <w:bCs/>
-                <w:color w:val="FFFFFF"/>
-                <w:sz w:val="19"/>
-                <w:szCs w:val="19"/>
-              </w:rPr>
-              <w:t xml:space="preserve">TÉRMINO</w:t>
-            </w:r>
-          </w:p>
-        </w:tc>
-        <w:tc>
-          <w:tcPr>
-            <w:tcW w:type="dxa" w:w="6760"/>
-            <w:tcBorders>
-              <w:top w:val="single" w:color="2E6DB4" w:sz="8"/>
-              <w:left w:val="single" w:color="2E6DB4" w:sz="8"/>
-              <w:bottom w:val="single" w:color="2E6DB4" w:sz="8"/>
-              <w:right w:val="single" w:color="2E6DB4" w:sz="8"/>
-            </w:tcBorders>
-            <w:shd w:fill="2E6DB4" w:val="clear"/>
-          </w:tcPr>
-          <w:p>
-            <w:pPr>
-              <w:spacing w:after="80" w:before="80"/>
-              <w:ind w:left="115"/>
-            </w:pPr>
-            <w:r>
-              <w:rPr>
-                <w:rFonts w:ascii="Arial" w:cs="Arial" w:eastAsia="Arial" w:hAnsi="Arial"/>
-                <w:b/>
-                <w:bCs/>
-                <w:color w:val="FFFFFF"/>
-                <w:sz w:val="19"/>
-                <w:szCs w:val="19"/>
-              </w:rPr>
-              <w:t xml:space="preserve">DEFINICIÓN</w:t>
             </w:r>
           </w:p>
         </w:tc>
@@ -1413,7 +1047,7 @@
                 <w:sz w:val="19"/>
                 <w:szCs w:val="19"/>
               </w:rPr>
-              <w:t xml:space="preserve">Jefe / Supervisor de Área</w:t>
+              <w:t xml:space="preserve">Área Solicitante</w:t>
             </w:r>
           </w:p>
         </w:tc>
@@ -1711,7 +1345,7 @@
                 <w:sz w:val="19"/>
                 <w:szCs w:val="19"/>
               </w:rPr>
-              <w:t xml:space="preserve">El Jefe / Supervisor de área notifica al área de Seguridad con al menos 48 horas de anticipación, indicando: nombre de la empresa, servicio a ejecutar, fechas de inicio y fin, y tipo de actividades de riesgo involucradas.</w:t>
+              <w:t xml:space="preserve">El Área Solicitante notifica al área de Seguridad con al menos 48 horas de anticipación, indicando: nombre de la empresa, servicio a ejecutar, fechas de inicio y fin, y tipo de actividades de riesgo involucradas.</w:t>
             </w:r>
           </w:p>
         </w:tc>
@@ -1739,7 +1373,7 @@
                 <w:sz w:val="19"/>
                 <w:szCs w:val="19"/>
               </w:rPr>
-              <w:t xml:space="preserve">Jefe / Supervisor de área</w:t>
+              <w:t xml:space="preserve">Área Solicitante</w:t>
             </w:r>
           </w:p>
         </w:tc>
@@ -4374,62 +4008,6 @@
           </w:p>
         </w:tc>
       </w:tr>
-      <w:tr>
-        <w:tc>
-          <w:tcPr>
-            <w:tcW w:type="dxa" w:w="2000"/>
-            <w:tcBorders>
-              <w:top w:val="single" w:color="BFBFBF" w:sz="4"/>
-              <w:left w:val="single" w:color="BFBFBF" w:sz="4"/>
-              <w:bottom w:val="single" w:color="BFBFBF" w:sz="4"/>
-              <w:right w:val="single" w:color="BFBFBF" w:sz="4"/>
-            </w:tcBorders>
-          </w:tcPr>
-          <w:p>
-            <w:pPr>
-              <w:spacing w:after="60" w:before="60"/>
-              <w:jc w:val="center"/>
-            </w:pPr>
-            <w:r>
-              <w:rPr>
-                <w:rFonts w:ascii="Arial" w:cs="Arial" w:eastAsia="Arial" w:hAnsi="Arial"/>
-                <w:b/>
-                <w:bCs/>
-                <w:color w:val="1A3A6B"/>
-                <w:sz w:val="19"/>
-                <w:szCs w:val="19"/>
-              </w:rPr>
-              <w:t xml:space="preserve">GE-SO-R__</w:t>
-            </w:r>
-          </w:p>
-        </w:tc>
-        <w:tc>
-          <w:tcPr>
-            <w:tcW w:type="dxa" w:w="7360"/>
-            <w:tcBorders>
-              <w:top w:val="single" w:color="BFBFBF" w:sz="4"/>
-              <w:left w:val="single" w:color="BFBFBF" w:sz="4"/>
-              <w:bottom w:val="single" w:color="BFBFBF" w:sz="4"/>
-              <w:right w:val="single" w:color="BFBFBF" w:sz="4"/>
-            </w:tcBorders>
-          </w:tcPr>
-          <w:p>
-            <w:pPr>
-              <w:spacing w:after="60" w:before="60"/>
-              <w:ind w:left="115"/>
-            </w:pPr>
-            <w:r>
-              <w:rPr>
-                <w:rFonts w:ascii="Arial" w:cs="Arial" w:eastAsia="Arial" w:hAnsi="Arial"/>
-                <w:color w:val="000000"/>
-                <w:sz w:val="19"/>
-                <w:szCs w:val="19"/>
-              </w:rPr>
-              <w:t xml:space="preserve">Consolidado de Contratistas - Control de Acceso y Habilitaciones</w:t>
-            </w:r>
-          </w:p>
-        </w:tc>
-      </w:tr>
     </w:tbl>
     <w:p>
       <w:pPr>
@@ -4461,571 +4039,6 @@
         <w:t xml:space="preserve">7.  CONTROL DE VERSIONES</w:t>
       </w:r>
     </w:p>
-    <w:p>
-      <w:pPr>
-        <w:spacing w:after="24" w:before="0"/>
-      </w:pPr>
-      <w:r>
-        <w:rPr>
-          <w:sz w:val="20"/>
-          <w:szCs w:val="20"/>
-        </w:rPr>
-        <w:t xml:space="preserve"/>
-      </w:r>
-    </w:p>
-    <w:tbl>
-      <w:tblPr>
-        <w:tblW w:type="dxa" w:w="9360"/>
-        <w:tblBorders>
-          <w:top w:val="single" w:color="auto" w:sz="4"/>
-          <w:left w:val="single" w:color="auto" w:sz="4"/>
-          <w:bottom w:val="single" w:color="auto" w:sz="4"/>
-          <w:right w:val="single" w:color="auto" w:sz="4"/>
-          <w:insideH w:val="single" w:color="auto" w:sz="4"/>
-          <w:insideV w:val="single" w:color="auto" w:sz="4"/>
-        </w:tblBorders>
-      </w:tblPr>
-      <w:tblGrid>
-        <w:gridCol w:w="1400"/>
-        <w:gridCol w:w="1400"/>
-        <w:gridCol w:w="3400"/>
-        <w:gridCol w:w="3160"/>
-      </w:tblGrid>
-      <w:tr>
-        <w:tc>
-          <w:tcPr>
-            <w:tcW w:type="dxa" w:w="1400"/>
-            <w:tcBorders>
-              <w:top w:val="single" w:color="2E6DB4" w:sz="8"/>
-              <w:left w:val="single" w:color="2E6DB4" w:sz="8"/>
-              <w:bottom w:val="single" w:color="2E6DB4" w:sz="8"/>
-              <w:right w:val="single" w:color="2E6DB4" w:sz="8"/>
-            </w:tcBorders>
-            <w:shd w:fill="2E6DB4" w:val="clear"/>
-          </w:tcPr>
-          <w:p>
-            <w:pPr>
-              <w:spacing w:after="80" w:before="80"/>
-              <w:jc w:val="center"/>
-            </w:pPr>
-            <w:r>
-              <w:rPr>
-                <w:rFonts w:ascii="Arial" w:cs="Arial" w:eastAsia="Arial" w:hAnsi="Arial"/>
-                <w:b/>
-                <w:bCs/>
-                <w:color w:val="FFFFFF"/>
-                <w:sz w:val="19"/>
-                <w:szCs w:val="19"/>
-              </w:rPr>
-              <w:t xml:space="preserve">VERSION</w:t>
-            </w:r>
-          </w:p>
-        </w:tc>
-        <w:tc>
-          <w:tcPr>
-            <w:tcW w:type="dxa" w:w="1400"/>
-            <w:tcBorders>
-              <w:top w:val="single" w:color="2E6DB4" w:sz="8"/>
-              <w:left w:val="single" w:color="2E6DB4" w:sz="8"/>
-              <w:bottom w:val="single" w:color="2E6DB4" w:sz="8"/>
-              <w:right w:val="single" w:color="2E6DB4" w:sz="8"/>
-            </w:tcBorders>
-            <w:shd w:fill="2E6DB4" w:val="clear"/>
-          </w:tcPr>
-          <w:p>
-            <w:pPr>
-              <w:spacing w:after="80" w:before="80"/>
-              <w:jc w:val="center"/>
-            </w:pPr>
-            <w:r>
-              <w:rPr>
-                <w:rFonts w:ascii="Arial" w:cs="Arial" w:eastAsia="Arial" w:hAnsi="Arial"/>
-                <w:b/>
-                <w:bCs/>
-                <w:color w:val="FFFFFF"/>
-                <w:sz w:val="19"/>
-                <w:szCs w:val="19"/>
-              </w:rPr>
-              <w:t xml:space="preserve">FECHA</w:t>
-            </w:r>
-          </w:p>
-        </w:tc>
-        <w:tc>
-          <w:tcPr>
-            <w:tcW w:type="dxa" w:w="3400"/>
-            <w:tcBorders>
-              <w:top w:val="single" w:color="2E6DB4" w:sz="8"/>
-              <w:left w:val="single" w:color="2E6DB4" w:sz="8"/>
-              <w:bottom w:val="single" w:color="2E6DB4" w:sz="8"/>
-              <w:right w:val="single" w:color="2E6DB4" w:sz="8"/>
-            </w:tcBorders>
-            <w:shd w:fill="2E6DB4" w:val="clear"/>
-          </w:tcPr>
-          <w:p>
-            <w:pPr>
-              <w:spacing w:after="80" w:before="80"/>
-              <w:ind w:left="115"/>
-            </w:pPr>
-            <w:r>
-              <w:rPr>
-                <w:rFonts w:ascii="Arial" w:cs="Arial" w:eastAsia="Arial" w:hAnsi="Arial"/>
-                <w:b/>
-                <w:bCs/>
-                <w:color w:val="FFFFFF"/>
-                <w:sz w:val="19"/>
-                <w:szCs w:val="19"/>
-              </w:rPr>
-              <w:t xml:space="preserve">DESCRIPCION DEL CAMBIO</w:t>
-            </w:r>
-          </w:p>
-        </w:tc>
-        <w:tc>
-          <w:tcPr>
-            <w:tcW w:type="dxa" w:w="3160"/>
-            <w:tcBorders>
-              <w:top w:val="single" w:color="2E6DB4" w:sz="8"/>
-              <w:left w:val="single" w:color="2E6DB4" w:sz="8"/>
-              <w:bottom w:val="single" w:color="2E6DB4" w:sz="8"/>
-              <w:right w:val="single" w:color="2E6DB4" w:sz="8"/>
-            </w:tcBorders>
-            <w:shd w:fill="2E6DB4" w:val="clear"/>
-          </w:tcPr>
-          <w:p>
-            <w:pPr>
-              <w:spacing w:after="80" w:before="80"/>
-              <w:ind w:left="115"/>
-            </w:pPr>
-            <w:r>
-              <w:rPr>
-                <w:rFonts w:ascii="Arial" w:cs="Arial" w:eastAsia="Arial" w:hAnsi="Arial"/>
-                <w:b/>
-                <w:bCs/>
-                <w:color w:val="FFFFFF"/>
-                <w:sz w:val="19"/>
-                <w:szCs w:val="19"/>
-              </w:rPr>
-              <w:t xml:space="preserve">ELABORADO / APROBADO</w:t>
-            </w:r>
-          </w:p>
-        </w:tc>
-      </w:tr>
-      <w:tr>
-        <w:tc>
-          <w:tcPr>
-            <w:tcW w:type="dxa" w:w="1400"/>
-            <w:tcBorders>
-              <w:top w:val="single" w:color="BFBFBF" w:sz="4"/>
-              <w:left w:val="single" w:color="BFBFBF" w:sz="4"/>
-              <w:bottom w:val="single" w:color="BFBFBF" w:sz="4"/>
-              <w:right w:val="single" w:color="BFBFBF" w:sz="4"/>
-            </w:tcBorders>
-          </w:tcPr>
-          <w:p>
-            <w:pPr>
-              <w:spacing w:after="60" w:before="60"/>
-              <w:jc w:val="center"/>
-            </w:pPr>
-            <w:r>
-              <w:rPr>
-                <w:rFonts w:ascii="Arial" w:cs="Arial" w:eastAsia="Arial" w:hAnsi="Arial"/>
-                <w:color w:val="000000"/>
-                <w:sz w:val="19"/>
-                <w:szCs w:val="19"/>
-              </w:rPr>
-              <w:t xml:space="preserve">01</w:t>
-            </w:r>
-          </w:p>
-        </w:tc>
-        <w:tc>
-          <w:tcPr>
-            <w:tcW w:type="dxa" w:w="1400"/>
-            <w:tcBorders>
-              <w:top w:val="single" w:color="BFBFBF" w:sz="4"/>
-              <w:left w:val="single" w:color="BFBFBF" w:sz="4"/>
-              <w:bottom w:val="single" w:color="BFBFBF" w:sz="4"/>
-              <w:right w:val="single" w:color="BFBFBF" w:sz="4"/>
-            </w:tcBorders>
-          </w:tcPr>
-          <w:p>
-            <w:pPr>
-              <w:spacing w:after="60" w:before="60"/>
-              <w:jc w:val="center"/>
-            </w:pPr>
-            <w:r>
-              <w:rPr>
-                <w:rFonts w:ascii="Arial" w:cs="Arial" w:eastAsia="Arial" w:hAnsi="Arial"/>
-                <w:color w:val="000000"/>
-                <w:sz w:val="19"/>
-                <w:szCs w:val="19"/>
-              </w:rPr>
-              <w:t xml:space="preserve">31/10/2026</w:t>
-            </w:r>
-          </w:p>
-        </w:tc>
-        <w:tc>
-          <w:tcPr>
-            <w:tcW w:type="dxa" w:w="3400"/>
-            <w:tcBorders>
-              <w:top w:val="single" w:color="BFBFBF" w:sz="4"/>
-              <w:left w:val="single" w:color="BFBFBF" w:sz="4"/>
-              <w:bottom w:val="single" w:color="BFBFBF" w:sz="4"/>
-              <w:right w:val="single" w:color="BFBFBF" w:sz="4"/>
-            </w:tcBorders>
-          </w:tcPr>
-          <w:p>
-            <w:pPr>
-              <w:spacing w:after="60" w:before="60"/>
-              <w:ind w:left="115"/>
-            </w:pPr>
-            <w:r>
-              <w:rPr>
-                <w:rFonts w:ascii="Arial" w:cs="Arial" w:eastAsia="Arial" w:hAnsi="Arial"/>
-                <w:color w:val="000000"/>
-                <w:sz w:val="19"/>
-                <w:szCs w:val="19"/>
-              </w:rPr>
-              <w:t xml:space="preserve">Creacion del documento.</w:t>
-            </w:r>
-          </w:p>
-        </w:tc>
-        <w:tc>
-          <w:tcPr>
-            <w:tcW w:type="dxa" w:w="3160"/>
-            <w:tcBorders>
-              <w:top w:val="single" w:color="BFBFBF" w:sz="4"/>
-              <w:left w:val="single" w:color="BFBFBF" w:sz="4"/>
-              <w:bottom w:val="single" w:color="BFBFBF" w:sz="4"/>
-              <w:right w:val="single" w:color="BFBFBF" w:sz="4"/>
-            </w:tcBorders>
-          </w:tcPr>
-          <w:p>
-            <w:pPr>
-              <w:spacing w:after="60" w:before="60"/>
-              <w:ind w:left="115"/>
-            </w:pPr>
-            <w:r>
-              <w:rPr>
-                <w:rFonts w:ascii="Arial" w:cs="Arial" w:eastAsia="Arial" w:hAnsi="Arial"/>
-                <w:color w:val="000000"/>
-                <w:sz w:val="19"/>
-                <w:szCs w:val="19"/>
-              </w:rPr>
-              <w:t xml:space="preserve">K. Martinez / Gerencia de Planta</w:t>
-            </w:r>
-          </w:p>
-        </w:tc>
-      </w:tr>
-    </w:tbl>
-    <w:p>
-      <w:pPr>
-        <w:spacing w:after="80" w:before="0"/>
-      </w:pPr>
-      <w:r>
-        <w:rPr>
-          <w:sz w:val="20"/>
-          <w:szCs w:val="20"/>
-        </w:rPr>
-        <w:t xml:space="preserve"/>
-      </w:r>
-    </w:p>
-    <w:p>
-      <w:pPr>
-        <w:shd w:fill="2E6DB4" w:val="clear"/>
-        <w:spacing w:after="0" w:before="0"/>
-        <w:ind w:left="144"/>
-      </w:pPr>
-      <w:r>
-        <w:rPr>
-          <w:rFonts w:ascii="Arial" w:cs="Arial" w:eastAsia="Arial" w:hAnsi="Arial"/>
-          <w:b/>
-          <w:bCs/>
-          <w:color w:val="FFFFFF"/>
-          <w:sz w:val="24"/>
-          <w:szCs w:val="24"/>
-        </w:rPr>
-        <w:t xml:space="preserve">8.  FIRMAS DE APROBACION</w:t>
-      </w:r>
-    </w:p>
-    <w:p>
-      <w:pPr>
-        <w:spacing w:after="24" w:before="0"/>
-      </w:pPr>
-      <w:r>
-        <w:rPr>
-          <w:sz w:val="20"/>
-          <w:szCs w:val="20"/>
-        </w:rPr>
-        <w:t xml:space="preserve"/>
-      </w:r>
-    </w:p>
-    <w:tbl>
-      <w:tblPr>
-        <w:tblW w:type="dxa" w:w="9360"/>
-        <w:tblBorders>
-          <w:top w:val="single" w:color="auto" w:sz="4"/>
-          <w:left w:val="single" w:color="auto" w:sz="4"/>
-          <w:bottom w:val="single" w:color="auto" w:sz="4"/>
-          <w:right w:val="single" w:color="auto" w:sz="4"/>
-          <w:insideH w:val="single" w:color="auto" w:sz="4"/>
-          <w:insideV w:val="single" w:color="auto" w:sz="4"/>
-        </w:tblBorders>
-      </w:tblPr>
-      <w:tblGrid>
-        <w:gridCol w:w="3120"/>
-        <w:gridCol w:w="3120"/>
-        <w:gridCol w:w="3120"/>
-      </w:tblGrid>
-      <w:tr>
-        <w:tc>
-          <w:tcPr>
-            <w:tcW w:type="dxa" w:w="3120"/>
-            <w:tcBorders>
-              <w:top w:val="single" w:color="2E6DB4" w:sz="8"/>
-              <w:left w:val="single" w:color="2E6DB4" w:sz="8"/>
-              <w:bottom w:val="single" w:color="2E6DB4" w:sz="8"/>
-              <w:right w:val="single" w:color="2E6DB4" w:sz="8"/>
-            </w:tcBorders>
-            <w:shd w:fill="2E6DB4" w:val="clear"/>
-          </w:tcPr>
-          <w:p>
-            <w:pPr>
-              <w:spacing w:after="80" w:before="80"/>
-              <w:jc w:val="center"/>
-            </w:pPr>
-            <w:r>
-              <w:rPr>
-                <w:rFonts w:ascii="Arial" w:cs="Arial" w:eastAsia="Arial" w:hAnsi="Arial"/>
-                <w:b/>
-                <w:bCs/>
-                <w:color w:val="FFFFFF"/>
-                <w:sz w:val="19"/>
-                <w:szCs w:val="19"/>
-              </w:rPr>
-              <w:t xml:space="preserve">ELABORADO POR</w:t>
-            </w:r>
-          </w:p>
-        </w:tc>
-        <w:tc>
-          <w:tcPr>
-            <w:tcW w:type="dxa" w:w="3120"/>
-            <w:tcBorders>
-              <w:top w:val="single" w:color="2E6DB4" w:sz="8"/>
-              <w:left w:val="single" w:color="2E6DB4" w:sz="8"/>
-              <w:bottom w:val="single" w:color="2E6DB4" w:sz="8"/>
-              <w:right w:val="single" w:color="2E6DB4" w:sz="8"/>
-            </w:tcBorders>
-            <w:shd w:fill="2E6DB4" w:val="clear"/>
-          </w:tcPr>
-          <w:p>
-            <w:pPr>
-              <w:spacing w:after="80" w:before="80"/>
-              <w:jc w:val="center"/>
-            </w:pPr>
-            <w:r>
-              <w:rPr>
-                <w:rFonts w:ascii="Arial" w:cs="Arial" w:eastAsia="Arial" w:hAnsi="Arial"/>
-                <w:b/>
-                <w:bCs/>
-                <w:color w:val="FFFFFF"/>
-                <w:sz w:val="19"/>
-                <w:szCs w:val="19"/>
-              </w:rPr>
-              <w:t xml:space="preserve">REVISADO POR</w:t>
-            </w:r>
-          </w:p>
-        </w:tc>
-        <w:tc>
-          <w:tcPr>
-            <w:tcW w:type="dxa" w:w="3120"/>
-            <w:tcBorders>
-              <w:top w:val="single" w:color="2E6DB4" w:sz="8"/>
-              <w:left w:val="single" w:color="2E6DB4" w:sz="8"/>
-              <w:bottom w:val="single" w:color="2E6DB4" w:sz="8"/>
-              <w:right w:val="single" w:color="2E6DB4" w:sz="8"/>
-            </w:tcBorders>
-            <w:shd w:fill="2E6DB4" w:val="clear"/>
-          </w:tcPr>
-          <w:p>
-            <w:pPr>
-              <w:spacing w:after="80" w:before="80"/>
-              <w:jc w:val="center"/>
-            </w:pPr>
-            <w:r>
-              <w:rPr>
-                <w:rFonts w:ascii="Arial" w:cs="Arial" w:eastAsia="Arial" w:hAnsi="Arial"/>
-                <w:b/>
-                <w:bCs/>
-                <w:color w:val="FFFFFF"/>
-                <w:sz w:val="19"/>
-                <w:szCs w:val="19"/>
-              </w:rPr>
-              <w:t xml:space="preserve">APROBADO POR</w:t>
-            </w:r>
-          </w:p>
-        </w:tc>
-      </w:tr>
-      <w:tr>
-        <w:tc>
-          <w:tcPr>
-            <w:tcW w:type="dxa" w:w="3120"/>
-            <w:tcBorders>
-              <w:top w:val="single" w:color="BFBFBF" w:sz="4"/>
-              <w:left w:val="single" w:color="BFBFBF" w:sz="4"/>
-              <w:bottom w:val="single" w:color="BFBFBF" w:sz="4"/>
-              <w:right w:val="single" w:color="BFBFBF" w:sz="4"/>
-            </w:tcBorders>
-          </w:tcPr>
-          <w:p>
-            <w:pPr>
-              <w:spacing w:before="600"/>
-            </w:pPr>
-            <w:r>
-              <w:rPr>
-                <w:sz w:val="20"/>
-                <w:szCs w:val="20"/>
-              </w:rPr>
-              <w:t xml:space="preserve"/>
-            </w:r>
-          </w:p>
-          <w:p>
-            <w:pPr>
-              <w:spacing w:after="0" w:before="60"/>
-              <w:jc w:val="center"/>
-            </w:pPr>
-            <w:r>
-              <w:rPr>
-                <w:rFonts w:ascii="Arial" w:cs="Arial" w:eastAsia="Arial" w:hAnsi="Arial"/>
-                <w:color w:val="000000"/>
-                <w:sz w:val="19"/>
-                <w:szCs w:val="19"/>
-              </w:rPr>
-              <w:t xml:space="preserve">Kevin Martinez</w:t>
-            </w:r>
-          </w:p>
-          <w:p>
-            <w:pPr>
-              <w:spacing w:after="80" w:before="0"/>
-              <w:jc w:val="center"/>
-            </w:pPr>
-            <w:r>
-              <w:rPr>
-                <w:rFonts w:ascii="Arial" w:cs="Arial" w:eastAsia="Arial" w:hAnsi="Arial"/>
-                <w:color w:val="000000"/>
-                <w:sz w:val="19"/>
-                <w:szCs w:val="19"/>
-              </w:rPr>
-              <w:t xml:space="preserve">Tecnico E&amp;S</w:t>
-            </w:r>
-          </w:p>
-        </w:tc>
-        <w:tc>
-          <w:tcPr>
-            <w:tcW w:type="dxa" w:w="3120"/>
-            <w:tcBorders>
-              <w:top w:val="single" w:color="BFBFBF" w:sz="4"/>
-              <w:left w:val="single" w:color="BFBFBF" w:sz="4"/>
-              <w:bottom w:val="single" w:color="BFBFBF" w:sz="4"/>
-              <w:right w:val="single" w:color="BFBFBF" w:sz="4"/>
-            </w:tcBorders>
-          </w:tcPr>
-          <w:p>
-            <w:pPr>
-              <w:spacing w:before="600"/>
-            </w:pPr>
-            <w:r>
-              <w:rPr>
-                <w:sz w:val="20"/>
-                <w:szCs w:val="20"/>
-              </w:rPr>
-              <w:t xml:space="preserve"/>
-            </w:r>
-          </w:p>
-          <w:p>
-            <w:pPr>
-              <w:spacing w:after="0" w:before="60"/>
-              <w:jc w:val="center"/>
-            </w:pPr>
-            <w:r>
-              <w:rPr>
-                <w:rFonts w:ascii="Arial" w:cs="Arial" w:eastAsia="Arial" w:hAnsi="Arial"/>
-                <w:color w:val="000000"/>
-                <w:sz w:val="19"/>
-                <w:szCs w:val="19"/>
-              </w:rPr>
-              <w:t xml:space="preserve">___________________</w:t>
-            </w:r>
-          </w:p>
-          <w:p>
-            <w:pPr>
-              <w:spacing w:after="80" w:before="0"/>
-              <w:jc w:val="center"/>
-            </w:pPr>
-            <w:r>
-              <w:rPr>
-                <w:rFonts w:ascii="Arial" w:cs="Arial" w:eastAsia="Arial" w:hAnsi="Arial"/>
-                <w:color w:val="000000"/>
-                <w:sz w:val="19"/>
-                <w:szCs w:val="19"/>
-              </w:rPr>
-              <w:t xml:space="preserve">Jefe de Seguridad</w:t>
-            </w:r>
-          </w:p>
-        </w:tc>
-        <w:tc>
-          <w:tcPr>
-            <w:tcW w:type="dxa" w:w="3120"/>
-            <w:tcBorders>
-              <w:top w:val="single" w:color="BFBFBF" w:sz="4"/>
-              <w:left w:val="single" w:color="BFBFBF" w:sz="4"/>
-              <w:bottom w:val="single" w:color="BFBFBF" w:sz="4"/>
-              <w:right w:val="single" w:color="BFBFBF" w:sz="4"/>
-            </w:tcBorders>
-          </w:tcPr>
-          <w:p>
-            <w:pPr>
-              <w:spacing w:before="600"/>
-            </w:pPr>
-            <w:r>
-              <w:rPr>
-                <w:sz w:val="20"/>
-                <w:szCs w:val="20"/>
-              </w:rPr>
-              <w:t xml:space="preserve"/>
-            </w:r>
-          </w:p>
-          <w:p>
-            <w:pPr>
-              <w:spacing w:after="0" w:before="60"/>
-              <w:jc w:val="center"/>
-            </w:pPr>
-            <w:r>
-              <w:rPr>
-                <w:rFonts w:ascii="Arial" w:cs="Arial" w:eastAsia="Arial" w:hAnsi="Arial"/>
-                <w:color w:val="000000"/>
-                <w:sz w:val="19"/>
-                <w:szCs w:val="19"/>
-              </w:rPr>
-              <w:t xml:space="preserve">___________________</w:t>
-            </w:r>
-          </w:p>
-          <w:p>
-            <w:pPr>
-              <w:spacing w:after="80" w:before="0"/>
-              <w:jc w:val="center"/>
-            </w:pPr>
-            <w:r>
-              <w:rPr>
-                <w:rFonts w:ascii="Arial" w:cs="Arial" w:eastAsia="Arial" w:hAnsi="Arial"/>
-                <w:color w:val="000000"/>
-                <w:sz w:val="19"/>
-                <w:szCs w:val="19"/>
-              </w:rPr>
-              <w:t xml:space="preserve">Gerencia de Planta</w:t>
-            </w:r>
-          </w:p>
-        </w:tc>
-      </w:tr>
-    </w:tbl>
     <w:sectPr>
       <w:pgSz w:w="12240" w:h="15840" w:orient="portrait"/>
       <w:pgMar w:top="1296" w:right="1152" w:bottom="1152" w:left="1296" w:header="708" w:footer="708" w:gutter="0"/>

</xml_diff>

<commit_message>
fix: instructivo completo v01 — secciones 1-7, sin sección 8, sin Consolidado, Área Solicitante
Co-Authored-By: Claude Sonnet 4.6 <noreply@anthropic.com>
Claude-Session: https://claude.ai/code/session_01Mu84mNMmRhshwom6voaTeY
</commit_message>
<xml_diff>
--- a/GE-SO-IXXX_Instructivo_Ingreso_Contratistas_v01.docx
+++ b/GE-SO-IXXX_Instructivo_Ingreso_Contratistas_v01.docx
@@ -160,512 +160,82 @@
       <w:tr>
         <w:tc>
           <w:tcPr>
-            <w:tcW w:type="dxa" w:w="2600"/>
-            <w:tcBorders>
-              <w:top w:val="single" w:color="BFBFBF" w:sz="4"/>
-              <w:left w:val="single" w:color="BFBFBF" w:sz="4"/>
-              <w:bottom w:val="single" w:color="BFBFBF" w:sz="4"/>
-              <w:right w:val="single" w:color="BFBFBF" w:sz="4"/>
-            </w:tcBorders>
-            <w:shd w:fill="FFFFFF" w:val="clear"/>
-          </w:tcPr>
-          <w:p>
-            <w:pPr>
-              <w:spacing w:after="60" w:before="60"/>
-              <w:ind w:left="115"/>
-            </w:pPr>
-            <w:r>
-              <w:rPr>
-                <w:rFonts w:ascii="Arial" w:cs="Arial" w:eastAsia="Arial" w:hAnsi="Arial"/>
-                <w:b/>
-                <w:bCs/>
-                <w:color w:val="1A3A6B"/>
-                <w:sz w:val="19"/>
-                <w:szCs w:val="19"/>
-              </w:rPr>
-              <w:t xml:space="preserve">Contratista</w:t>
-            </w:r>
-          </w:p>
-        </w:tc>
-        <w:tc>
-          <w:tcPr>
-            <w:tcW w:type="dxa" w:w="6760"/>
-            <w:tcBorders>
-              <w:top w:val="single" w:color="BFBFBF" w:sz="4"/>
-              <w:left w:val="single" w:color="BFBFBF" w:sz="4"/>
-              <w:bottom w:val="single" w:color="BFBFBF" w:sz="4"/>
-              <w:right w:val="single" w:color="BFBFBF" w:sz="4"/>
-            </w:tcBorders>
-          </w:tcPr>
-          <w:p>
-            <w:pPr>
-              <w:spacing w:after="60" w:before="60"/>
-              <w:ind w:left="115"/>
-            </w:pPr>
-            <w:r>
-              <w:rPr>
-                <w:rFonts w:ascii="Arial" w:cs="Arial" w:eastAsia="Arial" w:hAnsi="Arial"/>
-                <w:color w:val="000000"/>
-                <w:sz w:val="19"/>
-                <w:szCs w:val="19"/>
-              </w:rPr>
-              <w:t xml:space="preserve">Empresa o persona natural que presta servicios a Plantabal S.A. bajo contrato, con personal que opera dentro de sus instalaciones.</w:t>
-            </w:r>
-          </w:p>
-        </w:tc>
-      </w:tr>
-      <w:tr>
-        <w:tc>
-          <w:tcPr>
-            <w:tcW w:type="dxa" w:w="2600"/>
-            <w:tcBorders>
-              <w:top w:val="single" w:color="BFBFBF" w:sz="4"/>
-              <w:left w:val="single" w:color="BFBFBF" w:sz="4"/>
-              <w:bottom w:val="single" w:color="BFBFBF" w:sz="4"/>
-              <w:right w:val="single" w:color="BFBFBF" w:sz="4"/>
-            </w:tcBorders>
-            <w:shd w:fill="FFFFFF" w:val="clear"/>
-          </w:tcPr>
-          <w:p>
-            <w:pPr>
-              <w:spacing w:after="60" w:before="60"/>
-              <w:ind w:left="115"/>
-            </w:pPr>
-            <w:r>
-              <w:rPr>
-                <w:rFonts w:ascii="Arial" w:cs="Arial" w:eastAsia="Arial" w:hAnsi="Arial"/>
-                <w:b/>
-                <w:bCs/>
-                <w:color w:val="1A3A6B"/>
-                <w:sz w:val="19"/>
-                <w:szCs w:val="19"/>
-              </w:rPr>
-              <w:t xml:space="preserve">Inducción de Seguridad</w:t>
-            </w:r>
-          </w:p>
-        </w:tc>
-        <w:tc>
-          <w:tcPr>
-            <w:tcW w:type="dxa" w:w="6760"/>
-            <w:tcBorders>
-              <w:top w:val="single" w:color="BFBFBF" w:sz="4"/>
-              <w:left w:val="single" w:color="BFBFBF" w:sz="4"/>
-              <w:bottom w:val="single" w:color="BFBFBF" w:sz="4"/>
-              <w:right w:val="single" w:color="BFBFBF" w:sz="4"/>
-            </w:tcBorders>
-          </w:tcPr>
-          <w:p>
-            <w:pPr>
-              <w:spacing w:after="60" w:before="60"/>
-              <w:ind w:left="115"/>
-            </w:pPr>
-            <w:r>
-              <w:rPr>
-                <w:rFonts w:ascii="Arial" w:cs="Arial" w:eastAsia="Arial" w:hAnsi="Arial"/>
-                <w:color w:val="000000"/>
-                <w:sz w:val="19"/>
-                <w:szCs w:val="19"/>
-              </w:rPr>
-              <w:t xml:space="preserve">Capacitación obligatoria que recibe todo contratista antes de iniciar actividades en planta, que cubre riesgos generales, EPP, emergencias y reglamento interno. Vigencia: 1 año desde la fecha de recepción.</w:t>
-            </w:r>
-          </w:p>
-        </w:tc>
-      </w:tr>
-      <w:tr>
-        <w:tc>
-          <w:tcPr>
-            <w:tcW w:type="dxa" w:w="2600"/>
-            <w:tcBorders>
-              <w:top w:val="single" w:color="BFBFBF" w:sz="4"/>
-              <w:left w:val="single" w:color="BFBFBF" w:sz="4"/>
-              <w:bottom w:val="single" w:color="BFBFBF" w:sz="4"/>
-              <w:right w:val="single" w:color="BFBFBF" w:sz="4"/>
-            </w:tcBorders>
-            <w:shd w:fill="FFFFFF" w:val="clear"/>
-          </w:tcPr>
-          <w:p>
-            <w:pPr>
-              <w:spacing w:after="60" w:before="60"/>
-              <w:ind w:left="115"/>
-            </w:pPr>
-            <w:r>
-              <w:rPr>
-                <w:rFonts w:ascii="Arial" w:cs="Arial" w:eastAsia="Arial" w:hAnsi="Arial"/>
-                <w:b/>
-                <w:bCs/>
-                <w:color w:val="1A3A6B"/>
-                <w:sz w:val="19"/>
-                <w:szCs w:val="19"/>
-              </w:rPr>
-              <w:t xml:space="preserve">Certificado Médico Laboral</w:t>
-            </w:r>
-          </w:p>
-        </w:tc>
-        <w:tc>
-          <w:tcPr>
-            <w:tcW w:type="dxa" w:w="6760"/>
-            <w:tcBorders>
-              <w:top w:val="single" w:color="BFBFBF" w:sz="4"/>
-              <w:left w:val="single" w:color="BFBFBF" w:sz="4"/>
-              <w:bottom w:val="single" w:color="BFBFBF" w:sz="4"/>
-              <w:right w:val="single" w:color="BFBFBF" w:sz="4"/>
-            </w:tcBorders>
-          </w:tcPr>
-          <w:p>
-            <w:pPr>
-              <w:spacing w:after="60" w:before="60"/>
-              <w:ind w:left="115"/>
-            </w:pPr>
-            <w:r>
-              <w:rPr>
-                <w:rFonts w:ascii="Arial" w:cs="Arial" w:eastAsia="Arial" w:hAnsi="Arial"/>
-                <w:color w:val="000000"/>
-                <w:sz w:val="19"/>
-                <w:szCs w:val="19"/>
-              </w:rPr>
-              <w:t xml:space="preserve">Documento emitido por un médico ocupacional que certifica la aptitud física del trabajador. La vigencia es determinada por el médico de planta de Plantabal al momento de su validación.</w:t>
-            </w:r>
-          </w:p>
-        </w:tc>
-      </w:tr>
-      <w:tr>
-        <w:tc>
-          <w:tcPr>
-            <w:tcW w:type="dxa" w:w="2600"/>
-            <w:tcBorders>
-              <w:top w:val="single" w:color="BFBFBF" w:sz="4"/>
-              <w:left w:val="single" w:color="BFBFBF" w:sz="4"/>
-              <w:bottom w:val="single" w:color="BFBFBF" w:sz="4"/>
-              <w:right w:val="single" w:color="BFBFBF" w:sz="4"/>
-            </w:tcBorders>
-            <w:shd w:fill="FFFFFF" w:val="clear"/>
-          </w:tcPr>
-          <w:p>
-            <w:pPr>
-              <w:spacing w:after="60" w:before="60"/>
-              <w:ind w:left="115"/>
-            </w:pPr>
-            <w:r>
-              <w:rPr>
-                <w:rFonts w:ascii="Arial" w:cs="Arial" w:eastAsia="Arial" w:hAnsi="Arial"/>
-                <w:b/>
-                <w:bCs/>
-                <w:color w:val="1A3A6B"/>
-                <w:sz w:val="19"/>
-                <w:szCs w:val="19"/>
-              </w:rPr>
-              <w:t xml:space="preserve">Afiliación al IESS</w:t>
-            </w:r>
-          </w:p>
-        </w:tc>
-        <w:tc>
-          <w:tcPr>
-            <w:tcW w:type="dxa" w:w="6760"/>
-            <w:tcBorders>
-              <w:top w:val="single" w:color="BFBFBF" w:sz="4"/>
-              <w:left w:val="single" w:color="BFBFBF" w:sz="4"/>
-              <w:bottom w:val="single" w:color="BFBFBF" w:sz="4"/>
-              <w:right w:val="single" w:color="BFBFBF" w:sz="4"/>
-            </w:tcBorders>
-          </w:tcPr>
-          <w:p>
-            <w:pPr>
-              <w:spacing w:after="60" w:before="60"/>
-              <w:ind w:left="115"/>
-            </w:pPr>
-            <w:r>
-              <w:rPr>
-                <w:rFonts w:ascii="Arial" w:cs="Arial" w:eastAsia="Arial" w:hAnsi="Arial"/>
-                <w:color w:val="000000"/>
-                <w:sz w:val="19"/>
-                <w:szCs w:val="19"/>
-              </w:rPr>
-              <w:t xml:space="preserve">Registro del trabajador en el IESS. Se acredita con la planilla del mes inmediatamente anterior. Para trabajadores nuevos con aviso de entrada, se acepta dicho aviso como habilitante de acceso transitorio.</w:t>
-            </w:r>
-          </w:p>
-        </w:tc>
-      </w:tr>
-      <w:tr>
-        <w:tc>
-          <w:tcPr>
-            <w:tcW w:type="dxa" w:w="2600"/>
-            <w:tcBorders>
-              <w:top w:val="single" w:color="BFBFBF" w:sz="4"/>
-              <w:left w:val="single" w:color="BFBFBF" w:sz="4"/>
-              <w:bottom w:val="single" w:color="BFBFBF" w:sz="4"/>
-              <w:right w:val="single" w:color="BFBFBF" w:sz="4"/>
-            </w:tcBorders>
-            <w:shd w:fill="FFFFFF" w:val="clear"/>
-          </w:tcPr>
-          <w:p>
-            <w:pPr>
-              <w:spacing w:after="60" w:before="60"/>
-              <w:ind w:left="115"/>
-            </w:pPr>
-            <w:r>
-              <w:rPr>
-                <w:rFonts w:ascii="Arial" w:cs="Arial" w:eastAsia="Arial" w:hAnsi="Arial"/>
-                <w:b/>
-                <w:bCs/>
-                <w:color w:val="1A3A6B"/>
-                <w:sz w:val="19"/>
-                <w:szCs w:val="19"/>
-              </w:rPr>
-              <w:t xml:space="preserve">Aviso de entrada</w:t>
-            </w:r>
-          </w:p>
-        </w:tc>
-        <w:tc>
-          <w:tcPr>
-            <w:tcW w:type="dxa" w:w="6760"/>
-            <w:tcBorders>
-              <w:top w:val="single" w:color="BFBFBF" w:sz="4"/>
-              <w:left w:val="single" w:color="BFBFBF" w:sz="4"/>
-              <w:bottom w:val="single" w:color="BFBFBF" w:sz="4"/>
-              <w:right w:val="single" w:color="BFBFBF" w:sz="4"/>
-            </w:tcBorders>
-          </w:tcPr>
-          <w:p>
-            <w:pPr>
-              <w:spacing w:after="60" w:before="60"/>
-              <w:ind w:left="115"/>
-            </w:pPr>
-            <w:r>
-              <w:rPr>
-                <w:rFonts w:ascii="Arial" w:cs="Arial" w:eastAsia="Arial" w:hAnsi="Arial"/>
-                <w:color w:val="000000"/>
-                <w:sz w:val="19"/>
-                <w:szCs w:val="19"/>
-              </w:rPr>
-              <w:t xml:space="preserve">Notificación al IESS al contratar un trabajador nuevo. La planilla se genera el mes siguiente; se acepta el aviso como habilitante de ingreso transitorio.</w:t>
-            </w:r>
-          </w:p>
-        </w:tc>
-      </w:tr>
-      <w:tr>
-        <w:tc>
-          <w:tcPr>
-            <w:tcW w:type="dxa" w:w="2600"/>
-            <w:tcBorders>
-              <w:top w:val="single" w:color="BFBFBF" w:sz="4"/>
-              <w:left w:val="single" w:color="BFBFBF" w:sz="4"/>
-              <w:bottom w:val="single" w:color="BFBFBF" w:sz="4"/>
-              <w:right w:val="single" w:color="BFBFBF" w:sz="4"/>
-            </w:tcBorders>
-            <w:shd w:fill="FFFFFF" w:val="clear"/>
-          </w:tcPr>
-          <w:p>
-            <w:pPr>
-              <w:spacing w:after="60" w:before="60"/>
-              <w:ind w:left="115"/>
-            </w:pPr>
-            <w:r>
-              <w:rPr>
-                <w:rFonts w:ascii="Arial" w:cs="Arial" w:eastAsia="Arial" w:hAnsi="Arial"/>
-                <w:b/>
-                <w:bCs/>
-                <w:color w:val="1A3A6B"/>
-                <w:sz w:val="19"/>
-                <w:szCs w:val="19"/>
-              </w:rPr>
-              <w:t xml:space="preserve">Trabajo de alto riesgo</w:t>
-            </w:r>
-          </w:p>
-        </w:tc>
-        <w:tc>
-          <w:tcPr>
-            <w:tcW w:type="dxa" w:w="6760"/>
-            <w:tcBorders>
-              <w:top w:val="single" w:color="BFBFBF" w:sz="4"/>
-              <w:left w:val="single" w:color="BFBFBF" w:sz="4"/>
-              <w:bottom w:val="single" w:color="BFBFBF" w:sz="4"/>
-              <w:right w:val="single" w:color="BFBFBF" w:sz="4"/>
-            </w:tcBorders>
-          </w:tcPr>
-          <w:p>
-            <w:pPr>
-              <w:spacing w:after="60" w:before="60"/>
-              <w:ind w:left="115"/>
-            </w:pPr>
-            <w:r>
-              <w:rPr>
-                <w:rFonts w:ascii="Arial" w:cs="Arial" w:eastAsia="Arial" w:hAnsi="Arial"/>
-                <w:color w:val="000000"/>
-                <w:sz w:val="19"/>
-                <w:szCs w:val="19"/>
-              </w:rPr>
-              <w:t xml:space="preserve">Actividad con potencial de lesión grave o fatal: trabajos en caliente, en altura (&gt;=1,80 m), espacios confinados, trabajos eléctricos (media y alta tensión) y trabajos de izaje.</w:t>
-            </w:r>
-          </w:p>
-        </w:tc>
-      </w:tr>
-      <w:tr>
-        <w:tc>
-          <w:tcPr>
-            <w:tcW w:type="dxa" w:w="2600"/>
-            <w:tcBorders>
-              <w:top w:val="single" w:color="BFBFBF" w:sz="4"/>
-              <w:left w:val="single" w:color="BFBFBF" w:sz="4"/>
-              <w:bottom w:val="single" w:color="BFBFBF" w:sz="4"/>
-              <w:right w:val="single" w:color="BFBFBF" w:sz="4"/>
-            </w:tcBorders>
-            <w:shd w:fill="FFFFFF" w:val="clear"/>
-          </w:tcPr>
-          <w:p>
-            <w:pPr>
-              <w:spacing w:after="60" w:before="60"/>
-              <w:ind w:left="115"/>
-            </w:pPr>
-            <w:r>
-              <w:rPr>
-                <w:rFonts w:ascii="Arial" w:cs="Arial" w:eastAsia="Arial" w:hAnsi="Arial"/>
-                <w:b/>
-                <w:bCs/>
-                <w:color w:val="1A3A6B"/>
-                <w:sz w:val="19"/>
-                <w:szCs w:val="19"/>
-              </w:rPr>
-              <w:t xml:space="preserve">Certificado de prevención de riesgos</w:t>
-            </w:r>
-          </w:p>
-        </w:tc>
-        <w:tc>
-          <w:tcPr>
-            <w:tcW w:type="dxa" w:w="6760"/>
-            <w:tcBorders>
-              <w:top w:val="single" w:color="BFBFBF" w:sz="4"/>
-              <w:left w:val="single" w:color="BFBFBF" w:sz="4"/>
-              <w:bottom w:val="single" w:color="BFBFBF" w:sz="4"/>
-              <w:right w:val="single" w:color="BFBFBF" w:sz="4"/>
-            </w:tcBorders>
-          </w:tcPr>
-          <w:p>
-            <w:pPr>
-              <w:spacing w:after="60" w:before="60"/>
-              <w:ind w:left="115"/>
-            </w:pPr>
-            <w:r>
-              <w:rPr>
-                <w:rFonts w:ascii="Arial" w:cs="Arial" w:eastAsia="Arial" w:hAnsi="Arial"/>
-                <w:color w:val="000000"/>
-                <w:sz w:val="19"/>
-                <w:szCs w:val="19"/>
-              </w:rPr>
-              <w:t xml:space="preserve">Documento emitido por entidad certificadora reconocida (MDT o SENESCYT) que acredita la competencia del trabajador para ejecutar un tipo específico de trabajo de alto riesgo.</w:t>
-            </w:r>
-          </w:p>
-        </w:tc>
-      </w:tr>
-      <w:tr>
-        <w:tc>
-          <w:tcPr>
-            <w:tcW w:type="dxa" w:w="2600"/>
-            <w:tcBorders>
-              <w:top w:val="single" w:color="BFBFBF" w:sz="4"/>
-              <w:left w:val="single" w:color="BFBFBF" w:sz="4"/>
-              <w:bottom w:val="single" w:color="BFBFBF" w:sz="4"/>
-              <w:right w:val="single" w:color="BFBFBF" w:sz="4"/>
-            </w:tcBorders>
-            <w:shd w:fill="FFFFFF" w:val="clear"/>
-          </w:tcPr>
-          <w:p>
-            <w:pPr>
-              <w:spacing w:after="60" w:before="60"/>
-              <w:ind w:left="115"/>
-            </w:pPr>
-            <w:r>
-              <w:rPr>
-                <w:rFonts w:ascii="Arial" w:cs="Arial" w:eastAsia="Arial" w:hAnsi="Arial"/>
-                <w:b/>
-                <w:bCs/>
-                <w:color w:val="1A3A6B"/>
-                <w:sz w:val="19"/>
-                <w:szCs w:val="19"/>
-              </w:rPr>
-              <w:t xml:space="preserve">MDT</w:t>
-            </w:r>
-          </w:p>
-        </w:tc>
-        <w:tc>
-          <w:tcPr>
-            <w:tcW w:type="dxa" w:w="6760"/>
-            <w:tcBorders>
-              <w:top w:val="single" w:color="BFBFBF" w:sz="4"/>
-              <w:left w:val="single" w:color="BFBFBF" w:sz="4"/>
-              <w:bottom w:val="single" w:color="BFBFBF" w:sz="4"/>
-              <w:right w:val="single" w:color="BFBFBF" w:sz="4"/>
-            </w:tcBorders>
-          </w:tcPr>
-          <w:p>
-            <w:pPr>
-              <w:spacing w:after="60" w:before="60"/>
-              <w:ind w:left="115"/>
-            </w:pPr>
-            <w:r>
-              <w:rPr>
-                <w:rFonts w:ascii="Arial" w:cs="Arial" w:eastAsia="Arial" w:hAnsi="Arial"/>
-                <w:color w:val="000000"/>
-                <w:sz w:val="19"/>
-                <w:szCs w:val="19"/>
-              </w:rPr>
-              <w:t xml:space="preserve">Ministerio de Trabajo del Ecuador.</w:t>
-            </w:r>
-          </w:p>
-        </w:tc>
-      </w:tr>
-      <w:tr>
-        <w:tc>
-          <w:tcPr>
-            <w:tcW w:type="dxa" w:w="2600"/>
-            <w:tcBorders>
-              <w:top w:val="single" w:color="BFBFBF" w:sz="4"/>
-              <w:left w:val="single" w:color="BFBFBF" w:sz="4"/>
-              <w:bottom w:val="single" w:color="BFBFBF" w:sz="4"/>
-              <w:right w:val="single" w:color="BFBFBF" w:sz="4"/>
-            </w:tcBorders>
-            <w:shd w:fill="FFFFFF" w:val="clear"/>
-          </w:tcPr>
-          <w:p>
-            <w:pPr>
-              <w:spacing w:after="60" w:before="60"/>
-              <w:ind w:left="115"/>
-            </w:pPr>
-            <w:r>
-              <w:rPr>
-                <w:rFonts w:ascii="Arial" w:cs="Arial" w:eastAsia="Arial" w:hAnsi="Arial"/>
-                <w:b/>
-                <w:bCs/>
-                <w:color w:val="1A3A6B"/>
-                <w:sz w:val="19"/>
-                <w:szCs w:val="19"/>
-              </w:rPr>
-              <w:t xml:space="preserve">SENESCYT</w:t>
-            </w:r>
-          </w:p>
-        </w:tc>
-        <w:tc>
-          <w:tcPr>
-            <w:tcW w:type="dxa" w:w="6760"/>
-            <w:tcBorders>
-              <w:top w:val="single" w:color="BFBFBF" w:sz="4"/>
-              <w:left w:val="single" w:color="BFBFBF" w:sz="4"/>
-              <w:bottom w:val="single" w:color="BFBFBF" w:sz="4"/>
-              <w:right w:val="single" w:color="BFBFBF" w:sz="4"/>
-            </w:tcBorders>
-          </w:tcPr>
-          <w:p>
-            <w:pPr>
-              <w:spacing w:after="60" w:before="60"/>
-              <w:ind w:left="115"/>
-            </w:pPr>
-            <w:r>
-              <w:rPr>
-                <w:rFonts w:ascii="Arial" w:cs="Arial" w:eastAsia="Arial" w:hAnsi="Arial"/>
-                <w:color w:val="000000"/>
-                <w:sz w:val="19"/>
-                <w:szCs w:val="19"/>
-              </w:rPr>
-              <w:t xml:space="preserve">Secretaría de Educación Superior, Ciencia, Tecnología e Innovación del Ecuador.</w:t>
+            <w:vMerge w:val="continue"/>
+            <w:tcBorders>
+              <w:top w:val="single" w:color="1A3A6B" w:sz="8"/>
+              <w:left w:val="single" w:color="1A3A6B" w:sz="8"/>
+              <w:bottom w:val="single" w:color="1A3A6B" w:sz="8"/>
+              <w:right w:val="single" w:color="1A3A6B" w:sz="8"/>
+            </w:tcBorders>
+          </w:tcPr>
+          <w:p/>
+        </w:tc>
+        <w:tc>
+          <w:tcPr>
+            <w:tcW w:type="dxa" w:w="5200"/>
+            <w:tcBorders>
+              <w:top w:val="single" w:color="1A3A6B" w:sz="8"/>
+              <w:left w:val="single" w:color="1A3A6B" w:sz="8"/>
+              <w:bottom w:val="single" w:color="1A3A6B" w:sz="8"/>
+              <w:right w:val="single" w:color="1A3A6B" w:sz="8"/>
+            </w:tcBorders>
+            <w:shd w:fill="EBF5FB" w:val="clear"/>
+          </w:tcPr>
+          <w:p>
+            <w:pPr>
+              <w:spacing w:after="60" w:before="60"/>
+              <w:jc w:val="center"/>
+            </w:pPr>
+            <w:r>
+              <w:rPr>
+                <w:rFonts w:ascii="Arial" w:cs="Arial" w:eastAsia="Arial" w:hAnsi="Arial"/>
+                <w:color w:val="595959"/>
+                <w:sz w:val="18"/>
+                <w:szCs w:val="18"/>
+              </w:rPr>
+              <w:t xml:space="preserve">Plantabal S.A. / 3A Core Materials  |  Planta: Quevedo y Santo Domingo</w:t>
+            </w:r>
+          </w:p>
+        </w:tc>
+        <w:tc>
+          <w:tcPr>
+            <w:tcW w:type="dxa" w:w="2160"/>
+            <w:tcBorders>
+              <w:top w:val="single" w:color="1A3A6B" w:sz="8"/>
+              <w:left w:val="single" w:color="1A3A6B" w:sz="8"/>
+              <w:bottom w:val="single" w:color="1A3A6B" w:sz="8"/>
+              <w:right w:val="single" w:color="1A3A6B" w:sz="8"/>
+            </w:tcBorders>
+            <w:shd w:fill="F2F2F2" w:val="clear"/>
+          </w:tcPr>
+          <w:p>
+            <w:pPr>
+              <w:spacing w:after="0" w:before="40"/>
+              <w:jc w:val="center"/>
+            </w:pPr>
+            <w:r>
+              <w:rPr>
+                <w:rFonts w:ascii="Arial" w:cs="Arial" w:eastAsia="Arial" w:hAnsi="Arial"/>
+                <w:color w:val="000000"/>
+                <w:sz w:val="18"/>
+                <w:szCs w:val="18"/>
+              </w:rPr>
+              <w:t xml:space="preserve">Versión: 01</w:t>
+            </w:r>
+          </w:p>
+          <w:p>
+            <w:pPr>
+              <w:spacing w:after="40" w:before="0"/>
+              <w:jc w:val="center"/>
+            </w:pPr>
+            <w:r>
+              <w:rPr>
+                <w:rFonts w:ascii="Arial" w:cs="Arial" w:eastAsia="Arial" w:hAnsi="Arial"/>
+                <w:color w:val="000000"/>
+                <w:sz w:val="18"/>
+                <w:szCs w:val="18"/>
+              </w:rPr>
+              <w:t xml:space="preserve">Fecha: 31/10/2026</w:t>
             </w:r>
           </w:p>
         </w:tc>
@@ -688,6 +258,7 @@
         <w:shd w:fill="2E6DB4" w:val="clear"/>
         <w:spacing w:after="0" w:before="0"/>
         <w:ind w:left="144"/>
+        <w:jc w:val="left"/>
       </w:pPr>
       <w:r>
         <w:rPr>
@@ -698,7 +269,173 @@
           <w:sz w:val="24"/>
           <w:szCs w:val="24"/>
         </w:rPr>
-        <w:t xml:space="preserve">4.  RESPONSABILIDADES</w:t>
+        <w:t xml:space="preserve">1.  OBJETIVO</w:t>
+      </w:r>
+    </w:p>
+    <w:p>
+      <w:pPr>
+        <w:spacing w:after="24" w:before="0"/>
+      </w:pPr>
+      <w:r>
+        <w:rPr>
+          <w:sz w:val="20"/>
+          <w:szCs w:val="20"/>
+        </w:rPr>
+        <w:t xml:space="preserve"/>
+      </w:r>
+    </w:p>
+    <w:p>
+      <w:pPr>
+        <w:spacing w:after="80" w:before="80"/>
+        <w:ind w:left="0"/>
+      </w:pPr>
+      <w:r>
+        <w:rPr>
+          <w:rFonts w:ascii="Arial" w:cs="Arial" w:eastAsia="Arial" w:hAnsi="Arial"/>
+          <w:b w:val="false"/>
+          <w:bCs w:val="false"/>
+          <w:sz w:val="20"/>
+          <w:szCs w:val="20"/>
+        </w:rPr>
+        <w:t xml:space="preserve">Establecer los requisitos documentales mínimos que debe cumplir toda empresa contratista y su personal para obtener autorización de ingreso y permanencia en las instalaciones de Plantabal S.A., asegurando condiciones de seguridad, salud ocupacional y cumplimiento legal durante la ejecución de sus actividades.</w:t>
+      </w:r>
+    </w:p>
+    <w:p>
+      <w:pPr>
+        <w:spacing w:after="40" w:before="0"/>
+      </w:pPr>
+      <w:r>
+        <w:rPr>
+          <w:sz w:val="20"/>
+          <w:szCs w:val="20"/>
+        </w:rPr>
+        <w:t xml:space="preserve"/>
+      </w:r>
+    </w:p>
+    <w:p>
+      <w:pPr>
+        <w:shd w:fill="2E6DB4" w:val="clear"/>
+        <w:spacing w:after="0" w:before="0"/>
+        <w:ind w:left="144"/>
+        <w:jc w:val="left"/>
+      </w:pPr>
+      <w:r>
+        <w:rPr>
+          <w:rFonts w:ascii="Arial" w:cs="Arial" w:eastAsia="Arial" w:hAnsi="Arial"/>
+          <w:b/>
+          <w:bCs/>
+          <w:color w:val="FFFFFF"/>
+          <w:sz w:val="24"/>
+          <w:szCs w:val="24"/>
+        </w:rPr>
+        <w:t xml:space="preserve">2.  ALCANCE</w:t>
+      </w:r>
+    </w:p>
+    <w:p>
+      <w:pPr>
+        <w:spacing w:after="24" w:before="0"/>
+      </w:pPr>
+      <w:r>
+        <w:rPr>
+          <w:sz w:val="20"/>
+          <w:szCs w:val="20"/>
+        </w:rPr>
+        <w:t xml:space="preserve"/>
+      </w:r>
+    </w:p>
+    <w:p>
+      <w:pPr>
+        <w:spacing w:after="60" w:before="80"/>
+        <w:ind w:left="0"/>
+      </w:pPr>
+      <w:r>
+        <w:rPr>
+          <w:rFonts w:ascii="Arial" w:cs="Arial" w:eastAsia="Arial" w:hAnsi="Arial"/>
+          <w:b w:val="false"/>
+          <w:bCs w:val="false"/>
+          <w:sz w:val="20"/>
+          <w:szCs w:val="20"/>
+        </w:rPr>
+        <w:t xml:space="preserve">Sitio: Plantabal S.A. — Planta Quevedo y Planta Santo Domingo</w:t>
+      </w:r>
+    </w:p>
+    <w:p>
+      <w:pPr>
+        <w:spacing w:after="60" w:before="60"/>
+        <w:ind w:left="0"/>
+      </w:pPr>
+      <w:r>
+        <w:rPr>
+          <w:rFonts w:ascii="Arial" w:cs="Arial" w:eastAsia="Arial" w:hAnsi="Arial"/>
+          <w:b w:val="false"/>
+          <w:bCs w:val="false"/>
+          <w:sz w:val="20"/>
+          <w:szCs w:val="20"/>
+        </w:rPr>
+        <w:t xml:space="preserve">Actividad inicial: Solicitud de ingreso de personal contratista al área de Seguridad.</w:t>
+      </w:r>
+    </w:p>
+    <w:p>
+      <w:pPr>
+        <w:spacing w:after="60" w:before="60"/>
+        <w:ind w:left="0"/>
+      </w:pPr>
+      <w:r>
+        <w:rPr>
+          <w:rFonts w:ascii="Arial" w:cs="Arial" w:eastAsia="Arial" w:hAnsi="Arial"/>
+          <w:b w:val="false"/>
+          <w:bCs w:val="false"/>
+          <w:sz w:val="20"/>
+          <w:szCs w:val="20"/>
+        </w:rPr>
+        <w:t xml:space="preserve">Actividad final: Registro en el Consolidado de Contratistas y emisión de la autorización GE-SO-R34.</w:t>
+      </w:r>
+    </w:p>
+    <w:p>
+      <w:pPr>
+        <w:spacing w:after="80" w:before="60"/>
+        <w:ind w:left="0"/>
+      </w:pPr>
+      <w:r>
+        <w:rPr>
+          <w:rFonts w:ascii="Arial" w:cs="Arial" w:eastAsia="Arial" w:hAnsi="Arial"/>
+          <w:b w:val="false"/>
+          <w:bCs w:val="false"/>
+          <w:sz w:val="20"/>
+          <w:szCs w:val="20"/>
+        </w:rPr>
+        <w:t xml:space="preserve">Aplica a: Toda empresa contratista o persona natural que preste servicios dentro de las instalaciones de Plantabal S.A., independientemente de la duración o tipo de trabajo.</w:t>
+      </w:r>
+    </w:p>
+    <w:p>
+      <w:pPr>
+        <w:spacing w:after="40" w:before="0"/>
+      </w:pPr>
+      <w:r>
+        <w:rPr>
+          <w:sz w:val="20"/>
+          <w:szCs w:val="20"/>
+        </w:rPr>
+        <w:t xml:space="preserve"/>
+      </w:r>
+    </w:p>
+    <w:p>
+      <w:pPr>
+        <w:shd w:fill="2E6DB4" w:val="clear"/>
+        <w:spacing w:after="0" w:before="0"/>
+        <w:ind w:left="144"/>
+        <w:jc w:val="left"/>
+      </w:pPr>
+      <w:r>
+        <w:rPr>
+          <w:rFonts w:ascii="Arial" w:cs="Arial" w:eastAsia="Arial" w:hAnsi="Arial"/>
+          <w:b/>
+          <w:bCs/>
+          <w:color w:val="FFFFFF"/>
+          <w:sz w:val="24"/>
+          <w:szCs w:val="24"/>
+        </w:rPr>
+        <w:t xml:space="preserve">3.  DEFINICIONES</w:t>
       </w:r>
     </w:p>
     <w:p>
@@ -755,7 +492,7 @@
                 <w:sz w:val="19"/>
                 <w:szCs w:val="19"/>
               </w:rPr>
-              <w:t xml:space="preserve">ACTOR</w:t>
+              <w:t xml:space="preserve">TÉRMINO</w:t>
             </w:r>
           </w:p>
         </w:tc>
@@ -773,7 +510,7 @@
           <w:p>
             <w:pPr>
               <w:spacing w:after="80" w:before="80"/>
-              <w:ind w:left="115"/>
+              <w:jc w:val="center"/>
             </w:pPr>
             <w:r>
               <w:rPr>
@@ -784,7 +521,7 @@
                 <w:sz w:val="19"/>
                 <w:szCs w:val="19"/>
               </w:rPr>
-              <w:t xml:space="preserve">RESPONSABILIDAD PRINCIPAL</w:t>
+              <w:t xml:space="preserve">DEFINICIÓN</w:t>
             </w:r>
           </w:p>
         </w:tc>
@@ -815,7 +552,7 @@
                 <w:sz w:val="19"/>
                 <w:szCs w:val="19"/>
               </w:rPr>
-              <w:t xml:space="preserve">Técnico(a) E&amp;S / Seguridad</w:t>
+              <w:t xml:space="preserve">Contratista</w:t>
             </w:r>
           </w:p>
         </w:tc>
@@ -828,21 +565,20 @@
               <w:bottom w:val="single" w:color="BFBFBF" w:sz="4"/>
               <w:right w:val="single" w:color="BFBFBF" w:sz="4"/>
             </w:tcBorders>
-            <w:shd w:fill="EBF5FB" w:val="clear"/>
-          </w:tcPr>
-          <w:p>
-            <w:pPr>
-              <w:spacing w:after="60" w:before="60"/>
-              <w:ind w:left="115"/>
-            </w:pPr>
-            <w:r>
-              <w:rPr>
-                <w:rFonts w:ascii="Arial" w:cs="Arial" w:eastAsia="Arial" w:hAnsi="Arial"/>
-                <w:color w:val="000000"/>
-                <w:sz w:val="19"/>
-                <w:szCs w:val="19"/>
-              </w:rPr>
-              <w:t xml:space="preserve">Verificar y validar el cumplimiento de todos los requisitos de ingreso antes de autorizar el acceso a planta. Mantener actualizados los registros del consolidado de contratistas.</w:t>
+          </w:tcPr>
+          <w:p>
+            <w:pPr>
+              <w:spacing w:after="60" w:before="60"/>
+              <w:ind w:left="115"/>
+            </w:pPr>
+            <w:r>
+              <w:rPr>
+                <w:rFonts w:ascii="Arial" w:cs="Arial" w:eastAsia="Arial" w:hAnsi="Arial"/>
+                <w:color w:val="000000"/>
+                <w:sz w:val="19"/>
+                <w:szCs w:val="19"/>
+              </w:rPr>
+              <w:t xml:space="preserve">Empresa o persona natural que presta servicios a Plantabal S.A. bajo contrato, con personal que opera dentro de sus instalaciones.</w:t>
             </w:r>
           </w:p>
         </w:tc>
@@ -857,7 +593,7 @@
               <w:bottom w:val="single" w:color="BFBFBF" w:sz="4"/>
               <w:right w:val="single" w:color="BFBFBF" w:sz="4"/>
             </w:tcBorders>
-            <w:shd w:fill="FFFFFF" w:val="clear"/>
+            <w:shd w:fill="EBF5FB" w:val="clear"/>
           </w:tcPr>
           <w:p>
             <w:pPr>
@@ -873,7 +609,7 @@
                 <w:sz w:val="19"/>
                 <w:szCs w:val="19"/>
               </w:rPr>
-              <w:t xml:space="preserve">Médico de Planta</w:t>
+              <w:t xml:space="preserve">Inducción de Seguridad</w:t>
             </w:r>
           </w:p>
         </w:tc>
@@ -886,21 +622,20 @@
               <w:bottom w:val="single" w:color="BFBFBF" w:sz="4"/>
               <w:right w:val="single" w:color="BFBFBF" w:sz="4"/>
             </w:tcBorders>
-            <w:shd w:fill="FFFFFF" w:val="clear"/>
-          </w:tcPr>
-          <w:p>
-            <w:pPr>
-              <w:spacing w:after="60" w:before="60"/>
-              <w:ind w:left="115"/>
-            </w:pPr>
-            <w:r>
-              <w:rPr>
-                <w:rFonts w:ascii="Arial" w:cs="Arial" w:eastAsia="Arial" w:hAnsi="Arial"/>
-                <w:color w:val="000000"/>
-                <w:sz w:val="19"/>
-                <w:szCs w:val="19"/>
-              </w:rPr>
-              <w:t xml:space="preserve">Revisar y validar el certificado médico laboral presentado por el contratista, definir su vigencia y emitir criterio de aptitud.</w:t>
+          </w:tcPr>
+          <w:p>
+            <w:pPr>
+              <w:spacing w:after="60" w:before="60"/>
+              <w:ind w:left="115"/>
+            </w:pPr>
+            <w:r>
+              <w:rPr>
+                <w:rFonts w:ascii="Arial" w:cs="Arial" w:eastAsia="Arial" w:hAnsi="Arial"/>
+                <w:color w:val="000000"/>
+                <w:sz w:val="19"/>
+                <w:szCs w:val="19"/>
+              </w:rPr>
+              <w:t xml:space="preserve">Capacitación obligatoria que recibe todo contratista antes de iniciar actividades en planta, que cubre riesgos generales, EPP, emergencias y reglamento interno. Vigencia: 1 año desde la fecha de recepción.</w:t>
             </w:r>
           </w:p>
         </w:tc>
@@ -931,7 +666,7 @@
                 <w:sz w:val="19"/>
                 <w:szCs w:val="19"/>
               </w:rPr>
-              <w:t xml:space="preserve">Guardia / Portería</w:t>
+              <w:t xml:space="preserve">Certificado Médico Laboral</w:t>
             </w:r>
           </w:p>
         </w:tc>
@@ -944,21 +679,20 @@
               <w:bottom w:val="single" w:color="BFBFBF" w:sz="4"/>
               <w:right w:val="single" w:color="BFBFBF" w:sz="4"/>
             </w:tcBorders>
-            <w:shd w:fill="EBF5FB" w:val="clear"/>
-          </w:tcPr>
-          <w:p>
-            <w:pPr>
-              <w:spacing w:after="60" w:before="60"/>
-              <w:ind w:left="115"/>
-            </w:pPr>
-            <w:r>
-              <w:rPr>
-                <w:rFonts w:ascii="Arial" w:cs="Arial" w:eastAsia="Arial" w:hAnsi="Arial"/>
-                <w:color w:val="000000"/>
-                <w:sz w:val="19"/>
-                <w:szCs w:val="19"/>
-              </w:rPr>
-              <w:t xml:space="preserve">Verificar en el momento del ingreso que el personal cuente con autorización vigente (GE-SO-R34) emitida por el área de Seguridad.</w:t>
+          </w:tcPr>
+          <w:p>
+            <w:pPr>
+              <w:spacing w:after="60" w:before="60"/>
+              <w:ind w:left="115"/>
+            </w:pPr>
+            <w:r>
+              <w:rPr>
+                <w:rFonts w:ascii="Arial" w:cs="Arial" w:eastAsia="Arial" w:hAnsi="Arial"/>
+                <w:color w:val="000000"/>
+                <w:sz w:val="19"/>
+                <w:szCs w:val="19"/>
+              </w:rPr>
+              <w:t xml:space="preserve">Documento emitido por un médico ocupacional que certifica la aptitud física del trabajador para las actividades que realizará. La vigencia es determinada por el médico de planta de Plantabal al momento de su validación.</w:t>
             </w:r>
           </w:p>
         </w:tc>
@@ -973,7 +707,7 @@
               <w:bottom w:val="single" w:color="BFBFBF" w:sz="4"/>
               <w:right w:val="single" w:color="BFBFBF" w:sz="4"/>
             </w:tcBorders>
-            <w:shd w:fill="FFFFFF" w:val="clear"/>
+            <w:shd w:fill="EBF5FB" w:val="clear"/>
           </w:tcPr>
           <w:p>
             <w:pPr>
@@ -989,7 +723,7 @@
                 <w:sz w:val="19"/>
                 <w:szCs w:val="19"/>
               </w:rPr>
-              <w:t xml:space="preserve">Empresa Contratista</w:t>
+              <w:t xml:space="preserve">Afiliación al IESS</w:t>
             </w:r>
           </w:p>
         </w:tc>
@@ -1002,21 +736,20 @@
               <w:bottom w:val="single" w:color="BFBFBF" w:sz="4"/>
               <w:right w:val="single" w:color="BFBFBF" w:sz="4"/>
             </w:tcBorders>
-            <w:shd w:fill="FFFFFF" w:val="clear"/>
-          </w:tcPr>
-          <w:p>
-            <w:pPr>
-              <w:spacing w:after="60" w:before="60"/>
-              <w:ind w:left="115"/>
-            </w:pPr>
-            <w:r>
-              <w:rPr>
-                <w:rFonts w:ascii="Arial" w:cs="Arial" w:eastAsia="Arial" w:hAnsi="Arial"/>
-                <w:color w:val="000000"/>
-                <w:sz w:val="19"/>
-                <w:szCs w:val="19"/>
-              </w:rPr>
-              <w:t xml:space="preserve">Presentar oportunamente toda la documentación requerida antes de iniciar actividades en planta. Mantener vigentes los documentos durante toda la duración del contrato.</w:t>
+          </w:tcPr>
+          <w:p>
+            <w:pPr>
+              <w:spacing w:after="60" w:before="60"/>
+              <w:ind w:left="115"/>
+            </w:pPr>
+            <w:r>
+              <w:rPr>
+                <w:rFonts w:ascii="Arial" w:cs="Arial" w:eastAsia="Arial" w:hAnsi="Arial"/>
+                <w:color w:val="000000"/>
+                <w:sz w:val="19"/>
+                <w:szCs w:val="19"/>
+              </w:rPr>
+              <w:t xml:space="preserve">Registro del trabajador en el Instituto Ecuatoriano de Seguridad Social. Se acredita mediante la planilla de pago del mes inmediatamente anterior. Para trabajadores de nuevo ingreso, se acepta el aviso de entrada, registrando la fecha del mes siguiente.</w:t>
             </w:r>
           </w:p>
         </w:tc>
@@ -1047,7 +780,7 @@
                 <w:sz w:val="19"/>
                 <w:szCs w:val="19"/>
               </w:rPr>
-              <w:t xml:space="preserve">Área Solicitante</w:t>
+              <w:t xml:space="preserve">Aviso de entrada</w:t>
             </w:r>
           </w:p>
         </w:tc>
@@ -1060,21 +793,248 @@
               <w:bottom w:val="single" w:color="BFBFBF" w:sz="4"/>
               <w:right w:val="single" w:color="BFBFBF" w:sz="4"/>
             </w:tcBorders>
-            <w:shd w:fill="EBF5FB" w:val="clear"/>
-          </w:tcPr>
-          <w:p>
-            <w:pPr>
-              <w:spacing w:after="60" w:before="60"/>
-              <w:ind w:left="115"/>
-            </w:pPr>
-            <w:r>
-              <w:rPr>
-                <w:rFonts w:ascii="Arial" w:cs="Arial" w:eastAsia="Arial" w:hAnsi="Arial"/>
-                <w:color w:val="000000"/>
-                <w:sz w:val="19"/>
-                <w:szCs w:val="19"/>
-              </w:rPr>
-              <w:t xml:space="preserve">Solicitar el ingreso del contratista con anticipación, coordinando con Seguridad la verificación documental previa al inicio del trabajo.</w:t>
+          </w:tcPr>
+          <w:p>
+            <w:pPr>
+              <w:spacing w:after="60" w:before="60"/>
+              <w:ind w:left="115"/>
+            </w:pPr>
+            <w:r>
+              <w:rPr>
+                <w:rFonts w:ascii="Arial" w:cs="Arial" w:eastAsia="Arial" w:hAnsi="Arial"/>
+                <w:color w:val="000000"/>
+                <w:sz w:val="19"/>
+                <w:szCs w:val="19"/>
+              </w:rPr>
+              <w:t xml:space="preserve">Notificación enviada al IESS al momento de contratar a un trabajador nuevo. La planilla correspondiente se genera el mes siguiente, por lo que se acepta el aviso como habilitante de acceso transitorio.</w:t>
+            </w:r>
+          </w:p>
+        </w:tc>
+      </w:tr>
+      <w:tr>
+        <w:tc>
+          <w:tcPr>
+            <w:tcW w:type="dxa" w:w="2600"/>
+            <w:tcBorders>
+              <w:top w:val="single" w:color="BFBFBF" w:sz="4"/>
+              <w:left w:val="single" w:color="BFBFBF" w:sz="4"/>
+              <w:bottom w:val="single" w:color="BFBFBF" w:sz="4"/>
+              <w:right w:val="single" w:color="BFBFBF" w:sz="4"/>
+            </w:tcBorders>
+            <w:shd w:fill="EBF5FB" w:val="clear"/>
+          </w:tcPr>
+          <w:p>
+            <w:pPr>
+              <w:spacing w:after="60" w:before="60"/>
+              <w:ind w:left="115"/>
+            </w:pPr>
+            <w:r>
+              <w:rPr>
+                <w:rFonts w:ascii="Arial" w:cs="Arial" w:eastAsia="Arial" w:hAnsi="Arial"/>
+                <w:b/>
+                <w:bCs/>
+                <w:color w:val="1A3A6B"/>
+                <w:sz w:val="19"/>
+                <w:szCs w:val="19"/>
+              </w:rPr>
+              <w:t xml:space="preserve">Trabajo de alto riesgo</w:t>
+            </w:r>
+          </w:p>
+        </w:tc>
+        <w:tc>
+          <w:tcPr>
+            <w:tcW w:type="dxa" w:w="6760"/>
+            <w:tcBorders>
+              <w:top w:val="single" w:color="BFBFBF" w:sz="4"/>
+              <w:left w:val="single" w:color="BFBFBF" w:sz="4"/>
+              <w:bottom w:val="single" w:color="BFBFBF" w:sz="4"/>
+              <w:right w:val="single" w:color="BFBFBF" w:sz="4"/>
+            </w:tcBorders>
+          </w:tcPr>
+          <w:p>
+            <w:pPr>
+              <w:spacing w:after="60" w:before="60"/>
+              <w:ind w:left="115"/>
+            </w:pPr>
+            <w:r>
+              <w:rPr>
+                <w:rFonts w:ascii="Arial" w:cs="Arial" w:eastAsia="Arial" w:hAnsi="Arial"/>
+                <w:color w:val="000000"/>
+                <w:sz w:val="19"/>
+                <w:szCs w:val="19"/>
+              </w:rPr>
+              <w:t xml:space="preserve">Actividad con potencial de lesión grave o fatal que requiere certificación específica: trabajos en caliente, trabajos en altura (≥ 1,80 m), espacios confinados, trabajos eléctricos (media y alta tensión) y trabajos de izaje.</w:t>
+            </w:r>
+          </w:p>
+        </w:tc>
+      </w:tr>
+      <w:tr>
+        <w:tc>
+          <w:tcPr>
+            <w:tcW w:type="dxa" w:w="2600"/>
+            <w:tcBorders>
+              <w:top w:val="single" w:color="BFBFBF" w:sz="4"/>
+              <w:left w:val="single" w:color="BFBFBF" w:sz="4"/>
+              <w:bottom w:val="single" w:color="BFBFBF" w:sz="4"/>
+              <w:right w:val="single" w:color="BFBFBF" w:sz="4"/>
+            </w:tcBorders>
+            <w:shd w:fill="EBF5FB" w:val="clear"/>
+          </w:tcPr>
+          <w:p>
+            <w:pPr>
+              <w:spacing w:after="60" w:before="60"/>
+              <w:ind w:left="115"/>
+            </w:pPr>
+            <w:r>
+              <w:rPr>
+                <w:rFonts w:ascii="Arial" w:cs="Arial" w:eastAsia="Arial" w:hAnsi="Arial"/>
+                <w:b/>
+                <w:bCs/>
+                <w:color w:val="1A3A6B"/>
+                <w:sz w:val="19"/>
+                <w:szCs w:val="19"/>
+              </w:rPr>
+              <w:t xml:space="preserve">Certificado de prevención de riesgos laborales</w:t>
+            </w:r>
+          </w:p>
+        </w:tc>
+        <w:tc>
+          <w:tcPr>
+            <w:tcW w:type="dxa" w:w="6760"/>
+            <w:tcBorders>
+              <w:top w:val="single" w:color="BFBFBF" w:sz="4"/>
+              <w:left w:val="single" w:color="BFBFBF" w:sz="4"/>
+              <w:bottom w:val="single" w:color="BFBFBF" w:sz="4"/>
+              <w:right w:val="single" w:color="BFBFBF" w:sz="4"/>
+            </w:tcBorders>
+          </w:tcPr>
+          <w:p>
+            <w:pPr>
+              <w:spacing w:after="60" w:before="60"/>
+              <w:ind w:left="115"/>
+            </w:pPr>
+            <w:r>
+              <w:rPr>
+                <w:rFonts w:ascii="Arial" w:cs="Arial" w:eastAsia="Arial" w:hAnsi="Arial"/>
+                <w:color w:val="000000"/>
+                <w:sz w:val="19"/>
+                <w:szCs w:val="19"/>
+              </w:rPr>
+              <w:t xml:space="preserve">Documento emitido por entidad certificadora reconocida (MDT o SENESCYT) que acredita la competencia del trabajador para ejecutar un tipo específico de trabajo de alto riesgo.</w:t>
+            </w:r>
+          </w:p>
+        </w:tc>
+      </w:tr>
+      <w:tr>
+        <w:tc>
+          <w:tcPr>
+            <w:tcW w:type="dxa" w:w="2600"/>
+            <w:tcBorders>
+              <w:top w:val="single" w:color="BFBFBF" w:sz="4"/>
+              <w:left w:val="single" w:color="BFBFBF" w:sz="4"/>
+              <w:bottom w:val="single" w:color="BFBFBF" w:sz="4"/>
+              <w:right w:val="single" w:color="BFBFBF" w:sz="4"/>
+            </w:tcBorders>
+            <w:shd w:fill="EBF5FB" w:val="clear"/>
+          </w:tcPr>
+          <w:p>
+            <w:pPr>
+              <w:spacing w:after="60" w:before="60"/>
+              <w:ind w:left="115"/>
+            </w:pPr>
+            <w:r>
+              <w:rPr>
+                <w:rFonts w:ascii="Arial" w:cs="Arial" w:eastAsia="Arial" w:hAnsi="Arial"/>
+                <w:b/>
+                <w:bCs/>
+                <w:color w:val="1A3A6B"/>
+                <w:sz w:val="19"/>
+                <w:szCs w:val="19"/>
+              </w:rPr>
+              <w:t xml:space="preserve">MDT</w:t>
+            </w:r>
+          </w:p>
+        </w:tc>
+        <w:tc>
+          <w:tcPr>
+            <w:tcW w:type="dxa" w:w="6760"/>
+            <w:tcBorders>
+              <w:top w:val="single" w:color="BFBFBF" w:sz="4"/>
+              <w:left w:val="single" w:color="BFBFBF" w:sz="4"/>
+              <w:bottom w:val="single" w:color="BFBFBF" w:sz="4"/>
+              <w:right w:val="single" w:color="BFBFBF" w:sz="4"/>
+            </w:tcBorders>
+          </w:tcPr>
+          <w:p>
+            <w:pPr>
+              <w:spacing w:after="60" w:before="60"/>
+              <w:ind w:left="115"/>
+            </w:pPr>
+            <w:r>
+              <w:rPr>
+                <w:rFonts w:ascii="Arial" w:cs="Arial" w:eastAsia="Arial" w:hAnsi="Arial"/>
+                <w:color w:val="000000"/>
+                <w:sz w:val="19"/>
+                <w:szCs w:val="19"/>
+              </w:rPr>
+              <w:t xml:space="preserve">Ministerio de Trabajo del Ecuador.</w:t>
+            </w:r>
+          </w:p>
+        </w:tc>
+      </w:tr>
+      <w:tr>
+        <w:tc>
+          <w:tcPr>
+            <w:tcW w:type="dxa" w:w="2600"/>
+            <w:tcBorders>
+              <w:top w:val="single" w:color="BFBFBF" w:sz="4"/>
+              <w:left w:val="single" w:color="BFBFBF" w:sz="4"/>
+              <w:bottom w:val="single" w:color="BFBFBF" w:sz="4"/>
+              <w:right w:val="single" w:color="BFBFBF" w:sz="4"/>
+            </w:tcBorders>
+            <w:shd w:fill="EBF5FB" w:val="clear"/>
+          </w:tcPr>
+          <w:p>
+            <w:pPr>
+              <w:spacing w:after="60" w:before="60"/>
+              <w:ind w:left="115"/>
+            </w:pPr>
+            <w:r>
+              <w:rPr>
+                <w:rFonts w:ascii="Arial" w:cs="Arial" w:eastAsia="Arial" w:hAnsi="Arial"/>
+                <w:b/>
+                <w:bCs/>
+                <w:color w:val="1A3A6B"/>
+                <w:sz w:val="19"/>
+                <w:szCs w:val="19"/>
+              </w:rPr>
+              <w:t xml:space="preserve">SENESCYT</w:t>
+            </w:r>
+          </w:p>
+        </w:tc>
+        <w:tc>
+          <w:tcPr>
+            <w:tcW w:type="dxa" w:w="6760"/>
+            <w:tcBorders>
+              <w:top w:val="single" w:color="BFBFBF" w:sz="4"/>
+              <w:left w:val="single" w:color="BFBFBF" w:sz="4"/>
+              <w:bottom w:val="single" w:color="BFBFBF" w:sz="4"/>
+              <w:right w:val="single" w:color="BFBFBF" w:sz="4"/>
+            </w:tcBorders>
+          </w:tcPr>
+          <w:p>
+            <w:pPr>
+              <w:spacing w:after="60" w:before="60"/>
+              <w:ind w:left="115"/>
+            </w:pPr>
+            <w:r>
+              <w:rPr>
+                <w:rFonts w:ascii="Arial" w:cs="Arial" w:eastAsia="Arial" w:hAnsi="Arial"/>
+                <w:color w:val="000000"/>
+                <w:sz w:val="19"/>
+                <w:szCs w:val="19"/>
+              </w:rPr>
+              <w:t xml:space="preserve">Secretaría de Educación Superior, Ciencia, Tecnología e Innovación del Ecuador.</w:t>
             </w:r>
           </w:p>
         </w:tc>
@@ -1097,6 +1057,417 @@
         <w:shd w:fill="2E6DB4" w:val="clear"/>
         <w:spacing w:after="0" w:before="0"/>
         <w:ind w:left="144"/>
+        <w:jc w:val="left"/>
+      </w:pPr>
+      <w:r>
+        <w:rPr>
+          <w:rFonts w:ascii="Arial" w:cs="Arial" w:eastAsia="Arial" w:hAnsi="Arial"/>
+          <w:b/>
+          <w:bCs/>
+          <w:color w:val="FFFFFF"/>
+          <w:sz w:val="24"/>
+          <w:szCs w:val="24"/>
+        </w:rPr>
+        <w:t xml:space="preserve">4.  RESPONSABILIDADES</w:t>
+      </w:r>
+    </w:p>
+    <w:p>
+      <w:pPr>
+        <w:spacing w:after="24" w:before="0"/>
+      </w:pPr>
+      <w:r>
+        <w:rPr>
+          <w:sz w:val="20"/>
+          <w:szCs w:val="20"/>
+        </w:rPr>
+        <w:t xml:space="preserve"/>
+      </w:r>
+    </w:p>
+    <w:tbl>
+      <w:tblPr>
+        <w:tblW w:type="dxa" w:w="9360"/>
+        <w:tblBorders>
+          <w:top w:val="single" w:color="auto" w:sz="4"/>
+          <w:left w:val="single" w:color="auto" w:sz="4"/>
+          <w:bottom w:val="single" w:color="auto" w:sz="4"/>
+          <w:right w:val="single" w:color="auto" w:sz="4"/>
+          <w:insideH w:val="single" w:color="auto" w:sz="4"/>
+          <w:insideV w:val="single" w:color="auto" w:sz="4"/>
+        </w:tblBorders>
+      </w:tblPr>
+      <w:tblGrid>
+        <w:gridCol w:w="2600"/>
+        <w:gridCol w:w="6760"/>
+      </w:tblGrid>
+      <w:tr>
+        <w:tc>
+          <w:tcPr>
+            <w:tcW w:type="dxa" w:w="2600"/>
+            <w:tcBorders>
+              <w:top w:val="single" w:color="2E6DB4" w:sz="8"/>
+              <w:left w:val="single" w:color="2E6DB4" w:sz="8"/>
+              <w:bottom w:val="single" w:color="2E6DB4" w:sz="8"/>
+              <w:right w:val="single" w:color="2E6DB4" w:sz="8"/>
+            </w:tcBorders>
+            <w:shd w:fill="2E6DB4" w:val="clear"/>
+          </w:tcPr>
+          <w:p>
+            <w:pPr>
+              <w:spacing w:after="80" w:before="80"/>
+              <w:jc w:val="center"/>
+            </w:pPr>
+            <w:r>
+              <w:rPr>
+                <w:rFonts w:ascii="Arial" w:cs="Arial" w:eastAsia="Arial" w:hAnsi="Arial"/>
+                <w:b/>
+                <w:bCs/>
+                <w:color w:val="FFFFFF"/>
+                <w:sz w:val="19"/>
+                <w:szCs w:val="19"/>
+              </w:rPr>
+              <w:t xml:space="preserve">ACTOR</w:t>
+            </w:r>
+          </w:p>
+        </w:tc>
+        <w:tc>
+          <w:tcPr>
+            <w:tcW w:type="dxa" w:w="6760"/>
+            <w:tcBorders>
+              <w:top w:val="single" w:color="2E6DB4" w:sz="8"/>
+              <w:left w:val="single" w:color="2E6DB4" w:sz="8"/>
+              <w:bottom w:val="single" w:color="2E6DB4" w:sz="8"/>
+              <w:right w:val="single" w:color="2E6DB4" w:sz="8"/>
+            </w:tcBorders>
+            <w:shd w:fill="2E6DB4" w:val="clear"/>
+          </w:tcPr>
+          <w:p>
+            <w:pPr>
+              <w:spacing w:after="80" w:before="80"/>
+              <w:jc w:val="center"/>
+            </w:pPr>
+            <w:r>
+              <w:rPr>
+                <w:rFonts w:ascii="Arial" w:cs="Arial" w:eastAsia="Arial" w:hAnsi="Arial"/>
+                <w:b/>
+                <w:bCs/>
+                <w:color w:val="FFFFFF"/>
+                <w:sz w:val="19"/>
+                <w:szCs w:val="19"/>
+              </w:rPr>
+              <w:t xml:space="preserve">RESPONSABILIDAD PRINCIPAL</w:t>
+            </w:r>
+          </w:p>
+        </w:tc>
+      </w:tr>
+      <w:tr>
+        <w:tc>
+          <w:tcPr>
+            <w:tcW w:type="dxa" w:w="2600"/>
+            <w:tcBorders>
+              <w:top w:val="single" w:color="BFBFBF" w:sz="4"/>
+              <w:left w:val="single" w:color="BFBFBF" w:sz="4"/>
+              <w:bottom w:val="single" w:color="BFBFBF" w:sz="4"/>
+              <w:right w:val="single" w:color="BFBFBF" w:sz="4"/>
+            </w:tcBorders>
+            <w:shd w:fill="EBF5FB" w:val="clear"/>
+          </w:tcPr>
+          <w:p>
+            <w:pPr>
+              <w:spacing w:after="60" w:before="60"/>
+              <w:ind w:left="115"/>
+            </w:pPr>
+            <w:r>
+              <w:rPr>
+                <w:rFonts w:ascii="Arial" w:cs="Arial" w:eastAsia="Arial" w:hAnsi="Arial"/>
+                <w:b/>
+                <w:bCs/>
+                <w:color w:val="1A3A6B"/>
+                <w:sz w:val="19"/>
+                <w:szCs w:val="19"/>
+              </w:rPr>
+              <w:t xml:space="preserve">Técnico(a) E&amp;S / Seguridad</w:t>
+            </w:r>
+          </w:p>
+        </w:tc>
+        <w:tc>
+          <w:tcPr>
+            <w:tcW w:type="dxa" w:w="6760"/>
+            <w:tcBorders>
+              <w:top w:val="single" w:color="BFBFBF" w:sz="4"/>
+              <w:left w:val="single" w:color="BFBFBF" w:sz="4"/>
+              <w:bottom w:val="single" w:color="BFBFBF" w:sz="4"/>
+              <w:right w:val="single" w:color="BFBFBF" w:sz="4"/>
+            </w:tcBorders>
+            <w:shd w:fill="EBF5FB" w:val="clear"/>
+          </w:tcPr>
+          <w:p>
+            <w:pPr>
+              <w:spacing w:after="60" w:before="60"/>
+              <w:ind w:left="115"/>
+            </w:pPr>
+            <w:r>
+              <w:rPr>
+                <w:rFonts w:ascii="Arial" w:cs="Arial" w:eastAsia="Arial" w:hAnsi="Arial"/>
+                <w:color w:val="000000"/>
+                <w:sz w:val="19"/>
+                <w:szCs w:val="19"/>
+              </w:rPr>
+              <w:t xml:space="preserve">Verificar y validar el cumplimiento de todos los requisitos de ingreso antes de autorizar el acceso a planta. Mantener actualizados los registros del consolidado de contratistas.</w:t>
+            </w:r>
+          </w:p>
+        </w:tc>
+      </w:tr>
+      <w:tr>
+        <w:tc>
+          <w:tcPr>
+            <w:tcW w:type="dxa" w:w="2600"/>
+            <w:tcBorders>
+              <w:top w:val="single" w:color="BFBFBF" w:sz="4"/>
+              <w:left w:val="single" w:color="BFBFBF" w:sz="4"/>
+              <w:bottom w:val="single" w:color="BFBFBF" w:sz="4"/>
+              <w:right w:val="single" w:color="BFBFBF" w:sz="4"/>
+            </w:tcBorders>
+            <w:shd w:fill="FFFFFF" w:val="clear"/>
+          </w:tcPr>
+          <w:p>
+            <w:pPr>
+              <w:spacing w:after="60" w:before="60"/>
+              <w:ind w:left="115"/>
+            </w:pPr>
+            <w:r>
+              <w:rPr>
+                <w:rFonts w:ascii="Arial" w:cs="Arial" w:eastAsia="Arial" w:hAnsi="Arial"/>
+                <w:b/>
+                <w:bCs/>
+                <w:color w:val="1A3A6B"/>
+                <w:sz w:val="19"/>
+                <w:szCs w:val="19"/>
+              </w:rPr>
+              <w:t xml:space="preserve">Médico de Planta</w:t>
+            </w:r>
+          </w:p>
+        </w:tc>
+        <w:tc>
+          <w:tcPr>
+            <w:tcW w:type="dxa" w:w="6760"/>
+            <w:tcBorders>
+              <w:top w:val="single" w:color="BFBFBF" w:sz="4"/>
+              <w:left w:val="single" w:color="BFBFBF" w:sz="4"/>
+              <w:bottom w:val="single" w:color="BFBFBF" w:sz="4"/>
+              <w:right w:val="single" w:color="BFBFBF" w:sz="4"/>
+            </w:tcBorders>
+            <w:shd w:fill="FFFFFF" w:val="clear"/>
+          </w:tcPr>
+          <w:p>
+            <w:pPr>
+              <w:spacing w:after="60" w:before="60"/>
+              <w:ind w:left="115"/>
+            </w:pPr>
+            <w:r>
+              <w:rPr>
+                <w:rFonts w:ascii="Arial" w:cs="Arial" w:eastAsia="Arial" w:hAnsi="Arial"/>
+                <w:color w:val="000000"/>
+                <w:sz w:val="19"/>
+                <w:szCs w:val="19"/>
+              </w:rPr>
+              <w:t xml:space="preserve">Revisar y validar el certificado médico laboral presentado por el contratista, definir su vigencia y emitir criterio de aptitud.</w:t>
+            </w:r>
+          </w:p>
+        </w:tc>
+      </w:tr>
+      <w:tr>
+        <w:tc>
+          <w:tcPr>
+            <w:tcW w:type="dxa" w:w="2600"/>
+            <w:tcBorders>
+              <w:top w:val="single" w:color="BFBFBF" w:sz="4"/>
+              <w:left w:val="single" w:color="BFBFBF" w:sz="4"/>
+              <w:bottom w:val="single" w:color="BFBFBF" w:sz="4"/>
+              <w:right w:val="single" w:color="BFBFBF" w:sz="4"/>
+            </w:tcBorders>
+            <w:shd w:fill="EBF5FB" w:val="clear"/>
+          </w:tcPr>
+          <w:p>
+            <w:pPr>
+              <w:spacing w:after="60" w:before="60"/>
+              <w:ind w:left="115"/>
+            </w:pPr>
+            <w:r>
+              <w:rPr>
+                <w:rFonts w:ascii="Arial" w:cs="Arial" w:eastAsia="Arial" w:hAnsi="Arial"/>
+                <w:b/>
+                <w:bCs/>
+                <w:color w:val="1A3A6B"/>
+                <w:sz w:val="19"/>
+                <w:szCs w:val="19"/>
+              </w:rPr>
+              <w:t xml:space="preserve">Guardia de Seguridad / Portería</w:t>
+            </w:r>
+          </w:p>
+        </w:tc>
+        <w:tc>
+          <w:tcPr>
+            <w:tcW w:type="dxa" w:w="6760"/>
+            <w:tcBorders>
+              <w:top w:val="single" w:color="BFBFBF" w:sz="4"/>
+              <w:left w:val="single" w:color="BFBFBF" w:sz="4"/>
+              <w:bottom w:val="single" w:color="BFBFBF" w:sz="4"/>
+              <w:right w:val="single" w:color="BFBFBF" w:sz="4"/>
+            </w:tcBorders>
+            <w:shd w:fill="EBF5FB" w:val="clear"/>
+          </w:tcPr>
+          <w:p>
+            <w:pPr>
+              <w:spacing w:after="60" w:before="60"/>
+              <w:ind w:left="115"/>
+            </w:pPr>
+            <w:r>
+              <w:rPr>
+                <w:rFonts w:ascii="Arial" w:cs="Arial" w:eastAsia="Arial" w:hAnsi="Arial"/>
+                <w:color w:val="000000"/>
+                <w:sz w:val="19"/>
+                <w:szCs w:val="19"/>
+              </w:rPr>
+              <w:t xml:space="preserve">Verificar en el momento del ingreso que el personal cuente con autorización vigente (GE-SO-R34) emitida por el área de Seguridad.</w:t>
+            </w:r>
+          </w:p>
+        </w:tc>
+      </w:tr>
+      <w:tr>
+        <w:tc>
+          <w:tcPr>
+            <w:tcW w:type="dxa" w:w="2600"/>
+            <w:tcBorders>
+              <w:top w:val="single" w:color="BFBFBF" w:sz="4"/>
+              <w:left w:val="single" w:color="BFBFBF" w:sz="4"/>
+              <w:bottom w:val="single" w:color="BFBFBF" w:sz="4"/>
+              <w:right w:val="single" w:color="BFBFBF" w:sz="4"/>
+            </w:tcBorders>
+            <w:shd w:fill="FFFFFF" w:val="clear"/>
+          </w:tcPr>
+          <w:p>
+            <w:pPr>
+              <w:spacing w:after="60" w:before="60"/>
+              <w:ind w:left="115"/>
+            </w:pPr>
+            <w:r>
+              <w:rPr>
+                <w:rFonts w:ascii="Arial" w:cs="Arial" w:eastAsia="Arial" w:hAnsi="Arial"/>
+                <w:b/>
+                <w:bCs/>
+                <w:color w:val="1A3A6B"/>
+                <w:sz w:val="19"/>
+                <w:szCs w:val="19"/>
+              </w:rPr>
+              <w:t xml:space="preserve">Empresa Contratista</w:t>
+            </w:r>
+          </w:p>
+        </w:tc>
+        <w:tc>
+          <w:tcPr>
+            <w:tcW w:type="dxa" w:w="6760"/>
+            <w:tcBorders>
+              <w:top w:val="single" w:color="BFBFBF" w:sz="4"/>
+              <w:left w:val="single" w:color="BFBFBF" w:sz="4"/>
+              <w:bottom w:val="single" w:color="BFBFBF" w:sz="4"/>
+              <w:right w:val="single" w:color="BFBFBF" w:sz="4"/>
+            </w:tcBorders>
+            <w:shd w:fill="FFFFFF" w:val="clear"/>
+          </w:tcPr>
+          <w:p>
+            <w:pPr>
+              <w:spacing w:after="60" w:before="60"/>
+              <w:ind w:left="115"/>
+            </w:pPr>
+            <w:r>
+              <w:rPr>
+                <w:rFonts w:ascii="Arial" w:cs="Arial" w:eastAsia="Arial" w:hAnsi="Arial"/>
+                <w:color w:val="000000"/>
+                <w:sz w:val="19"/>
+                <w:szCs w:val="19"/>
+              </w:rPr>
+              <w:t xml:space="preserve">Presentar oportunamente toda la documentación requerida antes de iniciar actividades en planta. Mantener vigentes los documentos durante toda la duración del contrato.</w:t>
+            </w:r>
+          </w:p>
+        </w:tc>
+      </w:tr>
+      <w:tr>
+        <w:tc>
+          <w:tcPr>
+            <w:tcW w:type="dxa" w:w="2600"/>
+            <w:tcBorders>
+              <w:top w:val="single" w:color="BFBFBF" w:sz="4"/>
+              <w:left w:val="single" w:color="BFBFBF" w:sz="4"/>
+              <w:bottom w:val="single" w:color="BFBFBF" w:sz="4"/>
+              <w:right w:val="single" w:color="BFBFBF" w:sz="4"/>
+            </w:tcBorders>
+            <w:shd w:fill="EBF5FB" w:val="clear"/>
+          </w:tcPr>
+          <w:p>
+            <w:pPr>
+              <w:spacing w:after="60" w:before="60"/>
+              <w:ind w:left="115"/>
+            </w:pPr>
+            <w:r>
+              <w:rPr>
+                <w:rFonts w:ascii="Arial" w:cs="Arial" w:eastAsia="Arial" w:hAnsi="Arial"/>
+                <w:b/>
+                <w:bCs/>
+                <w:color w:val="1A3A6B"/>
+                <w:sz w:val="19"/>
+                <w:szCs w:val="19"/>
+              </w:rPr>
+              <w:t xml:space="preserve">Área Solicitante</w:t>
+            </w:r>
+          </w:p>
+        </w:tc>
+        <w:tc>
+          <w:tcPr>
+            <w:tcW w:type="dxa" w:w="6760"/>
+            <w:tcBorders>
+              <w:top w:val="single" w:color="BFBFBF" w:sz="4"/>
+              <w:left w:val="single" w:color="BFBFBF" w:sz="4"/>
+              <w:bottom w:val="single" w:color="BFBFBF" w:sz="4"/>
+              <w:right w:val="single" w:color="BFBFBF" w:sz="4"/>
+            </w:tcBorders>
+            <w:shd w:fill="EBF5FB" w:val="clear"/>
+          </w:tcPr>
+          <w:p>
+            <w:pPr>
+              <w:spacing w:after="60" w:before="60"/>
+              <w:ind w:left="115"/>
+            </w:pPr>
+            <w:r>
+              <w:rPr>
+                <w:rFonts w:ascii="Arial" w:cs="Arial" w:eastAsia="Arial" w:hAnsi="Arial"/>
+                <w:color w:val="000000"/>
+                <w:sz w:val="19"/>
+                <w:szCs w:val="19"/>
+              </w:rPr>
+              <w:t xml:space="preserve">Solicitar el ingreso del contratista con la debida anticipación, coordinando con Seguridad la verificación documental previa al inicio del trabajo.</w:t>
+            </w:r>
+          </w:p>
+        </w:tc>
+      </w:tr>
+    </w:tbl>
+    <w:p>
+      <w:pPr>
+        <w:spacing w:after="40" w:before="0"/>
+      </w:pPr>
+      <w:r>
+        <w:rPr>
+          <w:sz w:val="20"/>
+          <w:szCs w:val="20"/>
+        </w:rPr>
+        <w:t xml:space="preserve"/>
+      </w:r>
+    </w:p>
+    <w:p>
+      <w:pPr>
+        <w:shd w:fill="2E6DB4" w:val="clear"/>
+        <w:spacing w:after="0" w:before="0"/>
+        <w:ind w:left="144"/>
+        <w:jc w:val="left"/>
       </w:pPr>
       <w:r>
         <w:rPr>
@@ -1138,7 +1509,7 @@
           <w:sz w:val="21"/>
           <w:szCs w:val="21"/>
         </w:rPr>
-        <w:t xml:space="preserve">5.1  Proceso de habilitacion de ingreso</w:t>
+        <w:t xml:space="preserve">5.1  Proceso de habilitación de ingreso</w:t>
       </w:r>
     </w:p>
     <w:p>
@@ -1276,6 +1647,7 @@
             <w:pPr>
               <w:spacing w:after="80" w:before="80"/>
               <w:ind w:left="144"/>
+              <w:jc w:val="left"/>
             </w:pPr>
             <w:r>
               <w:rPr>
@@ -1345,7 +1717,7 @@
                 <w:sz w:val="19"/>
                 <w:szCs w:val="19"/>
               </w:rPr>
-              <w:t xml:space="preserve">El Área Solicitante notifica al área de Seguridad con al menos 48 horas de anticipación, indicando: nombre de la empresa, servicio a ejecutar, fechas de inicio y fin, y tipo de actividades de riesgo involucradas.</w:t>
+              <w:t xml:space="preserve">El Área Solicitante notifica al área de Seguridad con al menos 48 horas de anticipación al inicio de actividades, indicando: nombre de la empresa, servicio a ejecutar, fechas de inicio y fin, y tipo de actividades de riesgo involucradas.</w:t>
             </w:r>
           </w:p>
         </w:tc>
@@ -1432,7 +1804,7 @@
                 <w:sz w:val="19"/>
                 <w:szCs w:val="19"/>
               </w:rPr>
-              <w:t xml:space="preserve">Seguridad comunica a la empresa contratista la lista de documentos requeridos para el ingreso, según lo establecido en la Sección 5.2 de este instructivo.</w:t>
+              <w:t xml:space="preserve">El área de Seguridad comunica a la empresa contratista la lista de documentos requeridos para el ingreso, según lo establecido en la Sección 5.2 de este instructivo.</w:t>
             </w:r>
           </w:p>
         </w:tc>
@@ -1482,6 +1854,7 @@
             <w:pPr>
               <w:spacing w:after="80" w:before="80"/>
               <w:ind w:left="144"/>
+              <w:jc w:val="left"/>
             </w:pPr>
             <w:r>
               <w:rPr>
@@ -1551,7 +1924,7 @@
                 <w:sz w:val="19"/>
                 <w:szCs w:val="19"/>
               </w:rPr>
-              <w:t xml:space="preserve">La empresa contratista presenta la documentación de cada trabajador antes del inicio de actividades. El área de Seguridad recibe y verifica validez y vigencia de cada documento.</w:t>
+              <w:t xml:space="preserve">La empresa contratista presenta la documentación de cada trabajador antes del inicio de actividades. El área de Seguridad recibe y revisa cada documento verificando su validez y vigencia.</w:t>
             </w:r>
           </w:p>
         </w:tc>
@@ -1579,7 +1952,8 @@
                 <w:sz w:val="19"/>
                 <w:szCs w:val="19"/>
               </w:rPr>
-              <w:t xml:space="preserve">Técnico(a) E&amp;S / Empresa</w:t>
+              <w:t xml:space="preserve">Técnico(a) E&amp;S
+Empresa Contratista</w:t>
             </w:r>
           </w:p>
         </w:tc>
@@ -1638,7 +2012,7 @@
                 <w:sz w:val="19"/>
                 <w:szCs w:val="19"/>
               </w:rPr>
-              <w:t xml:space="preserve">INDUCCIÓN DE SEGURIDAD: Verificar que el trabajador haya recibido la Inducción de Seguridad de Plantabal. Vigencia: 1 año desde la fecha de recepción. Si está vencida o no existe, el trabajador debe recibirla antes de ingresar a planta.</w:t>
+              <w:t xml:space="preserve">INDUCCIÓN DE SEGURIDAD: Verificar que el trabajador haya recibido la Inducción de Seguridad de Plantabal. La inducción tiene una vigencia de 1 año desde la fecha de recepción. Si está vencida o no existe, el trabajador debe recibirla antes de ingresar a planta.</w:t>
             </w:r>
           </w:p>
         </w:tc>
@@ -1725,7 +2099,7 @@
                 <w:sz w:val="19"/>
                 <w:szCs w:val="19"/>
               </w:rPr>
-              <w:t xml:space="preserve">AFILIACIÓN AL IESS: Verificar la planilla de pago del IESS del mes inmediatamente anterior. Para trabajadores nuevos con aviso de entrada, se acepta el aviso como habilitante transitorio; se registra la fecha del mes siguiente y en Observaciones: Aviso de entrada.</w:t>
+              <w:t xml:space="preserve">AFILIACIÓN AL IESS: Verificar la planilla de pago del IESS del mes inmediatamente anterior. La planilla es válida si su fecha es igual o posterior al primer día del mes anterior a la fecha actual. Para trabajadores nuevos con aviso de entrada, se acepta dicho aviso como habilitante de ingreso transitorio; el área de Seguridad registra en el consolidado la fecha del aviso y en Observaciones indica 'Aviso de entrada'.</w:t>
             </w:r>
           </w:p>
         </w:tc>
@@ -1812,7 +2186,7 @@
                 <w:sz w:val="19"/>
                 <w:szCs w:val="19"/>
               </w:rPr>
-              <w:t xml:space="preserve">CERTIFICADO MÉDICO LABORAL: El Médico de Planta revisa el certificado médico ocupacional presentado, emite criterio de aptitud (APTO / NO APTO / APTO CON RESTRICCIONES) y define la vigencia. Sin esta validación el trabajador no está habilitado.</w:t>
+              <w:t xml:space="preserve">CERTIFICADO MÉDICO LABORAL: El Médico de Planta revisa el certificado médico ocupacional presentado por el contratista, emite criterio de aptitud (APTO / NO APTO / APTO CON RESTRICCIONES) y define la vigencia del documento. Sin la validación del médico de planta, el trabajador no está habilitado para ingresar.</w:t>
             </w:r>
           </w:p>
         </w:tc>
@@ -1840,7 +2214,8 @@
                 <w:sz w:val="19"/>
                 <w:szCs w:val="19"/>
               </w:rPr>
-              <w:t xml:space="preserve">Médico de Planta</w:t>
+              <w:t xml:space="preserve">Médico de Planta
+Técnico(a) E&amp;S</w:t>
             </w:r>
           </w:p>
         </w:tc>
@@ -1899,7 +2274,7 @@
                 <w:sz w:val="19"/>
                 <w:szCs w:val="19"/>
               </w:rPr>
-              <w:t xml:space="preserve">CERTIFICADOS DE TRABAJOS DE ALTO RIESGO: Si el trabajo incluye actividades de alto riesgo, verificar que el trabajador cuente con el certificado específico emitido por entidad reconocida (MDT o SENESCYT). Ver Sección 5.3.</w:t>
+              <w:t xml:space="preserve">CERTIFICADOS DE TRABAJOS DE ALTO RIESGO: Si el trabajo a ejecutar incluye actividades de alto riesgo, verificar que el trabajador cuente con el certificado específico emitido por entidad reconocida (MDT o SENESCYT). Ver tabla de la Sección 5.3.</w:t>
             </w:r>
           </w:p>
         </w:tc>
@@ -1949,6 +2324,7 @@
             <w:pPr>
               <w:spacing w:after="80" w:before="80"/>
               <w:ind w:left="144"/>
+              <w:jc w:val="left"/>
             </w:pPr>
             <w:r>
               <w:rPr>
@@ -1974,6 +2350,93 @@
               <w:bottom w:val="single" w:color="BFBFBF" w:sz="4"/>
               <w:right w:val="single" w:color="BFBFBF" w:sz="4"/>
             </w:tcBorders>
+            <w:shd w:fill="EBF5FB" w:val="clear"/>
+            <w:vAlign w:val="center"/>
+          </w:tcPr>
+          <w:p>
+            <w:pPr>
+              <w:spacing w:after="60" w:before="60"/>
+              <w:jc w:val="center"/>
+            </w:pPr>
+            <w:r>
+              <w:rPr>
+                <w:rFonts w:ascii="Arial" w:cs="Arial" w:eastAsia="Arial" w:hAnsi="Arial"/>
+                <w:b/>
+                <w:bCs/>
+                <w:color w:val="1A3A6B"/>
+                <w:sz w:val="19"/>
+                <w:szCs w:val="19"/>
+              </w:rPr>
+              <w:t xml:space="preserve">3.1</w:t>
+            </w:r>
+          </w:p>
+        </w:tc>
+        <w:tc>
+          <w:tcPr>
+            <w:tcW w:type="dxa" w:w="6500"/>
+            <w:tcBorders>
+              <w:top w:val="single" w:color="BFBFBF" w:sz="4"/>
+              <w:left w:val="single" w:color="BFBFBF" w:sz="4"/>
+              <w:bottom w:val="single" w:color="BFBFBF" w:sz="4"/>
+              <w:right w:val="single" w:color="BFBFBF" w:sz="4"/>
+            </w:tcBorders>
+            <w:shd w:fill="EBF5FB" w:val="clear"/>
+          </w:tcPr>
+          <w:p>
+            <w:pPr>
+              <w:spacing w:after="60" w:before="60"/>
+              <w:ind w:left="115"/>
+            </w:pPr>
+            <w:r>
+              <w:rPr>
+                <w:rFonts w:ascii="Arial" w:cs="Arial" w:eastAsia="Arial" w:hAnsi="Arial"/>
+                <w:color w:val="000000"/>
+                <w:sz w:val="19"/>
+                <w:szCs w:val="19"/>
+              </w:rPr>
+              <w:t xml:space="preserve">Si toda la documentación está completa y vigente, el área de Seguridad completa el formulario GE-SO-R34 (Autorización de Ingreso Proveedores / Contratistas) y lo entrega al contratista. Este documento es el habilitante de ingreso a planta.</w:t>
+            </w:r>
+          </w:p>
+        </w:tc>
+        <w:tc>
+          <w:tcPr>
+            <w:tcW w:type="dxa" w:w="2360"/>
+            <w:tcBorders>
+              <w:top w:val="single" w:color="BFBFBF" w:sz="4"/>
+              <w:left w:val="single" w:color="BFBFBF" w:sz="4"/>
+              <w:bottom w:val="single" w:color="BFBFBF" w:sz="4"/>
+              <w:right w:val="single" w:color="BFBFBF" w:sz="4"/>
+            </w:tcBorders>
+            <w:shd w:fill="EBF5FB" w:val="clear"/>
+            <w:vAlign w:val="center"/>
+          </w:tcPr>
+          <w:p>
+            <w:pPr>
+              <w:spacing w:after="60" w:before="60"/>
+              <w:jc w:val="center"/>
+            </w:pPr>
+            <w:r>
+              <w:rPr>
+                <w:rFonts w:ascii="Arial" w:cs="Arial" w:eastAsia="Arial" w:hAnsi="Arial"/>
+                <w:color w:val="000000"/>
+                <w:sz w:val="19"/>
+                <w:szCs w:val="19"/>
+              </w:rPr>
+              <w:t xml:space="preserve">Técnico(a) E&amp;S</w:t>
+            </w:r>
+          </w:p>
+        </w:tc>
+      </w:tr>
+      <w:tr>
+        <w:tc>
+          <w:tcPr>
+            <w:tcW w:type="dxa" w:w="500"/>
+            <w:tcBorders>
+              <w:top w:val="single" w:color="BFBFBF" w:sz="4"/>
+              <w:left w:val="single" w:color="BFBFBF" w:sz="4"/>
+              <w:bottom w:val="single" w:color="BFBFBF" w:sz="4"/>
+              <w:right w:val="single" w:color="BFBFBF" w:sz="4"/>
+            </w:tcBorders>
             <w:shd w:fill="FFFFFF" w:val="clear"/>
             <w:vAlign w:val="center"/>
           </w:tcPr>
@@ -1991,7 +2454,7 @@
                 <w:sz w:val="19"/>
                 <w:szCs w:val="19"/>
               </w:rPr>
-              <w:t xml:space="preserve">3.1</w:t>
+              <w:t xml:space="preserve">3.2</w:t>
             </w:r>
           </w:p>
         </w:tc>
@@ -2018,7 +2481,7 @@
                 <w:sz w:val="19"/>
                 <w:szCs w:val="19"/>
               </w:rPr>
-              <w:t xml:space="preserve">Si toda la documentación está completa y vigente, Seguridad completa el formulario GE-SO-R34 (Autorización de Ingreso Proveedores / Contratistas) y lo entrega al contratista. Este es el habilitante de ingreso a planta.</w:t>
+              <w:t xml:space="preserve">El guardia de seguridad / portería verifica la autorización GE-SO-R34 al momento del ingreso. Sin este documento no se permite el acceso.</w:t>
             </w:r>
           </w:p>
         </w:tc>
@@ -2046,7 +2509,7 @@
                 <w:sz w:val="19"/>
                 <w:szCs w:val="19"/>
               </w:rPr>
-              <w:t xml:space="preserve">Técnico(a) E&amp;S</w:t>
+              <w:t xml:space="preserve">Guardia / Portería</w:t>
             </w:r>
           </w:p>
         </w:tc>
@@ -2078,7 +2541,7 @@
                 <w:sz w:val="19"/>
                 <w:szCs w:val="19"/>
               </w:rPr>
-              <w:t xml:space="preserve">3.2</w:t>
+              <w:t xml:space="preserve">3.3</w:t>
             </w:r>
           </w:p>
         </w:tc>
@@ -2105,7 +2568,7 @@
                 <w:sz w:val="19"/>
                 <w:szCs w:val="19"/>
               </w:rPr>
-              <w:t xml:space="preserve">El guardia de seguridad / portería verifica la autorización GE-SO-R34 al momento del ingreso. Sin este documento no se permite el acceso.</w:t>
+              <w:t xml:space="preserve">El área de Seguridad registra al personal en el Consolidado de Contratistas (GE-SO-R__) actualizando toda la información documental.</w:t>
             </w:r>
           </w:p>
         </w:tc>
@@ -2119,93 +2582,6 @@
               <w:right w:val="single" w:color="BFBFBF" w:sz="4"/>
             </w:tcBorders>
             <w:shd w:fill="EBF5FB" w:val="clear"/>
-            <w:vAlign w:val="center"/>
-          </w:tcPr>
-          <w:p>
-            <w:pPr>
-              <w:spacing w:after="60" w:before="60"/>
-              <w:jc w:val="center"/>
-            </w:pPr>
-            <w:r>
-              <w:rPr>
-                <w:rFonts w:ascii="Arial" w:cs="Arial" w:eastAsia="Arial" w:hAnsi="Arial"/>
-                <w:color w:val="000000"/>
-                <w:sz w:val="19"/>
-                <w:szCs w:val="19"/>
-              </w:rPr>
-              <w:t xml:space="preserve">Guardia / Portería</w:t>
-            </w:r>
-          </w:p>
-        </w:tc>
-      </w:tr>
-      <w:tr>
-        <w:tc>
-          <w:tcPr>
-            <w:tcW w:type="dxa" w:w="500"/>
-            <w:tcBorders>
-              <w:top w:val="single" w:color="BFBFBF" w:sz="4"/>
-              <w:left w:val="single" w:color="BFBFBF" w:sz="4"/>
-              <w:bottom w:val="single" w:color="BFBFBF" w:sz="4"/>
-              <w:right w:val="single" w:color="BFBFBF" w:sz="4"/>
-            </w:tcBorders>
-            <w:shd w:fill="FFFFFF" w:val="clear"/>
-            <w:vAlign w:val="center"/>
-          </w:tcPr>
-          <w:p>
-            <w:pPr>
-              <w:spacing w:after="60" w:before="60"/>
-              <w:jc w:val="center"/>
-            </w:pPr>
-            <w:r>
-              <w:rPr>
-                <w:rFonts w:ascii="Arial" w:cs="Arial" w:eastAsia="Arial" w:hAnsi="Arial"/>
-                <w:b/>
-                <w:bCs/>
-                <w:color w:val="1A3A6B"/>
-                <w:sz w:val="19"/>
-                <w:szCs w:val="19"/>
-              </w:rPr>
-              <w:t xml:space="preserve">3.3</w:t>
-            </w:r>
-          </w:p>
-        </w:tc>
-        <w:tc>
-          <w:tcPr>
-            <w:tcW w:type="dxa" w:w="6500"/>
-            <w:tcBorders>
-              <w:top w:val="single" w:color="BFBFBF" w:sz="4"/>
-              <w:left w:val="single" w:color="BFBFBF" w:sz="4"/>
-              <w:bottom w:val="single" w:color="BFBFBF" w:sz="4"/>
-              <w:right w:val="single" w:color="BFBFBF" w:sz="4"/>
-            </w:tcBorders>
-            <w:shd w:fill="FFFFFF" w:val="clear"/>
-          </w:tcPr>
-          <w:p>
-            <w:pPr>
-              <w:spacing w:after="60" w:before="60"/>
-              <w:ind w:left="115"/>
-            </w:pPr>
-            <w:r>
-              <w:rPr>
-                <w:rFonts w:ascii="Arial" w:cs="Arial" w:eastAsia="Arial" w:hAnsi="Arial"/>
-                <w:color w:val="000000"/>
-                <w:sz w:val="19"/>
-                <w:szCs w:val="19"/>
-              </w:rPr>
-              <w:t xml:space="preserve">El área de Seguridad registra al personal en el Consolidado de Contratistas actualizando toda la información documental.</w:t>
-            </w:r>
-          </w:p>
-        </w:tc>
-        <w:tc>
-          <w:tcPr>
-            <w:tcW w:type="dxa" w:w="2360"/>
-            <w:tcBorders>
-              <w:top w:val="single" w:color="BFBFBF" w:sz="4"/>
-              <w:left w:val="single" w:color="BFBFBF" w:sz="4"/>
-              <w:bottom w:val="single" w:color="BFBFBF" w:sz="4"/>
-              <w:right w:val="single" w:color="BFBFBF" w:sz="4"/>
-            </w:tcBorders>
-            <w:shd w:fill="FFFFFF" w:val="clear"/>
             <w:vAlign w:val="center"/>
           </w:tcPr>
           <w:p>
@@ -2242,6 +2618,7 @@
             <w:pPr>
               <w:spacing w:after="80" w:before="80"/>
               <w:ind w:left="144"/>
+              <w:jc w:val="left"/>
             </w:pPr>
             <w:r>
               <w:rPr>
@@ -2311,7 +2688,7 @@
                 <w:sz w:val="19"/>
                 <w:szCs w:val="19"/>
               </w:rPr>
-              <w:t xml:space="preserve">Revisar mensualmente el Consolidado de Contratistas para identificar documentos próximos a vencer (alerta a partir de 30 días antes). Notificar a la empresa contratista para su renovación.</w:t>
+              <w:t xml:space="preserve">El área de Seguridad revisa mensualmente el Consolidado de Contratistas para identificar documentos próximos a vencer (alerta a partir de 30 días antes). Notifica a la empresa contratista para su renovación.</w:t>
             </w:r>
           </w:p>
         </w:tc>
@@ -2398,7 +2775,7 @@
                 <w:sz w:val="19"/>
                 <w:szCs w:val="19"/>
               </w:rPr>
-              <w:t xml:space="preserve">Si durante la ejecución del trabajo algún documento vence sin renovación, suspender el acceso del trabajador hasta regularizar la documentación.</w:t>
+              <w:t xml:space="preserve">Si durante la ejecución del trabajo algún documento vence y no es renovado a tiempo, el área de Seguridad suspende el acceso del trabajador hasta regularizar la documentación.</w:t>
             </w:r>
           </w:p>
         </w:tc>
@@ -2476,7 +2853,7 @@
           <w:sz w:val="20"/>
           <w:szCs w:val="20"/>
         </w:rPr>
-        <w:t xml:space="preserve">Todo trabajador contratista debe presentar los siguientes documentos vigentes como condicion previa e irrenunciable para obtener autorizacion de ingreso:</w:t>
+        <w:t xml:space="preserve">Todo trabajador contratista debe presentar los siguientes documentos vigentes como condición previa e irrenunciable para obtener autorización de ingreso:</w:t>
       </w:r>
     </w:p>
     <w:tbl>
@@ -2683,7 +3060,6 @@
               <w:right w:val="single" w:color="BFBFBF" w:sz="4"/>
             </w:tcBorders>
             <w:shd w:fill="EBF5FB" w:val="clear"/>
-            <w:vAlign w:val="center"/>
           </w:tcPr>
           <w:p>
             <w:pPr>
@@ -2799,7 +3175,6 @@
               <w:right w:val="single" w:color="BFBFBF" w:sz="4"/>
             </w:tcBorders>
             <w:shd w:fill="FFFFFF" w:val="clear"/>
-            <w:vAlign w:val="center"/>
           </w:tcPr>
           <w:p>
             <w:pPr>
@@ -2842,7 +3217,7 @@
                 <w:sz w:val="18"/>
                 <w:szCs w:val="18"/>
               </w:rPr>
-              <w:t xml:space="preserve">Se acepta aviso de entrada para trabajadores nuevos. Registrar en Observaciones: Aviso de entrada.</w:t>
+              <w:t xml:space="preserve">Se acepta aviso de entrada para trabajadores nuevos. El área de Seguridad registra en Observaciones: 'Aviso de entrada'.</w:t>
             </w:r>
           </w:p>
         </w:tc>
@@ -2915,7 +3290,6 @@
               <w:right w:val="single" w:color="BFBFBF" w:sz="4"/>
             </w:tcBorders>
             <w:shd w:fill="EBF5FB" w:val="clear"/>
-            <w:vAlign w:val="center"/>
           </w:tcPr>
           <w:p>
             <w:pPr>
@@ -2989,7 +3363,7 @@
           <w:sz w:val="20"/>
           <w:szCs w:val="20"/>
         </w:rPr>
-        <w:t xml:space="preserve">Nota: Los tres requisitos son acumulativos. El incumplimiento de cualquiera de ellos impide el acceso a planta sin excepcion.</w:t>
+        <w:t xml:space="preserve">Nota: Los tres requisitos anteriores son acumulativos. El incumplimiento de cualquiera de ellos impide el acceso a planta sin excepción.</w:t>
       </w:r>
     </w:p>
     <w:p>
@@ -3036,7 +3410,7 @@
           <w:sz w:val="20"/>
           <w:szCs w:val="20"/>
         </w:rPr>
-        <w:t xml:space="preserve">Cuando el trabajo a ejecutar incluya alguna de las actividades de alto riesgo listadas a continuacion, el trabajador debe presentar el certificado especifico de prevencion de riesgos laborales emitido por entidad reconocida por el MDT o SENESCYT:</w:t>
+        <w:t xml:space="preserve">Adicionalmente a los requisitos de la Sección 5.2, cuando el trabajo a ejecutar incluya alguna de las actividades de alto riesgo listadas a continuación, el trabajador debe presentar el certificado específico de prevención de riesgos laborales, emitido por entidad reconocida por el MDT o SENESCYT:</w:t>
       </w:r>
     </w:p>
     <w:tbl>
@@ -3111,7 +3485,7 @@
                 <w:sz w:val="19"/>
                 <w:szCs w:val="19"/>
               </w:rPr>
-              <w:t xml:space="preserve">EJEMPLOS / DESCRIPCION</w:t>
+              <w:t xml:space="preserve">EJEMPLOS / DESCRIPCIÓN</w:t>
             </w:r>
           </w:p>
         </w:tc>
@@ -3140,7 +3514,7 @@
                 <w:sz w:val="19"/>
                 <w:szCs w:val="19"/>
               </w:rPr>
-              <w:t xml:space="preserve">ENTIDAD VALIDA</w:t>
+              <w:t xml:space="preserve">ENTIDAD VÁLIDA</w:t>
             </w:r>
           </w:p>
         </w:tc>
@@ -3370,7 +3744,7 @@
                 <w:sz w:val="19"/>
                 <w:szCs w:val="19"/>
               </w:rPr>
-              <w:t xml:space="preserve">Cisternas, tolvas, tanques, fosas u otros recintos de acceso restringido.</w:t>
+              <w:t xml:space="preserve">Ingreso a cisternas, tolvas, tanques, fosas u otros recintos de acceso restringido.</w:t>
             </w:r>
           </w:p>
         </w:tc>
@@ -3429,7 +3803,7 @@
                 <w:sz w:val="19"/>
                 <w:szCs w:val="19"/>
               </w:rPr>
-              <w:t xml:space="preserve">Trabajos Electricos</w:t>
+              <w:t xml:space="preserve">Trabajos Eléctricos</w:t>
             </w:r>
           </w:p>
         </w:tc>
@@ -3456,7 +3830,7 @@
                 <w:sz w:val="19"/>
                 <w:szCs w:val="19"/>
               </w:rPr>
-              <w:t xml:space="preserve">Media y alta tension; instalaciones, mantenimiento y reparaciones electricas.</w:t>
+              <w:t xml:space="preserve">Media y alta tensión; instalaciones, mantenimiento y reparaciones eléctricas.</w:t>
             </w:r>
           </w:p>
         </w:tc>
@@ -3542,7 +3916,7 @@
                 <w:sz w:val="19"/>
                 <w:szCs w:val="19"/>
               </w:rPr>
-              <w:t xml:space="preserve">Operacion de gruas, montacargas, eslingas y equipos de elevacion de carga.</w:t>
+              <w:t xml:space="preserve">Operación de grúas, montacargas, eslingas y equipos de elevación de carga.</w:t>
             </w:r>
           </w:p>
         </w:tc>
@@ -3687,7 +4061,7 @@
           <w:sz w:val="20"/>
           <w:szCs w:val="20"/>
         </w:rPr>
-        <w:t xml:space="preserve">Los certificados de trabajos de alto riesgo son habilitantes especificos para la tarea, no requisitos universales de ingreso a planta.</w:t>
+        <w:t xml:space="preserve">Los certificados de trabajos de alto riesgo no son requisito universal de ingreso, sino habilitantes específicos para la tarea. Un contratista sin certificado de espacios confinados puede ingresar a planta si no realizará ese tipo de trabajo, pero no podrá ejecutarlo sin la habilitación correspondiente.</w:t>
       </w:r>
     </w:p>
     <w:p>
@@ -3718,7 +4092,7 @@
           <w:sz w:val="21"/>
           <w:szCs w:val="21"/>
         </w:rPr>
-        <w:t xml:space="preserve">5.4  Suspension de acceso</w:t>
+        <w:t xml:space="preserve">5.4  Suspensión de acceso</w:t>
       </w:r>
     </w:p>
     <w:p>
@@ -3734,7 +4108,7 @@
           <w:sz w:val="20"/>
           <w:szCs w:val="20"/>
         </w:rPr>
-        <w:t xml:space="preserve">El acceso de un contratista sera suspendido en los siguientes casos:</w:t>
+        <w:t xml:space="preserve">El acceso de un contratista será suspendido en los siguientes casos:</w:t>
       </w:r>
     </w:p>
     <w:p>
@@ -3753,7 +4127,7 @@
           <w:sz w:val="20"/>
           <w:szCs w:val="20"/>
         </w:rPr>
-        <w:t xml:space="preserve">Vencimiento de la Induccion de Seguridad sin renovacion.</w:t>
+        <w:t xml:space="preserve">Vencimiento de la Inducción de Seguridad sin renovación.</w:t>
       </w:r>
     </w:p>
     <w:p>
@@ -3772,7 +4146,7 @@
           <w:sz w:val="20"/>
           <w:szCs w:val="20"/>
         </w:rPr>
-        <w:t xml:space="preserve">Falta de planilla del IESS del mes anterior (sin aviso de entrada valido).</w:t>
+        <w:t xml:space="preserve">Falta de planilla del IESS del mes anterior (sin aviso de entrada válido).</w:t>
       </w:r>
     </w:p>
     <w:p>
@@ -3791,7 +4165,7 @@
           <w:sz w:val="20"/>
           <w:szCs w:val="20"/>
         </w:rPr>
-        <w:t xml:space="preserve">Vencimiento o invalidacion del Certificado Medico Laboral.</w:t>
+        <w:t xml:space="preserve">Vencimiento o invalidación del Certificado Médico Laboral.</w:t>
       </w:r>
     </w:p>
     <w:p>
@@ -3829,7 +4203,7 @@
           <w:sz w:val="20"/>
           <w:szCs w:val="20"/>
         </w:rPr>
-        <w:t xml:space="preserve">Incumplimiento de las normas de seguridad de Plantabal durante la ejecucion de trabajos.</w:t>
+        <w:t xml:space="preserve">Incumplimiento de las normas de seguridad de Plantabal durante la ejecución de trabajos.</w:t>
       </w:r>
     </w:p>
     <w:p>
@@ -3849,6 +4223,7 @@
         <w:shd w:fill="2E6DB4" w:val="clear"/>
         <w:spacing w:after="0" w:before="0"/>
         <w:ind w:left="144"/>
+        <w:jc w:val="left"/>
       </w:pPr>
       <w:r>
         <w:rPr>
@@ -3916,7 +4291,7 @@
                 <w:sz w:val="19"/>
                 <w:szCs w:val="19"/>
               </w:rPr>
-              <w:t xml:space="preserve">CODIGO</w:t>
+              <w:t xml:space="preserve">CÓDIGO</w:t>
             </w:r>
           </w:p>
         </w:tc>
@@ -4003,7 +4378,7 @@
                 <w:sz w:val="19"/>
                 <w:szCs w:val="19"/>
               </w:rPr>
-              <w:t xml:space="preserve">Autorizacion de Ingreso Proveedores / Contratistas (Rev. 5)</w:t>
+              <w:t xml:space="preserve">Autorización de Ingreso Proveedores / Contratistas (Rev. 5)</w:t>
             </w:r>
           </w:p>
         </w:tc>
@@ -4026,6 +4401,7 @@
         <w:shd w:fill="2E6DB4" w:val="clear"/>
         <w:spacing w:after="0" w:before="0"/>
         <w:ind w:left="144"/>
+        <w:jc w:val="left"/>
       </w:pPr>
       <w:r>
         <w:rPr>
@@ -4039,6 +4415,261 @@
         <w:t xml:space="preserve">7.  CONTROL DE VERSIONES</w:t>
       </w:r>
     </w:p>
+    <w:p>
+      <w:pPr>
+        <w:spacing w:after="24" w:before="0"/>
+      </w:pPr>
+      <w:r>
+        <w:rPr>
+          <w:sz w:val="20"/>
+          <w:szCs w:val="20"/>
+        </w:rPr>
+        <w:t xml:space="preserve"/>
+      </w:r>
+    </w:p>
+    <w:tbl>
+      <w:tblPr>
+        <w:tblW w:type="dxa" w:w="9360"/>
+        <w:tblBorders>
+          <w:top w:val="single" w:color="auto" w:sz="4"/>
+          <w:left w:val="single" w:color="auto" w:sz="4"/>
+          <w:bottom w:val="single" w:color="auto" w:sz="4"/>
+          <w:right w:val="single" w:color="auto" w:sz="4"/>
+          <w:insideH w:val="single" w:color="auto" w:sz="4"/>
+          <w:insideV w:val="single" w:color="auto" w:sz="4"/>
+        </w:tblBorders>
+      </w:tblPr>
+      <w:tblGrid>
+        <w:gridCol w:w="1400"/>
+        <w:gridCol w:w="1400"/>
+        <w:gridCol w:w="3400"/>
+        <w:gridCol w:w="3160"/>
+      </w:tblGrid>
+      <w:tr>
+        <w:tc>
+          <w:tcPr>
+            <w:tcW w:type="dxa" w:w="1400"/>
+            <w:tcBorders>
+              <w:top w:val="single" w:color="2E6DB4" w:sz="8"/>
+              <w:left w:val="single" w:color="2E6DB4" w:sz="8"/>
+              <w:bottom w:val="single" w:color="2E6DB4" w:sz="8"/>
+              <w:right w:val="single" w:color="2E6DB4" w:sz="8"/>
+            </w:tcBorders>
+            <w:shd w:fill="2E6DB4" w:val="clear"/>
+          </w:tcPr>
+          <w:p>
+            <w:pPr>
+              <w:spacing w:after="80" w:before="80"/>
+              <w:jc w:val="center"/>
+            </w:pPr>
+            <w:r>
+              <w:rPr>
+                <w:rFonts w:ascii="Arial" w:cs="Arial" w:eastAsia="Arial" w:hAnsi="Arial"/>
+                <w:b/>
+                <w:bCs/>
+                <w:color w:val="FFFFFF"/>
+                <w:sz w:val="19"/>
+                <w:szCs w:val="19"/>
+              </w:rPr>
+              <w:t xml:space="preserve">VERSIÓN</w:t>
+            </w:r>
+          </w:p>
+        </w:tc>
+        <w:tc>
+          <w:tcPr>
+            <w:tcW w:type="dxa" w:w="1400"/>
+            <w:tcBorders>
+              <w:top w:val="single" w:color="2E6DB4" w:sz="8"/>
+              <w:left w:val="single" w:color="2E6DB4" w:sz="8"/>
+              <w:bottom w:val="single" w:color="2E6DB4" w:sz="8"/>
+              <w:right w:val="single" w:color="2E6DB4" w:sz="8"/>
+            </w:tcBorders>
+            <w:shd w:fill="2E6DB4" w:val="clear"/>
+          </w:tcPr>
+          <w:p>
+            <w:pPr>
+              <w:spacing w:after="80" w:before="80"/>
+              <w:jc w:val="center"/>
+            </w:pPr>
+            <w:r>
+              <w:rPr>
+                <w:rFonts w:ascii="Arial" w:cs="Arial" w:eastAsia="Arial" w:hAnsi="Arial"/>
+                <w:b/>
+                <w:bCs/>
+                <w:color w:val="FFFFFF"/>
+                <w:sz w:val="19"/>
+                <w:szCs w:val="19"/>
+              </w:rPr>
+              <w:t xml:space="preserve">FECHA</w:t>
+            </w:r>
+          </w:p>
+        </w:tc>
+        <w:tc>
+          <w:tcPr>
+            <w:tcW w:type="dxa" w:w="3400"/>
+            <w:tcBorders>
+              <w:top w:val="single" w:color="2E6DB4" w:sz="8"/>
+              <w:left w:val="single" w:color="2E6DB4" w:sz="8"/>
+              <w:bottom w:val="single" w:color="2E6DB4" w:sz="8"/>
+              <w:right w:val="single" w:color="2E6DB4" w:sz="8"/>
+            </w:tcBorders>
+            <w:shd w:fill="2E6DB4" w:val="clear"/>
+          </w:tcPr>
+          <w:p>
+            <w:pPr>
+              <w:spacing w:after="80" w:before="80"/>
+              <w:ind w:left="115"/>
+            </w:pPr>
+            <w:r>
+              <w:rPr>
+                <w:rFonts w:ascii="Arial" w:cs="Arial" w:eastAsia="Arial" w:hAnsi="Arial"/>
+                <w:b/>
+                <w:bCs/>
+                <w:color w:val="FFFFFF"/>
+                <w:sz w:val="19"/>
+                <w:szCs w:val="19"/>
+              </w:rPr>
+              <w:t xml:space="preserve">DESCRIPCIÓN DEL CAMBIO</w:t>
+            </w:r>
+          </w:p>
+        </w:tc>
+        <w:tc>
+          <w:tcPr>
+            <w:tcW w:type="dxa" w:w="3160"/>
+            <w:tcBorders>
+              <w:top w:val="single" w:color="2E6DB4" w:sz="8"/>
+              <w:left w:val="single" w:color="2E6DB4" w:sz="8"/>
+              <w:bottom w:val="single" w:color="2E6DB4" w:sz="8"/>
+              <w:right w:val="single" w:color="2E6DB4" w:sz="8"/>
+            </w:tcBorders>
+            <w:shd w:fill="2E6DB4" w:val="clear"/>
+          </w:tcPr>
+          <w:p>
+            <w:pPr>
+              <w:spacing w:after="80" w:before="80"/>
+              <w:ind w:left="115"/>
+            </w:pPr>
+            <w:r>
+              <w:rPr>
+                <w:rFonts w:ascii="Arial" w:cs="Arial" w:eastAsia="Arial" w:hAnsi="Arial"/>
+                <w:b/>
+                <w:bCs/>
+                <w:color w:val="FFFFFF"/>
+                <w:sz w:val="19"/>
+                <w:szCs w:val="19"/>
+              </w:rPr>
+              <w:t xml:space="preserve">ELABORADO / APROBADO</w:t>
+            </w:r>
+          </w:p>
+        </w:tc>
+      </w:tr>
+      <w:tr>
+        <w:tc>
+          <w:tcPr>
+            <w:tcW w:type="dxa" w:w="1400"/>
+            <w:tcBorders>
+              <w:top w:val="single" w:color="BFBFBF" w:sz="4"/>
+              <w:left w:val="single" w:color="BFBFBF" w:sz="4"/>
+              <w:bottom w:val="single" w:color="BFBFBF" w:sz="4"/>
+              <w:right w:val="single" w:color="BFBFBF" w:sz="4"/>
+            </w:tcBorders>
+          </w:tcPr>
+          <w:p>
+            <w:pPr>
+              <w:spacing w:after="60" w:before="60"/>
+              <w:jc w:val="center"/>
+            </w:pPr>
+            <w:r>
+              <w:rPr>
+                <w:rFonts w:ascii="Arial" w:cs="Arial" w:eastAsia="Arial" w:hAnsi="Arial"/>
+                <w:color w:val="000000"/>
+                <w:sz w:val="19"/>
+                <w:szCs w:val="19"/>
+              </w:rPr>
+              <w:t xml:space="preserve">01</w:t>
+            </w:r>
+          </w:p>
+        </w:tc>
+        <w:tc>
+          <w:tcPr>
+            <w:tcW w:type="dxa" w:w="1400"/>
+            <w:tcBorders>
+              <w:top w:val="single" w:color="BFBFBF" w:sz="4"/>
+              <w:left w:val="single" w:color="BFBFBF" w:sz="4"/>
+              <w:bottom w:val="single" w:color="BFBFBF" w:sz="4"/>
+              <w:right w:val="single" w:color="BFBFBF" w:sz="4"/>
+            </w:tcBorders>
+          </w:tcPr>
+          <w:p>
+            <w:pPr>
+              <w:spacing w:after="60" w:before="60"/>
+              <w:jc w:val="center"/>
+            </w:pPr>
+            <w:r>
+              <w:rPr>
+                <w:rFonts w:ascii="Arial" w:cs="Arial" w:eastAsia="Arial" w:hAnsi="Arial"/>
+                <w:color w:val="000000"/>
+                <w:sz w:val="19"/>
+                <w:szCs w:val="19"/>
+              </w:rPr>
+              <w:t xml:space="preserve">31/10/2026</w:t>
+            </w:r>
+          </w:p>
+        </w:tc>
+        <w:tc>
+          <w:tcPr>
+            <w:tcW w:type="dxa" w:w="3400"/>
+            <w:tcBorders>
+              <w:top w:val="single" w:color="BFBFBF" w:sz="4"/>
+              <w:left w:val="single" w:color="BFBFBF" w:sz="4"/>
+              <w:bottom w:val="single" w:color="BFBFBF" w:sz="4"/>
+              <w:right w:val="single" w:color="BFBFBF" w:sz="4"/>
+            </w:tcBorders>
+          </w:tcPr>
+          <w:p>
+            <w:pPr>
+              <w:spacing w:after="60" w:before="60"/>
+              <w:ind w:left="115"/>
+            </w:pPr>
+            <w:r>
+              <w:rPr>
+                <w:rFonts w:ascii="Arial" w:cs="Arial" w:eastAsia="Arial" w:hAnsi="Arial"/>
+                <w:color w:val="000000"/>
+                <w:sz w:val="19"/>
+                <w:szCs w:val="19"/>
+              </w:rPr>
+              <w:t xml:space="preserve">Creación del documento.</w:t>
+            </w:r>
+          </w:p>
+        </w:tc>
+        <w:tc>
+          <w:tcPr>
+            <w:tcW w:type="dxa" w:w="3160"/>
+            <w:tcBorders>
+              <w:top w:val="single" w:color="BFBFBF" w:sz="4"/>
+              <w:left w:val="single" w:color="BFBFBF" w:sz="4"/>
+              <w:bottom w:val="single" w:color="BFBFBF" w:sz="4"/>
+              <w:right w:val="single" w:color="BFBFBF" w:sz="4"/>
+            </w:tcBorders>
+          </w:tcPr>
+          <w:p>
+            <w:pPr>
+              <w:spacing w:after="60" w:before="60"/>
+              <w:ind w:left="115"/>
+            </w:pPr>
+            <w:r>
+              <w:rPr>
+                <w:rFonts w:ascii="Arial" w:cs="Arial" w:eastAsia="Arial" w:hAnsi="Arial"/>
+                <w:color w:val="000000"/>
+                <w:sz w:val="19"/>
+                <w:szCs w:val="19"/>
+              </w:rPr>
+              <w:t xml:space="preserve">K. Martínez / Gerencia de Planta</w:t>
+            </w:r>
+          </w:p>
+        </w:tc>
+      </w:tr>
+    </w:tbl>
     <w:sectPr>
       <w:pgSz w:w="12240" w:h="15840" w:orient="portrait"/>
       <w:pgMar w:top="1296" w:right="1152" w:bottom="1152" w:left="1296" w:header="708" w:footer="708" w:gutter="0"/>

</xml_diff>

<commit_message>
fix: instructivo — 5.4 suspensión acceso (3 causales) y nueva 5.5 suspensión alto riesgo
Co-Authored-By: Claude Sonnet 4.6 <noreply@anthropic.com>
Claude-Session: https://claude.ai/code/session_01Mu84mNMmRhshwom6voaTeY
</commit_message>
<xml_diff>
--- a/GE-SO-IXXX_Instructivo_Ingreso_Contratistas_v01.docx
+++ b/GE-SO-IXXX_Instructivo_Ingreso_Contratistas_v01.docx
@@ -4108,7 +4108,7 @@
           <w:sz w:val="20"/>
           <w:szCs w:val="20"/>
         </w:rPr>
-        <w:t xml:space="preserve">El acceso de un contratista será suspendido en los siguientes casos:</w:t>
+        <w:t xml:space="preserve">El acceso de un contratista a las instalaciones de Plantabal S.A. será suspendido en los siguientes casos:</w:t>
       </w:r>
     </w:p>
     <w:p>
@@ -4170,6 +4170,53 @@
     </w:p>
     <w:p>
       <w:pPr>
+        <w:spacing w:after="24" w:before="0"/>
+      </w:pPr>
+      <w:r>
+        <w:rPr>
+          <w:sz w:val="20"/>
+          <w:szCs w:val="20"/>
+        </w:rPr>
+        <w:t xml:space="preserve"/>
+      </w:r>
+    </w:p>
+    <w:p>
+      <w:pPr>
+        <w:pBdr>
+          <w:bottom w:val="single" w:color="2E6DB4" w:sz="6"/>
+        </w:pBdr>
+        <w:spacing w:after="60" w:before="160"/>
+      </w:pPr>
+      <w:r>
+        <w:rPr>
+          <w:rFonts w:ascii="Arial" w:cs="Arial" w:eastAsia="Arial" w:hAnsi="Arial"/>
+          <w:b/>
+          <w:bCs/>
+          <w:color w:val="1A3A6B"/>
+          <w:sz w:val="21"/>
+          <w:szCs w:val="21"/>
+        </w:rPr>
+        <w:t xml:space="preserve">5.5  Suspensión de actividades de alto riesgo</w:t>
+      </w:r>
+    </w:p>
+    <w:p>
+      <w:pPr>
+        <w:spacing w:after="60" w:before="60"/>
+        <w:ind w:left="0"/>
+      </w:pPr>
+      <w:r>
+        <w:rPr>
+          <w:rFonts w:ascii="Arial" w:cs="Arial" w:eastAsia="Arial" w:hAnsi="Arial"/>
+          <w:b w:val="false"/>
+          <w:bCs w:val="false"/>
+          <w:sz w:val="20"/>
+          <w:szCs w:val="20"/>
+        </w:rPr>
+        <w:t xml:space="preserve">La ejecución de actividades de alto riesgo será suspendida cuando:</w:t>
+      </w:r>
+    </w:p>
+    <w:p>
+      <w:pPr>
         <w:pStyle w:val="ListParagraph"/>
         <w:numPr>
           <w:ilvl w:val="0"/>
@@ -4184,26 +4231,7 @@
           <w:sz w:val="20"/>
           <w:szCs w:val="20"/>
         </w:rPr>
-        <w:t xml:space="preserve">Vencimiento del certificado de trabajo de alto riesgo requerido para las actividades a ejecutar.</w:t>
-      </w:r>
-    </w:p>
-    <w:p>
-      <w:pPr>
-        <w:pStyle w:val="ListParagraph"/>
-        <w:numPr>
-          <w:ilvl w:val="0"/>
-          <w:numId w:val="1"/>
-        </w:numPr>
-        <w:spacing w:after="40" w:before="40"/>
-        <w:ind w:left="360" w:hanging="259"/>
-      </w:pPr>
-      <w:r>
-        <w:rPr>
-          <w:rFonts w:ascii="Arial" w:cs="Arial" w:eastAsia="Arial" w:hAnsi="Arial"/>
-          <w:sz w:val="20"/>
-          <w:szCs w:val="20"/>
-        </w:rPr>
-        <w:t xml:space="preserve">Incumplimiento de las normas de seguridad de Plantabal durante la ejecución de trabajos.</w:t>
+        <w:t xml:space="preserve">El trabajador no cuente con el certificado de prevención de riesgos laborales vigente y específico para la actividad que va a ejecutar.</w:t>
       </w:r>
     </w:p>
     <w:p>

</xml_diff>

<commit_message>
instructivo: add NOTIFICAR column and Obra Civil activity
- Added NOTIFICAR column to section 5.1 activities table (4 columns total)
- Added "Obra Civil" as new high-risk activity in section 5.3
- Sections 5.4 (suspensión de acceso) and 5.5 (suspensión actividades
  de alto riesgo) remain with corrected causal structure

Co-Authored-By: Claude Sonnet 4.6 <noreply@anthropic.com>
Claude-Session: https://claude.ai/code/session_01Mu84mNMmRhshwom6voaTeY
</commit_message>
<xml_diff>
--- a/GE-SO-IXXX_Instructivo_Ingreso_Contratistas_v01.docx
+++ b/GE-SO-IXXX_Instructivo_Ingreso_Contratistas_v01.docx
@@ -1538,8 +1538,9 @@
       </w:tblPr>
       <w:tblGrid>
         <w:gridCol w:w="500"/>
-        <w:gridCol w:w="6500"/>
-        <w:gridCol w:w="2360"/>
+        <w:gridCol w:w="5300"/>
+        <w:gridCol w:w="2160"/>
+        <w:gridCol w:w="1400"/>
       </w:tblGrid>
       <w:tr>
         <w:tc>
@@ -1573,7 +1574,7 @@
         </w:tc>
         <w:tc>
           <w:tcPr>
-            <w:tcW w:type="dxa" w:w="6500"/>
+            <w:tcW w:type="dxa" w:w="5300"/>
             <w:tcBorders>
               <w:top w:val="single" w:color="2E6DB4" w:sz="8"/>
               <w:left w:val="single" w:color="2E6DB4" w:sz="8"/>
@@ -1602,7 +1603,7 @@
         </w:tc>
         <w:tc>
           <w:tcPr>
-            <w:tcW w:type="dxa" w:w="2360"/>
+            <w:tcW w:type="dxa" w:w="2160"/>
             <w:tcBorders>
               <w:top w:val="single" w:color="2E6DB4" w:sz="8"/>
               <w:left w:val="single" w:color="2E6DB4" w:sz="8"/>
@@ -1629,12 +1630,41 @@
             </w:r>
           </w:p>
         </w:tc>
+        <w:tc>
+          <w:tcPr>
+            <w:tcW w:type="dxa" w:w="1400"/>
+            <w:tcBorders>
+              <w:top w:val="single" w:color="2E6DB4" w:sz="8"/>
+              <w:left w:val="single" w:color="2E6DB4" w:sz="8"/>
+              <w:bottom w:val="single" w:color="2E6DB4" w:sz="8"/>
+              <w:right w:val="single" w:color="2E6DB4" w:sz="8"/>
+            </w:tcBorders>
+            <w:shd w:fill="2E6DB4" w:val="clear"/>
+          </w:tcPr>
+          <w:p>
+            <w:pPr>
+              <w:spacing w:after="80" w:before="80"/>
+              <w:jc w:val="center"/>
+            </w:pPr>
+            <w:r>
+              <w:rPr>
+                <w:rFonts w:ascii="Arial" w:cs="Arial" w:eastAsia="Arial" w:hAnsi="Arial"/>
+                <w:b/>
+                <w:bCs/>
+                <w:color w:val="FFFFFF"/>
+                <w:sz w:val="19"/>
+                <w:szCs w:val="19"/>
+              </w:rPr>
+              <w:t xml:space="preserve">NOTIFICAR</w:t>
+            </w:r>
+          </w:p>
+        </w:tc>
       </w:tr>
       <w:tr>
         <w:tc>
           <w:tcPr>
             <w:tcW w:type="dxa" w:w="9360"/>
-            <w:gridSpan w:val="3"/>
+            <w:gridSpan w:val="4"/>
             <w:tcBorders>
               <w:top w:val="single" w:color="1A3A6B" w:sz="8"/>
               <w:left w:val="single" w:color="1A3A6B" w:sz="8"/>
@@ -1696,7 +1726,7 @@
         </w:tc>
         <w:tc>
           <w:tcPr>
-            <w:tcW w:type="dxa" w:w="6500"/>
+            <w:tcW w:type="dxa" w:w="5300"/>
             <w:tcBorders>
               <w:top w:val="single" w:color="BFBFBF" w:sz="4"/>
               <w:left w:val="single" w:color="BFBFBF" w:sz="4"/>
@@ -1723,7 +1753,7 @@
         </w:tc>
         <w:tc>
           <w:tcPr>
-            <w:tcW w:type="dxa" w:w="2360"/>
+            <w:tcW w:type="dxa" w:w="2160"/>
             <w:tcBorders>
               <w:top w:val="single" w:color="BFBFBF" w:sz="4"/>
               <w:left w:val="single" w:color="BFBFBF" w:sz="4"/>
@@ -1746,6 +1776,34 @@
                 <w:szCs w:val="19"/>
               </w:rPr>
               <w:t xml:space="preserve">Área Solicitante</w:t>
+            </w:r>
+          </w:p>
+        </w:tc>
+        <w:tc>
+          <w:tcPr>
+            <w:tcW w:type="dxa" w:w="1400"/>
+            <w:tcBorders>
+              <w:top w:val="single" w:color="BFBFBF" w:sz="4"/>
+              <w:left w:val="single" w:color="BFBFBF" w:sz="4"/>
+              <w:bottom w:val="single" w:color="BFBFBF" w:sz="4"/>
+              <w:right w:val="single" w:color="BFBFBF" w:sz="4"/>
+            </w:tcBorders>
+            <w:shd w:fill="EBF5FB" w:val="clear"/>
+            <w:vAlign w:val="center"/>
+          </w:tcPr>
+          <w:p>
+            <w:pPr>
+              <w:spacing w:after="60" w:before="60"/>
+              <w:jc w:val="center"/>
+            </w:pPr>
+            <w:r>
+              <w:rPr>
+                <w:rFonts w:ascii="Arial" w:cs="Arial" w:eastAsia="Arial" w:hAnsi="Arial"/>
+                <w:color w:val="000000"/>
+                <w:sz w:val="19"/>
+                <w:szCs w:val="19"/>
+              </w:rPr>
+              <w:t xml:space="preserve">Técnico(a) E&amp;S</w:t>
             </w:r>
           </w:p>
         </w:tc>
@@ -1783,7 +1841,7 @@
         </w:tc>
         <w:tc>
           <w:tcPr>
-            <w:tcW w:type="dxa" w:w="6500"/>
+            <w:tcW w:type="dxa" w:w="5300"/>
             <w:tcBorders>
               <w:top w:val="single" w:color="BFBFBF" w:sz="4"/>
               <w:left w:val="single" w:color="BFBFBF" w:sz="4"/>
@@ -1810,7 +1868,7 @@
         </w:tc>
         <w:tc>
           <w:tcPr>
-            <w:tcW w:type="dxa" w:w="2360"/>
+            <w:tcW w:type="dxa" w:w="2160"/>
             <w:tcBorders>
               <w:top w:val="single" w:color="BFBFBF" w:sz="4"/>
               <w:left w:val="single" w:color="BFBFBF" w:sz="4"/>
@@ -1836,12 +1894,40 @@
             </w:r>
           </w:p>
         </w:tc>
+        <w:tc>
+          <w:tcPr>
+            <w:tcW w:type="dxa" w:w="1400"/>
+            <w:tcBorders>
+              <w:top w:val="single" w:color="BFBFBF" w:sz="4"/>
+              <w:left w:val="single" w:color="BFBFBF" w:sz="4"/>
+              <w:bottom w:val="single" w:color="BFBFBF" w:sz="4"/>
+              <w:right w:val="single" w:color="BFBFBF" w:sz="4"/>
+            </w:tcBorders>
+            <w:shd w:fill="FFFFFF" w:val="clear"/>
+            <w:vAlign w:val="center"/>
+          </w:tcPr>
+          <w:p>
+            <w:pPr>
+              <w:spacing w:after="60" w:before="60"/>
+              <w:jc w:val="center"/>
+            </w:pPr>
+            <w:r>
+              <w:rPr>
+                <w:rFonts w:ascii="Arial" w:cs="Arial" w:eastAsia="Arial" w:hAnsi="Arial"/>
+                <w:color w:val="000000"/>
+                <w:sz w:val="19"/>
+                <w:szCs w:val="19"/>
+              </w:rPr>
+              <w:t xml:space="preserve">Empresa Contratista</w:t>
+            </w:r>
+          </w:p>
+        </w:tc>
       </w:tr>
       <w:tr>
         <w:tc>
           <w:tcPr>
             <w:tcW w:type="dxa" w:w="9360"/>
-            <w:gridSpan w:val="3"/>
+            <w:gridSpan w:val="4"/>
             <w:tcBorders>
               <w:top w:val="single" w:color="1A3A6B" w:sz="8"/>
               <w:left w:val="single" w:color="1A3A6B" w:sz="8"/>
@@ -1903,7 +1989,7 @@
         </w:tc>
         <w:tc>
           <w:tcPr>
-            <w:tcW w:type="dxa" w:w="6500"/>
+            <w:tcW w:type="dxa" w:w="5300"/>
             <w:tcBorders>
               <w:top w:val="single" w:color="BFBFBF" w:sz="4"/>
               <w:left w:val="single" w:color="BFBFBF" w:sz="4"/>
@@ -1930,7 +2016,7 @@
         </w:tc>
         <w:tc>
           <w:tcPr>
-            <w:tcW w:type="dxa" w:w="2360"/>
+            <w:tcW w:type="dxa" w:w="2160"/>
             <w:tcBorders>
               <w:top w:val="single" w:color="BFBFBF" w:sz="4"/>
               <w:left w:val="single" w:color="BFBFBF" w:sz="4"/>
@@ -1957,6 +2043,34 @@
             </w:r>
           </w:p>
         </w:tc>
+        <w:tc>
+          <w:tcPr>
+            <w:tcW w:type="dxa" w:w="1400"/>
+            <w:tcBorders>
+              <w:top w:val="single" w:color="BFBFBF" w:sz="4"/>
+              <w:left w:val="single" w:color="BFBFBF" w:sz="4"/>
+              <w:bottom w:val="single" w:color="BFBFBF" w:sz="4"/>
+              <w:right w:val="single" w:color="BFBFBF" w:sz="4"/>
+            </w:tcBorders>
+            <w:shd w:fill="EBF5FB" w:val="clear"/>
+            <w:vAlign w:val="center"/>
+          </w:tcPr>
+          <w:p>
+            <w:pPr>
+              <w:spacing w:after="60" w:before="60"/>
+              <w:jc w:val="center"/>
+            </w:pPr>
+            <w:r>
+              <w:rPr>
+                <w:rFonts w:ascii="Arial" w:cs="Arial" w:eastAsia="Arial" w:hAnsi="Arial"/>
+                <w:color w:val="000000"/>
+                <w:sz w:val="19"/>
+                <w:szCs w:val="19"/>
+              </w:rPr>
+              <w:t xml:space="preserve">—</w:t>
+            </w:r>
+          </w:p>
+        </w:tc>
       </w:tr>
       <w:tr>
         <w:tc>
@@ -1991,7 +2105,7 @@
         </w:tc>
         <w:tc>
           <w:tcPr>
-            <w:tcW w:type="dxa" w:w="6500"/>
+            <w:tcW w:type="dxa" w:w="5300"/>
             <w:tcBorders>
               <w:top w:val="single" w:color="BFBFBF" w:sz="4"/>
               <w:left w:val="single" w:color="BFBFBF" w:sz="4"/>
@@ -2018,7 +2132,7 @@
         </w:tc>
         <w:tc>
           <w:tcPr>
-            <w:tcW w:type="dxa" w:w="2360"/>
+            <w:tcW w:type="dxa" w:w="2160"/>
             <w:tcBorders>
               <w:top w:val="single" w:color="BFBFBF" w:sz="4"/>
               <w:left w:val="single" w:color="BFBFBF" w:sz="4"/>
@@ -2044,6 +2158,34 @@
             </w:r>
           </w:p>
         </w:tc>
+        <w:tc>
+          <w:tcPr>
+            <w:tcW w:type="dxa" w:w="1400"/>
+            <w:tcBorders>
+              <w:top w:val="single" w:color="BFBFBF" w:sz="4"/>
+              <w:left w:val="single" w:color="BFBFBF" w:sz="4"/>
+              <w:bottom w:val="single" w:color="BFBFBF" w:sz="4"/>
+              <w:right w:val="single" w:color="BFBFBF" w:sz="4"/>
+            </w:tcBorders>
+            <w:shd w:fill="FFFFFF" w:val="clear"/>
+            <w:vAlign w:val="center"/>
+          </w:tcPr>
+          <w:p>
+            <w:pPr>
+              <w:spacing w:after="60" w:before="60"/>
+              <w:jc w:val="center"/>
+            </w:pPr>
+            <w:r>
+              <w:rPr>
+                <w:rFonts w:ascii="Arial" w:cs="Arial" w:eastAsia="Arial" w:hAnsi="Arial"/>
+                <w:color w:val="000000"/>
+                <w:sz w:val="19"/>
+                <w:szCs w:val="19"/>
+              </w:rPr>
+              <w:t xml:space="preserve">—</w:t>
+            </w:r>
+          </w:p>
+        </w:tc>
       </w:tr>
       <w:tr>
         <w:tc>
@@ -2078,7 +2220,7 @@
         </w:tc>
         <w:tc>
           <w:tcPr>
-            <w:tcW w:type="dxa" w:w="6500"/>
+            <w:tcW w:type="dxa" w:w="5300"/>
             <w:tcBorders>
               <w:top w:val="single" w:color="BFBFBF" w:sz="4"/>
               <w:left w:val="single" w:color="BFBFBF" w:sz="4"/>
@@ -2105,7 +2247,7 @@
         </w:tc>
         <w:tc>
           <w:tcPr>
-            <w:tcW w:type="dxa" w:w="2360"/>
+            <w:tcW w:type="dxa" w:w="2160"/>
             <w:tcBorders>
               <w:top w:val="single" w:color="BFBFBF" w:sz="4"/>
               <w:left w:val="single" w:color="BFBFBF" w:sz="4"/>
@@ -2128,6 +2270,34 @@
                 <w:szCs w:val="19"/>
               </w:rPr>
               <w:t xml:space="preserve">Técnico(a) E&amp;S</w:t>
+            </w:r>
+          </w:p>
+        </w:tc>
+        <w:tc>
+          <w:tcPr>
+            <w:tcW w:type="dxa" w:w="1400"/>
+            <w:tcBorders>
+              <w:top w:val="single" w:color="BFBFBF" w:sz="4"/>
+              <w:left w:val="single" w:color="BFBFBF" w:sz="4"/>
+              <w:bottom w:val="single" w:color="BFBFBF" w:sz="4"/>
+              <w:right w:val="single" w:color="BFBFBF" w:sz="4"/>
+            </w:tcBorders>
+            <w:shd w:fill="EBF5FB" w:val="clear"/>
+            <w:vAlign w:val="center"/>
+          </w:tcPr>
+          <w:p>
+            <w:pPr>
+              <w:spacing w:after="60" w:before="60"/>
+              <w:jc w:val="center"/>
+            </w:pPr>
+            <w:r>
+              <w:rPr>
+                <w:rFonts w:ascii="Arial" w:cs="Arial" w:eastAsia="Arial" w:hAnsi="Arial"/>
+                <w:color w:val="000000"/>
+                <w:sz w:val="19"/>
+                <w:szCs w:val="19"/>
+              </w:rPr>
+              <w:t xml:space="preserve">—</w:t>
             </w:r>
           </w:p>
         </w:tc>
@@ -2165,7 +2335,7 @@
         </w:tc>
         <w:tc>
           <w:tcPr>
-            <w:tcW w:type="dxa" w:w="6500"/>
+            <w:tcW w:type="dxa" w:w="5300"/>
             <w:tcBorders>
               <w:top w:val="single" w:color="BFBFBF" w:sz="4"/>
               <w:left w:val="single" w:color="BFBFBF" w:sz="4"/>
@@ -2192,7 +2362,7 @@
         </w:tc>
         <w:tc>
           <w:tcPr>
-            <w:tcW w:type="dxa" w:w="2360"/>
+            <w:tcW w:type="dxa" w:w="2160"/>
             <w:tcBorders>
               <w:top w:val="single" w:color="BFBFBF" w:sz="4"/>
               <w:left w:val="single" w:color="BFBFBF" w:sz="4"/>
@@ -2219,6 +2389,34 @@
             </w:r>
           </w:p>
         </w:tc>
+        <w:tc>
+          <w:tcPr>
+            <w:tcW w:type="dxa" w:w="1400"/>
+            <w:tcBorders>
+              <w:top w:val="single" w:color="BFBFBF" w:sz="4"/>
+              <w:left w:val="single" w:color="BFBFBF" w:sz="4"/>
+              <w:bottom w:val="single" w:color="BFBFBF" w:sz="4"/>
+              <w:right w:val="single" w:color="BFBFBF" w:sz="4"/>
+            </w:tcBorders>
+            <w:shd w:fill="FFFFFF" w:val="clear"/>
+            <w:vAlign w:val="center"/>
+          </w:tcPr>
+          <w:p>
+            <w:pPr>
+              <w:spacing w:after="60" w:before="60"/>
+              <w:jc w:val="center"/>
+            </w:pPr>
+            <w:r>
+              <w:rPr>
+                <w:rFonts w:ascii="Arial" w:cs="Arial" w:eastAsia="Arial" w:hAnsi="Arial"/>
+                <w:color w:val="000000"/>
+                <w:sz w:val="19"/>
+                <w:szCs w:val="19"/>
+              </w:rPr>
+              <w:t xml:space="preserve">Técnico(a) E&amp;S</w:t>
+            </w:r>
+          </w:p>
+        </w:tc>
       </w:tr>
       <w:tr>
         <w:tc>
@@ -2253,7 +2451,7 @@
         </w:tc>
         <w:tc>
           <w:tcPr>
-            <w:tcW w:type="dxa" w:w="6500"/>
+            <w:tcW w:type="dxa" w:w="5300"/>
             <w:tcBorders>
               <w:top w:val="single" w:color="BFBFBF" w:sz="4"/>
               <w:left w:val="single" w:color="BFBFBF" w:sz="4"/>
@@ -2280,7 +2478,7 @@
         </w:tc>
         <w:tc>
           <w:tcPr>
-            <w:tcW w:type="dxa" w:w="2360"/>
+            <w:tcW w:type="dxa" w:w="2160"/>
             <w:tcBorders>
               <w:top w:val="single" w:color="BFBFBF" w:sz="4"/>
               <w:left w:val="single" w:color="BFBFBF" w:sz="4"/>
@@ -2303,6 +2501,34 @@
                 <w:szCs w:val="19"/>
               </w:rPr>
               <w:t xml:space="preserve">Técnico(a) E&amp;S</w:t>
+            </w:r>
+          </w:p>
+        </w:tc>
+        <w:tc>
+          <w:tcPr>
+            <w:tcW w:type="dxa" w:w="1400"/>
+            <w:tcBorders>
+              <w:top w:val="single" w:color="BFBFBF" w:sz="4"/>
+              <w:left w:val="single" w:color="BFBFBF" w:sz="4"/>
+              <w:bottom w:val="single" w:color="BFBFBF" w:sz="4"/>
+              <w:right w:val="single" w:color="BFBFBF" w:sz="4"/>
+            </w:tcBorders>
+            <w:shd w:fill="EBF5FB" w:val="clear"/>
+            <w:vAlign w:val="center"/>
+          </w:tcPr>
+          <w:p>
+            <w:pPr>
+              <w:spacing w:after="60" w:before="60"/>
+              <w:jc w:val="center"/>
+            </w:pPr>
+            <w:r>
+              <w:rPr>
+                <w:rFonts w:ascii="Arial" w:cs="Arial" w:eastAsia="Arial" w:hAnsi="Arial"/>
+                <w:color w:val="000000"/>
+                <w:sz w:val="19"/>
+                <w:szCs w:val="19"/>
+              </w:rPr>
+              <w:t xml:space="preserve">—</w:t>
             </w:r>
           </w:p>
         </w:tc>
@@ -2311,7 +2537,7 @@
         <w:tc>
           <w:tcPr>
             <w:tcW w:type="dxa" w:w="9360"/>
-            <w:gridSpan w:val="3"/>
+            <w:gridSpan w:val="4"/>
             <w:tcBorders>
               <w:top w:val="single" w:color="1A3A6B" w:sz="8"/>
               <w:left w:val="single" w:color="1A3A6B" w:sz="8"/>
@@ -2373,7 +2599,7 @@
         </w:tc>
         <w:tc>
           <w:tcPr>
-            <w:tcW w:type="dxa" w:w="6500"/>
+            <w:tcW w:type="dxa" w:w="5300"/>
             <w:tcBorders>
               <w:top w:val="single" w:color="BFBFBF" w:sz="4"/>
               <w:left w:val="single" w:color="BFBFBF" w:sz="4"/>
@@ -2400,7 +2626,7 @@
         </w:tc>
         <w:tc>
           <w:tcPr>
-            <w:tcW w:type="dxa" w:w="2360"/>
+            <w:tcW w:type="dxa" w:w="2160"/>
             <w:tcBorders>
               <w:top w:val="single" w:color="BFBFBF" w:sz="4"/>
               <w:left w:val="single" w:color="BFBFBF" w:sz="4"/>
@@ -2423,6 +2649,35 @@
                 <w:szCs w:val="19"/>
               </w:rPr>
               <w:t xml:space="preserve">Técnico(a) E&amp;S</w:t>
+            </w:r>
+          </w:p>
+        </w:tc>
+        <w:tc>
+          <w:tcPr>
+            <w:tcW w:type="dxa" w:w="1400"/>
+            <w:tcBorders>
+              <w:top w:val="single" w:color="BFBFBF" w:sz="4"/>
+              <w:left w:val="single" w:color="BFBFBF" w:sz="4"/>
+              <w:bottom w:val="single" w:color="BFBFBF" w:sz="4"/>
+              <w:right w:val="single" w:color="BFBFBF" w:sz="4"/>
+            </w:tcBorders>
+            <w:shd w:fill="EBF5FB" w:val="clear"/>
+            <w:vAlign w:val="center"/>
+          </w:tcPr>
+          <w:p>
+            <w:pPr>
+              <w:spacing w:after="60" w:before="60"/>
+              <w:jc w:val="center"/>
+            </w:pPr>
+            <w:r>
+              <w:rPr>
+                <w:rFonts w:ascii="Arial" w:cs="Arial" w:eastAsia="Arial" w:hAnsi="Arial"/>
+                <w:color w:val="000000"/>
+                <w:sz w:val="19"/>
+                <w:szCs w:val="19"/>
+              </w:rPr>
+              <w:t xml:space="preserve">Área Solicitante
+Guardia</w:t>
             </w:r>
           </w:p>
         </w:tc>
@@ -2460,7 +2715,7 @@
         </w:tc>
         <w:tc>
           <w:tcPr>
-            <w:tcW w:type="dxa" w:w="6500"/>
+            <w:tcW w:type="dxa" w:w="5300"/>
             <w:tcBorders>
               <w:top w:val="single" w:color="BFBFBF" w:sz="4"/>
               <w:left w:val="single" w:color="BFBFBF" w:sz="4"/>
@@ -2487,7 +2742,7 @@
         </w:tc>
         <w:tc>
           <w:tcPr>
-            <w:tcW w:type="dxa" w:w="2360"/>
+            <w:tcW w:type="dxa" w:w="2160"/>
             <w:tcBorders>
               <w:top w:val="single" w:color="BFBFBF" w:sz="4"/>
               <w:left w:val="single" w:color="BFBFBF" w:sz="4"/>
@@ -2513,6 +2768,34 @@
             </w:r>
           </w:p>
         </w:tc>
+        <w:tc>
+          <w:tcPr>
+            <w:tcW w:type="dxa" w:w="1400"/>
+            <w:tcBorders>
+              <w:top w:val="single" w:color="BFBFBF" w:sz="4"/>
+              <w:left w:val="single" w:color="BFBFBF" w:sz="4"/>
+              <w:bottom w:val="single" w:color="BFBFBF" w:sz="4"/>
+              <w:right w:val="single" w:color="BFBFBF" w:sz="4"/>
+            </w:tcBorders>
+            <w:shd w:fill="FFFFFF" w:val="clear"/>
+            <w:vAlign w:val="center"/>
+          </w:tcPr>
+          <w:p>
+            <w:pPr>
+              <w:spacing w:after="60" w:before="60"/>
+              <w:jc w:val="center"/>
+            </w:pPr>
+            <w:r>
+              <w:rPr>
+                <w:rFonts w:ascii="Arial" w:cs="Arial" w:eastAsia="Arial" w:hAnsi="Arial"/>
+                <w:color w:val="000000"/>
+                <w:sz w:val="19"/>
+                <w:szCs w:val="19"/>
+              </w:rPr>
+              <w:t xml:space="preserve">—</w:t>
+            </w:r>
+          </w:p>
+        </w:tc>
       </w:tr>
       <w:tr>
         <w:tc>
@@ -2547,7 +2830,7 @@
         </w:tc>
         <w:tc>
           <w:tcPr>
-            <w:tcW w:type="dxa" w:w="6500"/>
+            <w:tcW w:type="dxa" w:w="5300"/>
             <w:tcBorders>
               <w:top w:val="single" w:color="BFBFBF" w:sz="4"/>
               <w:left w:val="single" w:color="BFBFBF" w:sz="4"/>
@@ -2574,7 +2857,7 @@
         </w:tc>
         <w:tc>
           <w:tcPr>
-            <w:tcW w:type="dxa" w:w="2360"/>
+            <w:tcW w:type="dxa" w:w="2160"/>
             <w:tcBorders>
               <w:top w:val="single" w:color="BFBFBF" w:sz="4"/>
               <w:left w:val="single" w:color="BFBFBF" w:sz="4"/>
@@ -2597,6 +2880,34 @@
                 <w:szCs w:val="19"/>
               </w:rPr>
               <w:t xml:space="preserve">Técnico(a) E&amp;S</w:t>
+            </w:r>
+          </w:p>
+        </w:tc>
+        <w:tc>
+          <w:tcPr>
+            <w:tcW w:type="dxa" w:w="1400"/>
+            <w:tcBorders>
+              <w:top w:val="single" w:color="BFBFBF" w:sz="4"/>
+              <w:left w:val="single" w:color="BFBFBF" w:sz="4"/>
+              <w:bottom w:val="single" w:color="BFBFBF" w:sz="4"/>
+              <w:right w:val="single" w:color="BFBFBF" w:sz="4"/>
+            </w:tcBorders>
+            <w:shd w:fill="EBF5FB" w:val="clear"/>
+            <w:vAlign w:val="center"/>
+          </w:tcPr>
+          <w:p>
+            <w:pPr>
+              <w:spacing w:after="60" w:before="60"/>
+              <w:jc w:val="center"/>
+            </w:pPr>
+            <w:r>
+              <w:rPr>
+                <w:rFonts w:ascii="Arial" w:cs="Arial" w:eastAsia="Arial" w:hAnsi="Arial"/>
+                <w:color w:val="000000"/>
+                <w:sz w:val="19"/>
+                <w:szCs w:val="19"/>
+              </w:rPr>
+              <w:t xml:space="preserve">—</w:t>
             </w:r>
           </w:p>
         </w:tc>
@@ -2605,7 +2916,7 @@
         <w:tc>
           <w:tcPr>
             <w:tcW w:type="dxa" w:w="9360"/>
-            <w:gridSpan w:val="3"/>
+            <w:gridSpan w:val="4"/>
             <w:tcBorders>
               <w:top w:val="single" w:color="1A3A6B" w:sz="8"/>
               <w:left w:val="single" w:color="1A3A6B" w:sz="8"/>
@@ -2667,7 +2978,7 @@
         </w:tc>
         <w:tc>
           <w:tcPr>
-            <w:tcW w:type="dxa" w:w="6500"/>
+            <w:tcW w:type="dxa" w:w="5300"/>
             <w:tcBorders>
               <w:top w:val="single" w:color="BFBFBF" w:sz="4"/>
               <w:left w:val="single" w:color="BFBFBF" w:sz="4"/>
@@ -2694,7 +3005,7 @@
         </w:tc>
         <w:tc>
           <w:tcPr>
-            <w:tcW w:type="dxa" w:w="2360"/>
+            <w:tcW w:type="dxa" w:w="2160"/>
             <w:tcBorders>
               <w:top w:val="single" w:color="BFBFBF" w:sz="4"/>
               <w:left w:val="single" w:color="BFBFBF" w:sz="4"/>
@@ -2717,6 +3028,34 @@
                 <w:szCs w:val="19"/>
               </w:rPr>
               <w:t xml:space="preserve">Técnico(a) E&amp;S</w:t>
+            </w:r>
+          </w:p>
+        </w:tc>
+        <w:tc>
+          <w:tcPr>
+            <w:tcW w:type="dxa" w:w="1400"/>
+            <w:tcBorders>
+              <w:top w:val="single" w:color="BFBFBF" w:sz="4"/>
+              <w:left w:val="single" w:color="BFBFBF" w:sz="4"/>
+              <w:bottom w:val="single" w:color="BFBFBF" w:sz="4"/>
+              <w:right w:val="single" w:color="BFBFBF" w:sz="4"/>
+            </w:tcBorders>
+            <w:shd w:fill="EBF5FB" w:val="clear"/>
+            <w:vAlign w:val="center"/>
+          </w:tcPr>
+          <w:p>
+            <w:pPr>
+              <w:spacing w:after="60" w:before="60"/>
+              <w:jc w:val="center"/>
+            </w:pPr>
+            <w:r>
+              <w:rPr>
+                <w:rFonts w:ascii="Arial" w:cs="Arial" w:eastAsia="Arial" w:hAnsi="Arial"/>
+                <w:color w:val="000000"/>
+                <w:sz w:val="19"/>
+                <w:szCs w:val="19"/>
+              </w:rPr>
+              <w:t xml:space="preserve">Empresa Contratista</w:t>
             </w:r>
           </w:p>
         </w:tc>
@@ -2754,7 +3093,7 @@
         </w:tc>
         <w:tc>
           <w:tcPr>
-            <w:tcW w:type="dxa" w:w="6500"/>
+            <w:tcW w:type="dxa" w:w="5300"/>
             <w:tcBorders>
               <w:top w:val="single" w:color="BFBFBF" w:sz="4"/>
               <w:left w:val="single" w:color="BFBFBF" w:sz="4"/>
@@ -2781,7 +3120,7 @@
         </w:tc>
         <w:tc>
           <w:tcPr>
-            <w:tcW w:type="dxa" w:w="2360"/>
+            <w:tcW w:type="dxa" w:w="2160"/>
             <w:tcBorders>
               <w:top w:val="single" w:color="BFBFBF" w:sz="4"/>
               <w:left w:val="single" w:color="BFBFBF" w:sz="4"/>
@@ -2804,6 +3143,34 @@
                 <w:szCs w:val="19"/>
               </w:rPr>
               <w:t xml:space="preserve">Técnico(a) E&amp;S</w:t>
+            </w:r>
+          </w:p>
+        </w:tc>
+        <w:tc>
+          <w:tcPr>
+            <w:tcW w:type="dxa" w:w="1400"/>
+            <w:tcBorders>
+              <w:top w:val="single" w:color="BFBFBF" w:sz="4"/>
+              <w:left w:val="single" w:color="BFBFBF" w:sz="4"/>
+              <w:bottom w:val="single" w:color="BFBFBF" w:sz="4"/>
+              <w:right w:val="single" w:color="BFBFBF" w:sz="4"/>
+            </w:tcBorders>
+            <w:shd w:fill="FFFFFF" w:val="clear"/>
+            <w:vAlign w:val="center"/>
+          </w:tcPr>
+          <w:p>
+            <w:pPr>
+              <w:spacing w:after="60" w:before="60"/>
+              <w:jc w:val="center"/>
+            </w:pPr>
+            <w:r>
+              <w:rPr>
+                <w:rFonts w:ascii="Arial" w:cs="Arial" w:eastAsia="Arial" w:hAnsi="Arial"/>
+                <w:color w:val="000000"/>
+                <w:sz w:val="19"/>
+                <w:szCs w:val="19"/>
+              </w:rPr>
+              <w:t xml:space="preserve">Empresa Contratista</w:t>
             </w:r>
           </w:p>
         </w:tc>
@@ -4016,6 +4383,92 @@
               <w:right w:val="single" w:color="BFBFBF" w:sz="4"/>
             </w:tcBorders>
             <w:shd w:fill="FFFFFF" w:val="clear"/>
+            <w:vAlign w:val="center"/>
+          </w:tcPr>
+          <w:p>
+            <w:pPr>
+              <w:spacing w:after="60" w:before="60"/>
+              <w:jc w:val="center"/>
+            </w:pPr>
+            <w:r>
+              <w:rPr>
+                <w:rFonts w:ascii="Arial" w:cs="Arial" w:eastAsia="Arial" w:hAnsi="Arial"/>
+                <w:color w:val="000000"/>
+                <w:sz w:val="19"/>
+                <w:szCs w:val="19"/>
+              </w:rPr>
+              <w:t xml:space="preserve">MDT / SENESCYT</w:t>
+            </w:r>
+          </w:p>
+        </w:tc>
+      </w:tr>
+      <w:tr>
+        <w:tc>
+          <w:tcPr>
+            <w:tcW w:type="dxa" w:w="2800"/>
+            <w:tcBorders>
+              <w:top w:val="single" w:color="BFBFBF" w:sz="4"/>
+              <w:left w:val="single" w:color="BFBFBF" w:sz="4"/>
+              <w:bottom w:val="single" w:color="BFBFBF" w:sz="4"/>
+              <w:right w:val="single" w:color="BFBFBF" w:sz="4"/>
+            </w:tcBorders>
+            <w:shd w:fill="EBF5FB" w:val="clear"/>
+          </w:tcPr>
+          <w:p>
+            <w:pPr>
+              <w:spacing w:after="60" w:before="60"/>
+              <w:ind w:left="115"/>
+            </w:pPr>
+            <w:r>
+              <w:rPr>
+                <w:rFonts w:ascii="Arial" w:cs="Arial" w:eastAsia="Arial" w:hAnsi="Arial"/>
+                <w:b/>
+                <w:bCs/>
+                <w:color w:val="1A3A6B"/>
+                <w:sz w:val="19"/>
+                <w:szCs w:val="19"/>
+              </w:rPr>
+              <w:t xml:space="preserve">Obra Civil</w:t>
+            </w:r>
+          </w:p>
+        </w:tc>
+        <w:tc>
+          <w:tcPr>
+            <w:tcW w:type="dxa" w:w="4400"/>
+            <w:tcBorders>
+              <w:top w:val="single" w:color="BFBFBF" w:sz="4"/>
+              <w:left w:val="single" w:color="BFBFBF" w:sz="4"/>
+              <w:bottom w:val="single" w:color="BFBFBF" w:sz="4"/>
+              <w:right w:val="single" w:color="BFBFBF" w:sz="4"/>
+            </w:tcBorders>
+            <w:shd w:fill="EBF5FB" w:val="clear"/>
+          </w:tcPr>
+          <w:p>
+            <w:pPr>
+              <w:spacing w:after="60" w:before="60"/>
+              <w:ind w:left="115"/>
+            </w:pPr>
+            <w:r>
+              <w:rPr>
+                <w:rFonts w:ascii="Arial" w:cs="Arial" w:eastAsia="Arial" w:hAnsi="Arial"/>
+                <w:color w:val="000000"/>
+                <w:sz w:val="19"/>
+                <w:szCs w:val="19"/>
+              </w:rPr>
+              <w:t xml:space="preserve">Construcción, demolición, montaje de estructuras, andamiaje y trabajos civiles en general.</w:t>
+            </w:r>
+          </w:p>
+        </w:tc>
+        <w:tc>
+          <w:tcPr>
+            <w:tcW w:type="dxa" w:w="2160"/>
+            <w:tcBorders>
+              <w:top w:val="single" w:color="BFBFBF" w:sz="4"/>
+              <w:left w:val="single" w:color="BFBFBF" w:sz="4"/>
+              <w:bottom w:val="single" w:color="BFBFBF" w:sz="4"/>
+              <w:right w:val="single" w:color="BFBFBF" w:sz="4"/>
+            </w:tcBorders>
+            <w:shd w:fill="EBF5FB" w:val="clear"/>
             <w:vAlign w:val="center"/>
           </w:tcPr>
           <w:p>

</xml_diff>

<commit_message>
Remove colors from R34 and Instructivo, match plantilla B&W style
- Replace all DARK_BLUE/MID_BLUE fills with GRAY_HDR (D9D9D9)
- Replace LIGHT_BG rows with GRAY_LIGHT (F2F2F2)
- All text changed from WHITE to BLACK
- Header tables cleaned of color fills
- Both documents now match the corporate plantilla B&W style

Co-Authored-By: Claude Sonnet 4.6 <noreply@anthropic.com>
Claude-Session: https://claude.ai/code/session_01Mu84mNMmRhshwom6voaTeY
</commit_message>
<xml_diff>
--- a/GE-SO-IXXX_Instructivo_Ingreso_Contratistas_v01.docx
+++ b/GE-SO-IXXX_Instructivo_Ingreso_Contratistas_v01.docx
@@ -25,10 +25,10 @@
             <w:tcW w:type="dxa" w:w="2000"/>
             <w:vMerge w:val="restart"/>
             <w:tcBorders>
-              <w:top w:val="single" w:color="1A3A6B" w:sz="8"/>
-              <w:left w:val="single" w:color="1A3A6B" w:sz="8"/>
-              <w:bottom w:val="single" w:color="1A3A6B" w:sz="8"/>
-              <w:right w:val="single" w:color="1A3A6B" w:sz="8"/>
+              <w:top w:val="single" w:color="000000" w:sz="8"/>
+              <w:left w:val="single" w:color="000000" w:sz="8"/>
+              <w:bottom w:val="single" w:color="000000" w:sz="8"/>
+              <w:right w:val="single" w:color="000000" w:sz="8"/>
             </w:tcBorders>
             <w:vAlign w:val="center"/>
           </w:tcPr>
@@ -83,12 +83,11 @@
           <w:tcPr>
             <w:tcW w:type="dxa" w:w="5200"/>
             <w:tcBorders>
-              <w:top w:val="single" w:color="1A3A6B" w:sz="8"/>
-              <w:left w:val="single" w:color="1A3A6B" w:sz="8"/>
-              <w:bottom w:val="single" w:color="1A3A6B" w:sz="8"/>
-              <w:right w:val="single" w:color="1A3A6B" w:sz="8"/>
-            </w:tcBorders>
-            <w:shd w:fill="1A3A6B" w:val="clear"/>
+              <w:top w:val="single" w:color="000000" w:sz="8"/>
+              <w:left w:val="single" w:color="000000" w:sz="8"/>
+              <w:bottom w:val="single" w:color="000000" w:sz="8"/>
+              <w:right w:val="single" w:color="000000" w:sz="8"/>
+            </w:tcBorders>
             <w:vAlign w:val="center"/>
           </w:tcPr>
           <w:p>
@@ -101,7 +100,7 @@
                 <w:rFonts w:ascii="Arial" w:cs="Arial" w:eastAsia="Arial" w:hAnsi="Arial"/>
                 <w:b/>
                 <w:bCs/>
-                <w:color w:val="FFFFFF"/>
+                <w:color w:val="000000"/>
                 <w:sz w:val="22"/>
                 <w:szCs w:val="22"/>
               </w:rPr>
@@ -113,12 +112,11 @@
           <w:tcPr>
             <w:tcW w:type="dxa" w:w="2160"/>
             <w:tcBorders>
-              <w:top w:val="single" w:color="1A3A6B" w:sz="8"/>
-              <w:left w:val="single" w:color="1A3A6B" w:sz="8"/>
-              <w:bottom w:val="single" w:color="1A3A6B" w:sz="8"/>
-              <w:right w:val="single" w:color="1A3A6B" w:sz="8"/>
-            </w:tcBorders>
-            <w:shd w:fill="F2F2F2" w:val="clear"/>
+              <w:top w:val="single" w:color="000000" w:sz="8"/>
+              <w:left w:val="single" w:color="000000" w:sz="8"/>
+              <w:bottom w:val="single" w:color="000000" w:sz="8"/>
+              <w:right w:val="single" w:color="000000" w:sz="8"/>
+            </w:tcBorders>
             <w:vAlign w:val="center"/>
           </w:tcPr>
           <w:p>
@@ -131,111 +129,26 @@
                 <w:rFonts w:ascii="Arial" w:cs="Arial" w:eastAsia="Arial" w:hAnsi="Arial"/>
                 <w:b/>
                 <w:bCs/>
-                <w:color w:val="1A3A6B"/>
+                <w:color w:val="000000"/>
+                <w:sz w:val="20"/>
+                <w:szCs w:val="20"/>
+              </w:rPr>
+              <w:t xml:space="preserve">GE-SO-IXXX</w:t>
+            </w:r>
+          </w:p>
+          <w:p>
+            <w:pPr>
+              <w:spacing w:after="40" w:before="0"/>
+              <w:jc w:val="center"/>
+            </w:pPr>
+            <w:r>
+              <w:rPr>
+                <w:rFonts w:ascii="Arial" w:cs="Arial" w:eastAsia="Arial" w:hAnsi="Arial"/>
+                <w:color w:val="000000"/>
                 <w:sz w:val="18"/>
                 <w:szCs w:val="18"/>
               </w:rPr>
-              <w:t xml:space="preserve">Código:</w:t>
-            </w:r>
-          </w:p>
-          <w:p>
-            <w:pPr>
-              <w:spacing w:after="40" w:before="0"/>
-              <w:jc w:val="center"/>
-            </w:pPr>
-            <w:r>
-              <w:rPr>
-                <w:rFonts w:ascii="Arial" w:cs="Arial" w:eastAsia="Arial" w:hAnsi="Arial"/>
-                <w:b/>
-                <w:bCs/>
-                <w:color w:val="1A3A6B"/>
-                <w:sz w:val="20"/>
-                <w:szCs w:val="20"/>
-              </w:rPr>
-              <w:t xml:space="preserve">GE-SO-IXXX</w:t>
-            </w:r>
-          </w:p>
-        </w:tc>
-      </w:tr>
-      <w:tr>
-        <w:tc>
-          <w:tcPr>
-            <w:vMerge w:val="continue"/>
-            <w:tcBorders>
-              <w:top w:val="single" w:color="1A3A6B" w:sz="8"/>
-              <w:left w:val="single" w:color="1A3A6B" w:sz="8"/>
-              <w:bottom w:val="single" w:color="1A3A6B" w:sz="8"/>
-              <w:right w:val="single" w:color="1A3A6B" w:sz="8"/>
-            </w:tcBorders>
-          </w:tcPr>
-          <w:p/>
-        </w:tc>
-        <w:tc>
-          <w:tcPr>
-            <w:tcW w:type="dxa" w:w="5200"/>
-            <w:tcBorders>
-              <w:top w:val="single" w:color="1A3A6B" w:sz="8"/>
-              <w:left w:val="single" w:color="1A3A6B" w:sz="8"/>
-              <w:bottom w:val="single" w:color="1A3A6B" w:sz="8"/>
-              <w:right w:val="single" w:color="1A3A6B" w:sz="8"/>
-            </w:tcBorders>
-            <w:shd w:fill="EBF5FB" w:val="clear"/>
-          </w:tcPr>
-          <w:p>
-            <w:pPr>
-              <w:spacing w:after="60" w:before="60"/>
-              <w:jc w:val="center"/>
-            </w:pPr>
-            <w:r>
-              <w:rPr>
-                <w:rFonts w:ascii="Arial" w:cs="Arial" w:eastAsia="Arial" w:hAnsi="Arial"/>
-                <w:color w:val="595959"/>
-                <w:sz w:val="18"/>
-                <w:szCs w:val="18"/>
-              </w:rPr>
-              <w:t xml:space="preserve">Plantabal S.A. / 3A Core Materials  |  Planta: Quevedo y Santo Domingo</w:t>
-            </w:r>
-          </w:p>
-        </w:tc>
-        <w:tc>
-          <w:tcPr>
-            <w:tcW w:type="dxa" w:w="2160"/>
-            <w:tcBorders>
-              <w:top w:val="single" w:color="1A3A6B" w:sz="8"/>
-              <w:left w:val="single" w:color="1A3A6B" w:sz="8"/>
-              <w:bottom w:val="single" w:color="1A3A6B" w:sz="8"/>
-              <w:right w:val="single" w:color="1A3A6B" w:sz="8"/>
-            </w:tcBorders>
-            <w:shd w:fill="F2F2F2" w:val="clear"/>
-          </w:tcPr>
-          <w:p>
-            <w:pPr>
-              <w:spacing w:after="0" w:before="40"/>
-              <w:jc w:val="center"/>
-            </w:pPr>
-            <w:r>
-              <w:rPr>
-                <w:rFonts w:ascii="Arial" w:cs="Arial" w:eastAsia="Arial" w:hAnsi="Arial"/>
-                <w:color w:val="000000"/>
-                <w:sz w:val="18"/>
-                <w:szCs w:val="18"/>
-              </w:rPr>
               <w:t xml:space="preserve">Versión: 01</w:t>
-            </w:r>
-          </w:p>
-          <w:p>
-            <w:pPr>
-              <w:spacing w:after="40" w:before="0"/>
-              <w:jc w:val="center"/>
-            </w:pPr>
-            <w:r>
-              <w:rPr>
-                <w:rFonts w:ascii="Arial" w:cs="Arial" w:eastAsia="Arial" w:hAnsi="Arial"/>
-                <w:color w:val="000000"/>
-                <w:sz w:val="18"/>
-                <w:szCs w:val="18"/>
-              </w:rPr>
-              <w:t xml:space="preserve">Fecha: 31/10/2026</w:t>
             </w:r>
           </w:p>
         </w:tc>
@@ -255,7 +168,7 @@
     </w:p>
     <w:p>
       <w:pPr>
-        <w:shd w:fill="2E6DB4" w:val="clear"/>
+        <w:shd w:fill="D9D9D9" w:val="clear"/>
         <w:spacing w:after="0" w:before="0"/>
         <w:ind w:left="144"/>
         <w:jc w:val="left"/>
@@ -265,7 +178,7 @@
           <w:rFonts w:ascii="Arial" w:cs="Arial" w:eastAsia="Arial" w:hAnsi="Arial"/>
           <w:b/>
           <w:bCs/>
-          <w:color w:val="FFFFFF"/>
+          <w:color w:val="000000"/>
           <w:sz w:val="24"/>
           <w:szCs w:val="24"/>
         </w:rPr>
@@ -314,7 +227,7 @@
     </w:p>
     <w:p>
       <w:pPr>
-        <w:shd w:fill="2E6DB4" w:val="clear"/>
+        <w:shd w:fill="D9D9D9" w:val="clear"/>
         <w:spacing w:after="0" w:before="0"/>
         <w:ind w:left="144"/>
         <w:jc w:val="left"/>
@@ -324,7 +237,7 @@
           <w:rFonts w:ascii="Arial" w:cs="Arial" w:eastAsia="Arial" w:hAnsi="Arial"/>
           <w:b/>
           <w:bCs/>
-          <w:color w:val="FFFFFF"/>
+          <w:color w:val="000000"/>
           <w:sz w:val="24"/>
           <w:szCs w:val="24"/>
         </w:rPr>
@@ -421,7 +334,7 @@
     </w:p>
     <w:p>
       <w:pPr>
-        <w:shd w:fill="2E6DB4" w:val="clear"/>
+        <w:shd w:fill="D9D9D9" w:val="clear"/>
         <w:spacing w:after="0" w:before="0"/>
         <w:ind w:left="144"/>
         <w:jc w:val="left"/>
@@ -431,7 +344,7 @@
           <w:rFonts w:ascii="Arial" w:cs="Arial" w:eastAsia="Arial" w:hAnsi="Arial"/>
           <w:b/>
           <w:bCs/>
-          <w:color w:val="FFFFFF"/>
+          <w:color w:val="000000"/>
           <w:sz w:val="24"/>
           <w:szCs w:val="24"/>
         </w:rPr>
@@ -471,12 +384,12 @@
           <w:tcPr>
             <w:tcW w:type="dxa" w:w="2600"/>
             <w:tcBorders>
-              <w:top w:val="single" w:color="2E6DB4" w:sz="8"/>
-              <w:left w:val="single" w:color="2E6DB4" w:sz="8"/>
-              <w:bottom w:val="single" w:color="2E6DB4" w:sz="8"/>
-              <w:right w:val="single" w:color="2E6DB4" w:sz="8"/>
-            </w:tcBorders>
-            <w:shd w:fill="2E6DB4" w:val="clear"/>
+              <w:top w:val="single" w:color="000000" w:sz="8"/>
+              <w:left w:val="single" w:color="000000" w:sz="8"/>
+              <w:bottom w:val="single" w:color="000000" w:sz="8"/>
+              <w:right w:val="single" w:color="000000" w:sz="8"/>
+            </w:tcBorders>
+            <w:shd w:fill="D9D9D9" w:val="clear"/>
           </w:tcPr>
           <w:p>
             <w:pPr>
@@ -488,7 +401,7 @@
                 <w:rFonts w:ascii="Arial" w:cs="Arial" w:eastAsia="Arial" w:hAnsi="Arial"/>
                 <w:b/>
                 <w:bCs/>
-                <w:color w:val="FFFFFF"/>
+                <w:color w:val="000000"/>
                 <w:sz w:val="19"/>
                 <w:szCs w:val="19"/>
               </w:rPr>
@@ -500,12 +413,12 @@
           <w:tcPr>
             <w:tcW w:type="dxa" w:w="6760"/>
             <w:tcBorders>
-              <w:top w:val="single" w:color="2E6DB4" w:sz="8"/>
-              <w:left w:val="single" w:color="2E6DB4" w:sz="8"/>
-              <w:bottom w:val="single" w:color="2E6DB4" w:sz="8"/>
-              <w:right w:val="single" w:color="2E6DB4" w:sz="8"/>
-            </w:tcBorders>
-            <w:shd w:fill="2E6DB4" w:val="clear"/>
+              <w:top w:val="single" w:color="000000" w:sz="8"/>
+              <w:left w:val="single" w:color="000000" w:sz="8"/>
+              <w:bottom w:val="single" w:color="000000" w:sz="8"/>
+              <w:right w:val="single" w:color="000000" w:sz="8"/>
+            </w:tcBorders>
+            <w:shd w:fill="D9D9D9" w:val="clear"/>
           </w:tcPr>
           <w:p>
             <w:pPr>
@@ -517,7 +430,7 @@
                 <w:rFonts w:ascii="Arial" w:cs="Arial" w:eastAsia="Arial" w:hAnsi="Arial"/>
                 <w:b/>
                 <w:bCs/>
-                <w:color w:val="FFFFFF"/>
+                <w:color w:val="000000"/>
                 <w:sz w:val="19"/>
                 <w:szCs w:val="19"/>
               </w:rPr>
@@ -536,19 +449,19 @@
               <w:bottom w:val="single" w:color="BFBFBF" w:sz="4"/>
               <w:right w:val="single" w:color="BFBFBF" w:sz="4"/>
             </w:tcBorders>
-            <w:shd w:fill="EBF5FB" w:val="clear"/>
-          </w:tcPr>
-          <w:p>
-            <w:pPr>
-              <w:spacing w:after="60" w:before="60"/>
-              <w:ind w:left="115"/>
-            </w:pPr>
-            <w:r>
-              <w:rPr>
-                <w:rFonts w:ascii="Arial" w:cs="Arial" w:eastAsia="Arial" w:hAnsi="Arial"/>
-                <w:b/>
-                <w:bCs/>
-                <w:color w:val="1A3A6B"/>
+            <w:shd w:fill="F2F2F2" w:val="clear"/>
+          </w:tcPr>
+          <w:p>
+            <w:pPr>
+              <w:spacing w:after="60" w:before="60"/>
+              <w:ind w:left="115"/>
+            </w:pPr>
+            <w:r>
+              <w:rPr>
+                <w:rFonts w:ascii="Arial" w:cs="Arial" w:eastAsia="Arial" w:hAnsi="Arial"/>
+                <w:b/>
+                <w:bCs/>
+                <w:color w:val="000000"/>
                 <w:sz w:val="19"/>
                 <w:szCs w:val="19"/>
               </w:rPr>
@@ -593,19 +506,19 @@
               <w:bottom w:val="single" w:color="BFBFBF" w:sz="4"/>
               <w:right w:val="single" w:color="BFBFBF" w:sz="4"/>
             </w:tcBorders>
-            <w:shd w:fill="EBF5FB" w:val="clear"/>
-          </w:tcPr>
-          <w:p>
-            <w:pPr>
-              <w:spacing w:after="60" w:before="60"/>
-              <w:ind w:left="115"/>
-            </w:pPr>
-            <w:r>
-              <w:rPr>
-                <w:rFonts w:ascii="Arial" w:cs="Arial" w:eastAsia="Arial" w:hAnsi="Arial"/>
-                <w:b/>
-                <w:bCs/>
-                <w:color w:val="1A3A6B"/>
+            <w:shd w:fill="F2F2F2" w:val="clear"/>
+          </w:tcPr>
+          <w:p>
+            <w:pPr>
+              <w:spacing w:after="60" w:before="60"/>
+              <w:ind w:left="115"/>
+            </w:pPr>
+            <w:r>
+              <w:rPr>
+                <w:rFonts w:ascii="Arial" w:cs="Arial" w:eastAsia="Arial" w:hAnsi="Arial"/>
+                <w:b/>
+                <w:bCs/>
+                <w:color w:val="000000"/>
                 <w:sz w:val="19"/>
                 <w:szCs w:val="19"/>
               </w:rPr>
@@ -650,19 +563,19 @@
               <w:bottom w:val="single" w:color="BFBFBF" w:sz="4"/>
               <w:right w:val="single" w:color="BFBFBF" w:sz="4"/>
             </w:tcBorders>
-            <w:shd w:fill="EBF5FB" w:val="clear"/>
-          </w:tcPr>
-          <w:p>
-            <w:pPr>
-              <w:spacing w:after="60" w:before="60"/>
-              <w:ind w:left="115"/>
-            </w:pPr>
-            <w:r>
-              <w:rPr>
-                <w:rFonts w:ascii="Arial" w:cs="Arial" w:eastAsia="Arial" w:hAnsi="Arial"/>
-                <w:b/>
-                <w:bCs/>
-                <w:color w:val="1A3A6B"/>
+            <w:shd w:fill="F2F2F2" w:val="clear"/>
+          </w:tcPr>
+          <w:p>
+            <w:pPr>
+              <w:spacing w:after="60" w:before="60"/>
+              <w:ind w:left="115"/>
+            </w:pPr>
+            <w:r>
+              <w:rPr>
+                <w:rFonts w:ascii="Arial" w:cs="Arial" w:eastAsia="Arial" w:hAnsi="Arial"/>
+                <w:b/>
+                <w:bCs/>
+                <w:color w:val="000000"/>
                 <w:sz w:val="19"/>
                 <w:szCs w:val="19"/>
               </w:rPr>
@@ -707,19 +620,19 @@
               <w:bottom w:val="single" w:color="BFBFBF" w:sz="4"/>
               <w:right w:val="single" w:color="BFBFBF" w:sz="4"/>
             </w:tcBorders>
-            <w:shd w:fill="EBF5FB" w:val="clear"/>
-          </w:tcPr>
-          <w:p>
-            <w:pPr>
-              <w:spacing w:after="60" w:before="60"/>
-              <w:ind w:left="115"/>
-            </w:pPr>
-            <w:r>
-              <w:rPr>
-                <w:rFonts w:ascii="Arial" w:cs="Arial" w:eastAsia="Arial" w:hAnsi="Arial"/>
-                <w:b/>
-                <w:bCs/>
-                <w:color w:val="1A3A6B"/>
+            <w:shd w:fill="F2F2F2" w:val="clear"/>
+          </w:tcPr>
+          <w:p>
+            <w:pPr>
+              <w:spacing w:after="60" w:before="60"/>
+              <w:ind w:left="115"/>
+            </w:pPr>
+            <w:r>
+              <w:rPr>
+                <w:rFonts w:ascii="Arial" w:cs="Arial" w:eastAsia="Arial" w:hAnsi="Arial"/>
+                <w:b/>
+                <w:bCs/>
+                <w:color w:val="000000"/>
                 <w:sz w:val="19"/>
                 <w:szCs w:val="19"/>
               </w:rPr>
@@ -764,19 +677,19 @@
               <w:bottom w:val="single" w:color="BFBFBF" w:sz="4"/>
               <w:right w:val="single" w:color="BFBFBF" w:sz="4"/>
             </w:tcBorders>
-            <w:shd w:fill="EBF5FB" w:val="clear"/>
-          </w:tcPr>
-          <w:p>
-            <w:pPr>
-              <w:spacing w:after="60" w:before="60"/>
-              <w:ind w:left="115"/>
-            </w:pPr>
-            <w:r>
-              <w:rPr>
-                <w:rFonts w:ascii="Arial" w:cs="Arial" w:eastAsia="Arial" w:hAnsi="Arial"/>
-                <w:b/>
-                <w:bCs/>
-                <w:color w:val="1A3A6B"/>
+            <w:shd w:fill="F2F2F2" w:val="clear"/>
+          </w:tcPr>
+          <w:p>
+            <w:pPr>
+              <w:spacing w:after="60" w:before="60"/>
+              <w:ind w:left="115"/>
+            </w:pPr>
+            <w:r>
+              <w:rPr>
+                <w:rFonts w:ascii="Arial" w:cs="Arial" w:eastAsia="Arial" w:hAnsi="Arial"/>
+                <w:b/>
+                <w:bCs/>
+                <w:color w:val="000000"/>
                 <w:sz w:val="19"/>
                 <w:szCs w:val="19"/>
               </w:rPr>
@@ -821,19 +734,19 @@
               <w:bottom w:val="single" w:color="BFBFBF" w:sz="4"/>
               <w:right w:val="single" w:color="BFBFBF" w:sz="4"/>
             </w:tcBorders>
-            <w:shd w:fill="EBF5FB" w:val="clear"/>
-          </w:tcPr>
-          <w:p>
-            <w:pPr>
-              <w:spacing w:after="60" w:before="60"/>
-              <w:ind w:left="115"/>
-            </w:pPr>
-            <w:r>
-              <w:rPr>
-                <w:rFonts w:ascii="Arial" w:cs="Arial" w:eastAsia="Arial" w:hAnsi="Arial"/>
-                <w:b/>
-                <w:bCs/>
-                <w:color w:val="1A3A6B"/>
+            <w:shd w:fill="F2F2F2" w:val="clear"/>
+          </w:tcPr>
+          <w:p>
+            <w:pPr>
+              <w:spacing w:after="60" w:before="60"/>
+              <w:ind w:left="115"/>
+            </w:pPr>
+            <w:r>
+              <w:rPr>
+                <w:rFonts w:ascii="Arial" w:cs="Arial" w:eastAsia="Arial" w:hAnsi="Arial"/>
+                <w:b/>
+                <w:bCs/>
+                <w:color w:val="000000"/>
                 <w:sz w:val="19"/>
                 <w:szCs w:val="19"/>
               </w:rPr>
@@ -878,19 +791,19 @@
               <w:bottom w:val="single" w:color="BFBFBF" w:sz="4"/>
               <w:right w:val="single" w:color="BFBFBF" w:sz="4"/>
             </w:tcBorders>
-            <w:shd w:fill="EBF5FB" w:val="clear"/>
-          </w:tcPr>
-          <w:p>
-            <w:pPr>
-              <w:spacing w:after="60" w:before="60"/>
-              <w:ind w:left="115"/>
-            </w:pPr>
-            <w:r>
-              <w:rPr>
-                <w:rFonts w:ascii="Arial" w:cs="Arial" w:eastAsia="Arial" w:hAnsi="Arial"/>
-                <w:b/>
-                <w:bCs/>
-                <w:color w:val="1A3A6B"/>
+            <w:shd w:fill="F2F2F2" w:val="clear"/>
+          </w:tcPr>
+          <w:p>
+            <w:pPr>
+              <w:spacing w:after="60" w:before="60"/>
+              <w:ind w:left="115"/>
+            </w:pPr>
+            <w:r>
+              <w:rPr>
+                <w:rFonts w:ascii="Arial" w:cs="Arial" w:eastAsia="Arial" w:hAnsi="Arial"/>
+                <w:b/>
+                <w:bCs/>
+                <w:color w:val="000000"/>
                 <w:sz w:val="19"/>
                 <w:szCs w:val="19"/>
               </w:rPr>
@@ -935,19 +848,19 @@
               <w:bottom w:val="single" w:color="BFBFBF" w:sz="4"/>
               <w:right w:val="single" w:color="BFBFBF" w:sz="4"/>
             </w:tcBorders>
-            <w:shd w:fill="EBF5FB" w:val="clear"/>
-          </w:tcPr>
-          <w:p>
-            <w:pPr>
-              <w:spacing w:after="60" w:before="60"/>
-              <w:ind w:left="115"/>
-            </w:pPr>
-            <w:r>
-              <w:rPr>
-                <w:rFonts w:ascii="Arial" w:cs="Arial" w:eastAsia="Arial" w:hAnsi="Arial"/>
-                <w:b/>
-                <w:bCs/>
-                <w:color w:val="1A3A6B"/>
+            <w:shd w:fill="F2F2F2" w:val="clear"/>
+          </w:tcPr>
+          <w:p>
+            <w:pPr>
+              <w:spacing w:after="60" w:before="60"/>
+              <w:ind w:left="115"/>
+            </w:pPr>
+            <w:r>
+              <w:rPr>
+                <w:rFonts w:ascii="Arial" w:cs="Arial" w:eastAsia="Arial" w:hAnsi="Arial"/>
+                <w:b/>
+                <w:bCs/>
+                <w:color w:val="000000"/>
                 <w:sz w:val="19"/>
                 <w:szCs w:val="19"/>
               </w:rPr>
@@ -992,19 +905,19 @@
               <w:bottom w:val="single" w:color="BFBFBF" w:sz="4"/>
               <w:right w:val="single" w:color="BFBFBF" w:sz="4"/>
             </w:tcBorders>
-            <w:shd w:fill="EBF5FB" w:val="clear"/>
-          </w:tcPr>
-          <w:p>
-            <w:pPr>
-              <w:spacing w:after="60" w:before="60"/>
-              <w:ind w:left="115"/>
-            </w:pPr>
-            <w:r>
-              <w:rPr>
-                <w:rFonts w:ascii="Arial" w:cs="Arial" w:eastAsia="Arial" w:hAnsi="Arial"/>
-                <w:b/>
-                <w:bCs/>
-                <w:color w:val="1A3A6B"/>
+            <w:shd w:fill="F2F2F2" w:val="clear"/>
+          </w:tcPr>
+          <w:p>
+            <w:pPr>
+              <w:spacing w:after="60" w:before="60"/>
+              <w:ind w:left="115"/>
+            </w:pPr>
+            <w:r>
+              <w:rPr>
+                <w:rFonts w:ascii="Arial" w:cs="Arial" w:eastAsia="Arial" w:hAnsi="Arial"/>
+                <w:b/>
+                <w:bCs/>
+                <w:color w:val="000000"/>
                 <w:sz w:val="19"/>
                 <w:szCs w:val="19"/>
               </w:rPr>
@@ -1054,7 +967,7 @@
     </w:p>
     <w:p>
       <w:pPr>
-        <w:shd w:fill="2E6DB4" w:val="clear"/>
+        <w:shd w:fill="D9D9D9" w:val="clear"/>
         <w:spacing w:after="0" w:before="0"/>
         <w:ind w:left="144"/>
         <w:jc w:val="left"/>
@@ -1064,7 +977,7 @@
           <w:rFonts w:ascii="Arial" w:cs="Arial" w:eastAsia="Arial" w:hAnsi="Arial"/>
           <w:b/>
           <w:bCs/>
-          <w:color w:val="FFFFFF"/>
+          <w:color w:val="000000"/>
           <w:sz w:val="24"/>
           <w:szCs w:val="24"/>
         </w:rPr>
@@ -1104,12 +1017,12 @@
           <w:tcPr>
             <w:tcW w:type="dxa" w:w="2600"/>
             <w:tcBorders>
-              <w:top w:val="single" w:color="2E6DB4" w:sz="8"/>
-              <w:left w:val="single" w:color="2E6DB4" w:sz="8"/>
-              <w:bottom w:val="single" w:color="2E6DB4" w:sz="8"/>
-              <w:right w:val="single" w:color="2E6DB4" w:sz="8"/>
-            </w:tcBorders>
-            <w:shd w:fill="2E6DB4" w:val="clear"/>
+              <w:top w:val="single" w:color="000000" w:sz="8"/>
+              <w:left w:val="single" w:color="000000" w:sz="8"/>
+              <w:bottom w:val="single" w:color="000000" w:sz="8"/>
+              <w:right w:val="single" w:color="000000" w:sz="8"/>
+            </w:tcBorders>
+            <w:shd w:fill="D9D9D9" w:val="clear"/>
           </w:tcPr>
           <w:p>
             <w:pPr>
@@ -1121,7 +1034,7 @@
                 <w:rFonts w:ascii="Arial" w:cs="Arial" w:eastAsia="Arial" w:hAnsi="Arial"/>
                 <w:b/>
                 <w:bCs/>
-                <w:color w:val="FFFFFF"/>
+                <w:color w:val="000000"/>
                 <w:sz w:val="19"/>
                 <w:szCs w:val="19"/>
               </w:rPr>
@@ -1133,12 +1046,12 @@
           <w:tcPr>
             <w:tcW w:type="dxa" w:w="6760"/>
             <w:tcBorders>
-              <w:top w:val="single" w:color="2E6DB4" w:sz="8"/>
-              <w:left w:val="single" w:color="2E6DB4" w:sz="8"/>
-              <w:bottom w:val="single" w:color="2E6DB4" w:sz="8"/>
-              <w:right w:val="single" w:color="2E6DB4" w:sz="8"/>
-            </w:tcBorders>
-            <w:shd w:fill="2E6DB4" w:val="clear"/>
+              <w:top w:val="single" w:color="000000" w:sz="8"/>
+              <w:left w:val="single" w:color="000000" w:sz="8"/>
+              <w:bottom w:val="single" w:color="000000" w:sz="8"/>
+              <w:right w:val="single" w:color="000000" w:sz="8"/>
+            </w:tcBorders>
+            <w:shd w:fill="D9D9D9" w:val="clear"/>
           </w:tcPr>
           <w:p>
             <w:pPr>
@@ -1150,7 +1063,7 @@
                 <w:rFonts w:ascii="Arial" w:cs="Arial" w:eastAsia="Arial" w:hAnsi="Arial"/>
                 <w:b/>
                 <w:bCs/>
-                <w:color w:val="FFFFFF"/>
+                <w:color w:val="000000"/>
                 <w:sz w:val="19"/>
                 <w:szCs w:val="19"/>
               </w:rPr>
@@ -1169,19 +1082,19 @@
               <w:bottom w:val="single" w:color="BFBFBF" w:sz="4"/>
               <w:right w:val="single" w:color="BFBFBF" w:sz="4"/>
             </w:tcBorders>
-            <w:shd w:fill="EBF5FB" w:val="clear"/>
-          </w:tcPr>
-          <w:p>
-            <w:pPr>
-              <w:spacing w:after="60" w:before="60"/>
-              <w:ind w:left="115"/>
-            </w:pPr>
-            <w:r>
-              <w:rPr>
-                <w:rFonts w:ascii="Arial" w:cs="Arial" w:eastAsia="Arial" w:hAnsi="Arial"/>
-                <w:b/>
-                <w:bCs/>
-                <w:color w:val="1A3A6B"/>
+            <w:shd w:fill="F2F2F2" w:val="clear"/>
+          </w:tcPr>
+          <w:p>
+            <w:pPr>
+              <w:spacing w:after="60" w:before="60"/>
+              <w:ind w:left="115"/>
+            </w:pPr>
+            <w:r>
+              <w:rPr>
+                <w:rFonts w:ascii="Arial" w:cs="Arial" w:eastAsia="Arial" w:hAnsi="Arial"/>
+                <w:b/>
+                <w:bCs/>
+                <w:color w:val="000000"/>
                 <w:sz w:val="19"/>
                 <w:szCs w:val="19"/>
               </w:rPr>
@@ -1198,7 +1111,7 @@
               <w:bottom w:val="single" w:color="BFBFBF" w:sz="4"/>
               <w:right w:val="single" w:color="BFBFBF" w:sz="4"/>
             </w:tcBorders>
-            <w:shd w:fill="EBF5FB" w:val="clear"/>
+            <w:shd w:fill="F2F2F2" w:val="clear"/>
           </w:tcPr>
           <w:p>
             <w:pPr>
@@ -1239,7 +1152,7 @@
                 <w:rFonts w:ascii="Arial" w:cs="Arial" w:eastAsia="Arial" w:hAnsi="Arial"/>
                 <w:b/>
                 <w:bCs/>
-                <w:color w:val="1A3A6B"/>
+                <w:color w:val="000000"/>
                 <w:sz w:val="19"/>
                 <w:szCs w:val="19"/>
               </w:rPr>
@@ -1285,19 +1198,19 @@
               <w:bottom w:val="single" w:color="BFBFBF" w:sz="4"/>
               <w:right w:val="single" w:color="BFBFBF" w:sz="4"/>
             </w:tcBorders>
-            <w:shd w:fill="EBF5FB" w:val="clear"/>
-          </w:tcPr>
-          <w:p>
-            <w:pPr>
-              <w:spacing w:after="60" w:before="60"/>
-              <w:ind w:left="115"/>
-            </w:pPr>
-            <w:r>
-              <w:rPr>
-                <w:rFonts w:ascii="Arial" w:cs="Arial" w:eastAsia="Arial" w:hAnsi="Arial"/>
-                <w:b/>
-                <w:bCs/>
-                <w:color w:val="1A3A6B"/>
+            <w:shd w:fill="F2F2F2" w:val="clear"/>
+          </w:tcPr>
+          <w:p>
+            <w:pPr>
+              <w:spacing w:after="60" w:before="60"/>
+              <w:ind w:left="115"/>
+            </w:pPr>
+            <w:r>
+              <w:rPr>
+                <w:rFonts w:ascii="Arial" w:cs="Arial" w:eastAsia="Arial" w:hAnsi="Arial"/>
+                <w:b/>
+                <w:bCs/>
+                <w:color w:val="000000"/>
                 <w:sz w:val="19"/>
                 <w:szCs w:val="19"/>
               </w:rPr>
@@ -1314,7 +1227,7 @@
               <w:bottom w:val="single" w:color="BFBFBF" w:sz="4"/>
               <w:right w:val="single" w:color="BFBFBF" w:sz="4"/>
             </w:tcBorders>
-            <w:shd w:fill="EBF5FB" w:val="clear"/>
+            <w:shd w:fill="F2F2F2" w:val="clear"/>
           </w:tcPr>
           <w:p>
             <w:pPr>
@@ -1355,7 +1268,7 @@
                 <w:rFonts w:ascii="Arial" w:cs="Arial" w:eastAsia="Arial" w:hAnsi="Arial"/>
                 <w:b/>
                 <w:bCs/>
-                <w:color w:val="1A3A6B"/>
+                <w:color w:val="000000"/>
                 <w:sz w:val="19"/>
                 <w:szCs w:val="19"/>
               </w:rPr>
@@ -1401,19 +1314,19 @@
               <w:bottom w:val="single" w:color="BFBFBF" w:sz="4"/>
               <w:right w:val="single" w:color="BFBFBF" w:sz="4"/>
             </w:tcBorders>
-            <w:shd w:fill="EBF5FB" w:val="clear"/>
-          </w:tcPr>
-          <w:p>
-            <w:pPr>
-              <w:spacing w:after="60" w:before="60"/>
-              <w:ind w:left="115"/>
-            </w:pPr>
-            <w:r>
-              <w:rPr>
-                <w:rFonts w:ascii="Arial" w:cs="Arial" w:eastAsia="Arial" w:hAnsi="Arial"/>
-                <w:b/>
-                <w:bCs/>
-                <w:color w:val="1A3A6B"/>
+            <w:shd w:fill="F2F2F2" w:val="clear"/>
+          </w:tcPr>
+          <w:p>
+            <w:pPr>
+              <w:spacing w:after="60" w:before="60"/>
+              <w:ind w:left="115"/>
+            </w:pPr>
+            <w:r>
+              <w:rPr>
+                <w:rFonts w:ascii="Arial" w:cs="Arial" w:eastAsia="Arial" w:hAnsi="Arial"/>
+                <w:b/>
+                <w:bCs/>
+                <w:color w:val="000000"/>
                 <w:sz w:val="19"/>
                 <w:szCs w:val="19"/>
               </w:rPr>
@@ -1430,7 +1343,7 @@
               <w:bottom w:val="single" w:color="BFBFBF" w:sz="4"/>
               <w:right w:val="single" w:color="BFBFBF" w:sz="4"/>
             </w:tcBorders>
-            <w:shd w:fill="EBF5FB" w:val="clear"/>
+            <w:shd w:fill="F2F2F2" w:val="clear"/>
           </w:tcPr>
           <w:p>
             <w:pPr>
@@ -1464,7 +1377,7 @@
     </w:p>
     <w:p>
       <w:pPr>
-        <w:shd w:fill="2E6DB4" w:val="clear"/>
+        <w:shd w:fill="D9D9D9" w:val="clear"/>
         <w:spacing w:after="0" w:before="0"/>
         <w:ind w:left="144"/>
         <w:jc w:val="left"/>
@@ -1474,7 +1387,7 @@
           <w:rFonts w:ascii="Arial" w:cs="Arial" w:eastAsia="Arial" w:hAnsi="Arial"/>
           <w:b/>
           <w:bCs/>
-          <w:color w:val="FFFFFF"/>
+          <w:color w:val="000000"/>
           <w:sz w:val="24"/>
           <w:szCs w:val="24"/>
         </w:rPr>
@@ -1496,7 +1409,7 @@
     <w:p>
       <w:pPr>
         <w:pBdr>
-          <w:bottom w:val="single" w:color="2E6DB4" w:sz="6"/>
+          <w:bottom w:val="single" w:color="000000" w:sz="6"/>
         </w:pBdr>
         <w:spacing w:after="60" w:before="160"/>
       </w:pPr>
@@ -1505,7 +1418,7 @@
           <w:rFonts w:ascii="Arial" w:cs="Arial" w:eastAsia="Arial" w:hAnsi="Arial"/>
           <w:b/>
           <w:bCs/>
-          <w:color w:val="1A3A6B"/>
+          <w:color w:val="000000"/>
           <w:sz w:val="21"/>
           <w:szCs w:val="21"/>
         </w:rPr>
@@ -1547,12 +1460,12 @@
           <w:tcPr>
             <w:tcW w:type="dxa" w:w="500"/>
             <w:tcBorders>
-              <w:top w:val="single" w:color="2E6DB4" w:sz="8"/>
-              <w:left w:val="single" w:color="2E6DB4" w:sz="8"/>
-              <w:bottom w:val="single" w:color="2E6DB4" w:sz="8"/>
-              <w:right w:val="single" w:color="2E6DB4" w:sz="8"/>
-            </w:tcBorders>
-            <w:shd w:fill="2E6DB4" w:val="clear"/>
+              <w:top w:val="single" w:color="000000" w:sz="8"/>
+              <w:left w:val="single" w:color="000000" w:sz="8"/>
+              <w:bottom w:val="single" w:color="000000" w:sz="8"/>
+              <w:right w:val="single" w:color="000000" w:sz="8"/>
+            </w:tcBorders>
+            <w:shd w:fill="D9D9D9" w:val="clear"/>
           </w:tcPr>
           <w:p>
             <w:pPr>
@@ -1564,7 +1477,7 @@
                 <w:rFonts w:ascii="Arial" w:cs="Arial" w:eastAsia="Arial" w:hAnsi="Arial"/>
                 <w:b/>
                 <w:bCs/>
-                <w:color w:val="FFFFFF"/>
+                <w:color w:val="000000"/>
                 <w:sz w:val="19"/>
                 <w:szCs w:val="19"/>
               </w:rPr>
@@ -1576,12 +1489,12 @@
           <w:tcPr>
             <w:tcW w:type="dxa" w:w="5300"/>
             <w:tcBorders>
-              <w:top w:val="single" w:color="2E6DB4" w:sz="8"/>
-              <w:left w:val="single" w:color="2E6DB4" w:sz="8"/>
-              <w:bottom w:val="single" w:color="2E6DB4" w:sz="8"/>
-              <w:right w:val="single" w:color="2E6DB4" w:sz="8"/>
-            </w:tcBorders>
-            <w:shd w:fill="2E6DB4" w:val="clear"/>
+              <w:top w:val="single" w:color="000000" w:sz="8"/>
+              <w:left w:val="single" w:color="000000" w:sz="8"/>
+              <w:bottom w:val="single" w:color="000000" w:sz="8"/>
+              <w:right w:val="single" w:color="000000" w:sz="8"/>
+            </w:tcBorders>
+            <w:shd w:fill="D9D9D9" w:val="clear"/>
           </w:tcPr>
           <w:p>
             <w:pPr>
@@ -1593,7 +1506,7 @@
                 <w:rFonts w:ascii="Arial" w:cs="Arial" w:eastAsia="Arial" w:hAnsi="Arial"/>
                 <w:b/>
                 <w:bCs/>
-                <w:color w:val="FFFFFF"/>
+                <w:color w:val="000000"/>
                 <w:sz w:val="19"/>
                 <w:szCs w:val="19"/>
               </w:rPr>
@@ -1605,12 +1518,12 @@
           <w:tcPr>
             <w:tcW w:type="dxa" w:w="2160"/>
             <w:tcBorders>
-              <w:top w:val="single" w:color="2E6DB4" w:sz="8"/>
-              <w:left w:val="single" w:color="2E6DB4" w:sz="8"/>
-              <w:bottom w:val="single" w:color="2E6DB4" w:sz="8"/>
-              <w:right w:val="single" w:color="2E6DB4" w:sz="8"/>
-            </w:tcBorders>
-            <w:shd w:fill="2E6DB4" w:val="clear"/>
+              <w:top w:val="single" w:color="000000" w:sz="8"/>
+              <w:left w:val="single" w:color="000000" w:sz="8"/>
+              <w:bottom w:val="single" w:color="000000" w:sz="8"/>
+              <w:right w:val="single" w:color="000000" w:sz="8"/>
+            </w:tcBorders>
+            <w:shd w:fill="D9D9D9" w:val="clear"/>
           </w:tcPr>
           <w:p>
             <w:pPr>
@@ -1622,7 +1535,7 @@
                 <w:rFonts w:ascii="Arial" w:cs="Arial" w:eastAsia="Arial" w:hAnsi="Arial"/>
                 <w:b/>
                 <w:bCs/>
-                <w:color w:val="FFFFFF"/>
+                <w:color w:val="000000"/>
                 <w:sz w:val="19"/>
                 <w:szCs w:val="19"/>
               </w:rPr>
@@ -1634,12 +1547,12 @@
           <w:tcPr>
             <w:tcW w:type="dxa" w:w="1400"/>
             <w:tcBorders>
-              <w:top w:val="single" w:color="2E6DB4" w:sz="8"/>
-              <w:left w:val="single" w:color="2E6DB4" w:sz="8"/>
-              <w:bottom w:val="single" w:color="2E6DB4" w:sz="8"/>
-              <w:right w:val="single" w:color="2E6DB4" w:sz="8"/>
-            </w:tcBorders>
-            <w:shd w:fill="2E6DB4" w:val="clear"/>
+              <w:top w:val="single" w:color="000000" w:sz="8"/>
+              <w:left w:val="single" w:color="000000" w:sz="8"/>
+              <w:bottom w:val="single" w:color="000000" w:sz="8"/>
+              <w:right w:val="single" w:color="000000" w:sz="8"/>
+            </w:tcBorders>
+            <w:shd w:fill="D9D9D9" w:val="clear"/>
           </w:tcPr>
           <w:p>
             <w:pPr>
@@ -1651,7 +1564,7 @@
                 <w:rFonts w:ascii="Arial" w:cs="Arial" w:eastAsia="Arial" w:hAnsi="Arial"/>
                 <w:b/>
                 <w:bCs/>
-                <w:color w:val="FFFFFF"/>
+                <w:color w:val="000000"/>
                 <w:sz w:val="19"/>
                 <w:szCs w:val="19"/>
               </w:rPr>
@@ -1666,12 +1579,12 @@
             <w:tcW w:type="dxa" w:w="9360"/>
             <w:gridSpan w:val="4"/>
             <w:tcBorders>
-              <w:top w:val="single" w:color="1A3A6B" w:sz="8"/>
-              <w:left w:val="single" w:color="1A3A6B" w:sz="8"/>
-              <w:bottom w:val="single" w:color="1A3A6B" w:sz="8"/>
-              <w:right w:val="single" w:color="1A3A6B" w:sz="8"/>
-            </w:tcBorders>
-            <w:shd w:fill="1A3A6B" w:val="clear"/>
+              <w:top w:val="single" w:color="000000" w:sz="8"/>
+              <w:left w:val="single" w:color="000000" w:sz="8"/>
+              <w:bottom w:val="single" w:color="000000" w:sz="8"/>
+              <w:right w:val="single" w:color="000000" w:sz="8"/>
+            </w:tcBorders>
+            <w:shd w:fill="D9D9D9" w:val="clear"/>
           </w:tcPr>
           <w:p>
             <w:pPr>
@@ -1684,7 +1597,7 @@
                 <w:rFonts w:ascii="Arial" w:cs="Arial" w:eastAsia="Arial" w:hAnsi="Arial"/>
                 <w:b/>
                 <w:bCs/>
-                <w:color w:val="FFFFFF"/>
+                <w:color w:val="000000"/>
                 <w:sz w:val="20"/>
                 <w:szCs w:val="20"/>
               </w:rPr>
@@ -1703,7 +1616,7 @@
               <w:bottom w:val="single" w:color="BFBFBF" w:sz="4"/>
               <w:right w:val="single" w:color="BFBFBF" w:sz="4"/>
             </w:tcBorders>
-            <w:shd w:fill="EBF5FB" w:val="clear"/>
+            <w:shd w:fill="F2F2F2" w:val="clear"/>
             <w:vAlign w:val="center"/>
           </w:tcPr>
           <w:p>
@@ -1716,7 +1629,7 @@
                 <w:rFonts w:ascii="Arial" w:cs="Arial" w:eastAsia="Arial" w:hAnsi="Arial"/>
                 <w:b/>
                 <w:bCs/>
-                <w:color w:val="1A3A6B"/>
+                <w:color w:val="000000"/>
                 <w:sz w:val="19"/>
                 <w:szCs w:val="19"/>
               </w:rPr>
@@ -1733,7 +1646,7 @@
               <w:bottom w:val="single" w:color="BFBFBF" w:sz="4"/>
               <w:right w:val="single" w:color="BFBFBF" w:sz="4"/>
             </w:tcBorders>
-            <w:shd w:fill="EBF5FB" w:val="clear"/>
+            <w:shd w:fill="F2F2F2" w:val="clear"/>
           </w:tcPr>
           <w:p>
             <w:pPr>
@@ -1760,7 +1673,7 @@
               <w:bottom w:val="single" w:color="BFBFBF" w:sz="4"/>
               <w:right w:val="single" w:color="BFBFBF" w:sz="4"/>
             </w:tcBorders>
-            <w:shd w:fill="EBF5FB" w:val="clear"/>
+            <w:shd w:fill="F2F2F2" w:val="clear"/>
             <w:vAlign w:val="center"/>
           </w:tcPr>
           <w:p>
@@ -1788,7 +1701,7 @@
               <w:bottom w:val="single" w:color="BFBFBF" w:sz="4"/>
               <w:right w:val="single" w:color="BFBFBF" w:sz="4"/>
             </w:tcBorders>
-            <w:shd w:fill="EBF5FB" w:val="clear"/>
+            <w:shd w:fill="F2F2F2" w:val="clear"/>
             <w:vAlign w:val="center"/>
           </w:tcPr>
           <w:p>
@@ -1831,7 +1744,7 @@
                 <w:rFonts w:ascii="Arial" w:cs="Arial" w:eastAsia="Arial" w:hAnsi="Arial"/>
                 <w:b/>
                 <w:bCs/>
-                <w:color w:val="1A3A6B"/>
+                <w:color w:val="000000"/>
                 <w:sz w:val="19"/>
                 <w:szCs w:val="19"/>
               </w:rPr>
@@ -1929,12 +1842,12 @@
             <w:tcW w:type="dxa" w:w="9360"/>
             <w:gridSpan w:val="4"/>
             <w:tcBorders>
-              <w:top w:val="single" w:color="1A3A6B" w:sz="8"/>
-              <w:left w:val="single" w:color="1A3A6B" w:sz="8"/>
-              <w:bottom w:val="single" w:color="1A3A6B" w:sz="8"/>
-              <w:right w:val="single" w:color="1A3A6B" w:sz="8"/>
-            </w:tcBorders>
-            <w:shd w:fill="1A3A6B" w:val="clear"/>
+              <w:top w:val="single" w:color="000000" w:sz="8"/>
+              <w:left w:val="single" w:color="000000" w:sz="8"/>
+              <w:bottom w:val="single" w:color="000000" w:sz="8"/>
+              <w:right w:val="single" w:color="000000" w:sz="8"/>
+            </w:tcBorders>
+            <w:shd w:fill="D9D9D9" w:val="clear"/>
           </w:tcPr>
           <w:p>
             <w:pPr>
@@ -1947,7 +1860,7 @@
                 <w:rFonts w:ascii="Arial" w:cs="Arial" w:eastAsia="Arial" w:hAnsi="Arial"/>
                 <w:b/>
                 <w:bCs/>
-                <w:color w:val="FFFFFF"/>
+                <w:color w:val="000000"/>
                 <w:sz w:val="20"/>
                 <w:szCs w:val="20"/>
               </w:rPr>
@@ -1966,7 +1879,7 @@
               <w:bottom w:val="single" w:color="BFBFBF" w:sz="4"/>
               <w:right w:val="single" w:color="BFBFBF" w:sz="4"/>
             </w:tcBorders>
-            <w:shd w:fill="EBF5FB" w:val="clear"/>
+            <w:shd w:fill="F2F2F2" w:val="clear"/>
             <w:vAlign w:val="center"/>
           </w:tcPr>
           <w:p>
@@ -1979,7 +1892,7 @@
                 <w:rFonts w:ascii="Arial" w:cs="Arial" w:eastAsia="Arial" w:hAnsi="Arial"/>
                 <w:b/>
                 <w:bCs/>
-                <w:color w:val="1A3A6B"/>
+                <w:color w:val="000000"/>
                 <w:sz w:val="19"/>
                 <w:szCs w:val="19"/>
               </w:rPr>
@@ -1996,7 +1909,7 @@
               <w:bottom w:val="single" w:color="BFBFBF" w:sz="4"/>
               <w:right w:val="single" w:color="BFBFBF" w:sz="4"/>
             </w:tcBorders>
-            <w:shd w:fill="EBF5FB" w:val="clear"/>
+            <w:shd w:fill="F2F2F2" w:val="clear"/>
           </w:tcPr>
           <w:p>
             <w:pPr>
@@ -2023,7 +1936,7 @@
               <w:bottom w:val="single" w:color="BFBFBF" w:sz="4"/>
               <w:right w:val="single" w:color="BFBFBF" w:sz="4"/>
             </w:tcBorders>
-            <w:shd w:fill="EBF5FB" w:val="clear"/>
+            <w:shd w:fill="F2F2F2" w:val="clear"/>
             <w:vAlign w:val="center"/>
           </w:tcPr>
           <w:p>
@@ -2052,7 +1965,7 @@
               <w:bottom w:val="single" w:color="BFBFBF" w:sz="4"/>
               <w:right w:val="single" w:color="BFBFBF" w:sz="4"/>
             </w:tcBorders>
-            <w:shd w:fill="EBF5FB" w:val="clear"/>
+            <w:shd w:fill="F2F2F2" w:val="clear"/>
             <w:vAlign w:val="center"/>
           </w:tcPr>
           <w:p>
@@ -2095,7 +2008,7 @@
                 <w:rFonts w:ascii="Arial" w:cs="Arial" w:eastAsia="Arial" w:hAnsi="Arial"/>
                 <w:b/>
                 <w:bCs/>
-                <w:color w:val="1A3A6B"/>
+                <w:color w:val="000000"/>
                 <w:sz w:val="19"/>
                 <w:szCs w:val="19"/>
               </w:rPr>
@@ -2197,7 +2110,7 @@
               <w:bottom w:val="single" w:color="BFBFBF" w:sz="4"/>
               <w:right w:val="single" w:color="BFBFBF" w:sz="4"/>
             </w:tcBorders>
-            <w:shd w:fill="EBF5FB" w:val="clear"/>
+            <w:shd w:fill="F2F2F2" w:val="clear"/>
             <w:vAlign w:val="center"/>
           </w:tcPr>
           <w:p>
@@ -2210,7 +2123,7 @@
                 <w:rFonts w:ascii="Arial" w:cs="Arial" w:eastAsia="Arial" w:hAnsi="Arial"/>
                 <w:b/>
                 <w:bCs/>
-                <w:color w:val="1A3A6B"/>
+                <w:color w:val="000000"/>
                 <w:sz w:val="19"/>
                 <w:szCs w:val="19"/>
               </w:rPr>
@@ -2227,7 +2140,7 @@
               <w:bottom w:val="single" w:color="BFBFBF" w:sz="4"/>
               <w:right w:val="single" w:color="BFBFBF" w:sz="4"/>
             </w:tcBorders>
-            <w:shd w:fill="EBF5FB" w:val="clear"/>
+            <w:shd w:fill="F2F2F2" w:val="clear"/>
           </w:tcPr>
           <w:p>
             <w:pPr>
@@ -2254,7 +2167,7 @@
               <w:bottom w:val="single" w:color="BFBFBF" w:sz="4"/>
               <w:right w:val="single" w:color="BFBFBF" w:sz="4"/>
             </w:tcBorders>
-            <w:shd w:fill="EBF5FB" w:val="clear"/>
+            <w:shd w:fill="F2F2F2" w:val="clear"/>
             <w:vAlign w:val="center"/>
           </w:tcPr>
           <w:p>
@@ -2282,7 +2195,7 @@
               <w:bottom w:val="single" w:color="BFBFBF" w:sz="4"/>
               <w:right w:val="single" w:color="BFBFBF" w:sz="4"/>
             </w:tcBorders>
-            <w:shd w:fill="EBF5FB" w:val="clear"/>
+            <w:shd w:fill="F2F2F2" w:val="clear"/>
             <w:vAlign w:val="center"/>
           </w:tcPr>
           <w:p>
@@ -2325,7 +2238,7 @@
                 <w:rFonts w:ascii="Arial" w:cs="Arial" w:eastAsia="Arial" w:hAnsi="Arial"/>
                 <w:b/>
                 <w:bCs/>
-                <w:color w:val="1A3A6B"/>
+                <w:color w:val="000000"/>
                 <w:sz w:val="19"/>
                 <w:szCs w:val="19"/>
               </w:rPr>
@@ -2428,7 +2341,7 @@
               <w:bottom w:val="single" w:color="BFBFBF" w:sz="4"/>
               <w:right w:val="single" w:color="BFBFBF" w:sz="4"/>
             </w:tcBorders>
-            <w:shd w:fill="EBF5FB" w:val="clear"/>
+            <w:shd w:fill="F2F2F2" w:val="clear"/>
             <w:vAlign w:val="center"/>
           </w:tcPr>
           <w:p>
@@ -2441,7 +2354,7 @@
                 <w:rFonts w:ascii="Arial" w:cs="Arial" w:eastAsia="Arial" w:hAnsi="Arial"/>
                 <w:b/>
                 <w:bCs/>
-                <w:color w:val="1A3A6B"/>
+                <w:color w:val="000000"/>
                 <w:sz w:val="19"/>
                 <w:szCs w:val="19"/>
               </w:rPr>
@@ -2458,7 +2371,7 @@
               <w:bottom w:val="single" w:color="BFBFBF" w:sz="4"/>
               <w:right w:val="single" w:color="BFBFBF" w:sz="4"/>
             </w:tcBorders>
-            <w:shd w:fill="EBF5FB" w:val="clear"/>
+            <w:shd w:fill="F2F2F2" w:val="clear"/>
           </w:tcPr>
           <w:p>
             <w:pPr>
@@ -2485,7 +2398,7 @@
               <w:bottom w:val="single" w:color="BFBFBF" w:sz="4"/>
               <w:right w:val="single" w:color="BFBFBF" w:sz="4"/>
             </w:tcBorders>
-            <w:shd w:fill="EBF5FB" w:val="clear"/>
+            <w:shd w:fill="F2F2F2" w:val="clear"/>
             <w:vAlign w:val="center"/>
           </w:tcPr>
           <w:p>
@@ -2513,7 +2426,7 @@
               <w:bottom w:val="single" w:color="BFBFBF" w:sz="4"/>
               <w:right w:val="single" w:color="BFBFBF" w:sz="4"/>
             </w:tcBorders>
-            <w:shd w:fill="EBF5FB" w:val="clear"/>
+            <w:shd w:fill="F2F2F2" w:val="clear"/>
             <w:vAlign w:val="center"/>
           </w:tcPr>
           <w:p>
@@ -2539,12 +2452,12 @@
             <w:tcW w:type="dxa" w:w="9360"/>
             <w:gridSpan w:val="4"/>
             <w:tcBorders>
-              <w:top w:val="single" w:color="1A3A6B" w:sz="8"/>
-              <w:left w:val="single" w:color="1A3A6B" w:sz="8"/>
-              <w:bottom w:val="single" w:color="1A3A6B" w:sz="8"/>
-              <w:right w:val="single" w:color="1A3A6B" w:sz="8"/>
-            </w:tcBorders>
-            <w:shd w:fill="1A3A6B" w:val="clear"/>
+              <w:top w:val="single" w:color="000000" w:sz="8"/>
+              <w:left w:val="single" w:color="000000" w:sz="8"/>
+              <w:bottom w:val="single" w:color="000000" w:sz="8"/>
+              <w:right w:val="single" w:color="000000" w:sz="8"/>
+            </w:tcBorders>
+            <w:shd w:fill="D9D9D9" w:val="clear"/>
           </w:tcPr>
           <w:p>
             <w:pPr>
@@ -2557,7 +2470,7 @@
                 <w:rFonts w:ascii="Arial" w:cs="Arial" w:eastAsia="Arial" w:hAnsi="Arial"/>
                 <w:b/>
                 <w:bCs/>
-                <w:color w:val="FFFFFF"/>
+                <w:color w:val="000000"/>
                 <w:sz w:val="20"/>
                 <w:szCs w:val="20"/>
               </w:rPr>
@@ -2576,7 +2489,7 @@
               <w:bottom w:val="single" w:color="BFBFBF" w:sz="4"/>
               <w:right w:val="single" w:color="BFBFBF" w:sz="4"/>
             </w:tcBorders>
-            <w:shd w:fill="EBF5FB" w:val="clear"/>
+            <w:shd w:fill="F2F2F2" w:val="clear"/>
             <w:vAlign w:val="center"/>
           </w:tcPr>
           <w:p>
@@ -2589,7 +2502,7 @@
                 <w:rFonts w:ascii="Arial" w:cs="Arial" w:eastAsia="Arial" w:hAnsi="Arial"/>
                 <w:b/>
                 <w:bCs/>
-                <w:color w:val="1A3A6B"/>
+                <w:color w:val="000000"/>
                 <w:sz w:val="19"/>
                 <w:szCs w:val="19"/>
               </w:rPr>
@@ -2606,7 +2519,7 @@
               <w:bottom w:val="single" w:color="BFBFBF" w:sz="4"/>
               <w:right w:val="single" w:color="BFBFBF" w:sz="4"/>
             </w:tcBorders>
-            <w:shd w:fill="EBF5FB" w:val="clear"/>
+            <w:shd w:fill="F2F2F2" w:val="clear"/>
           </w:tcPr>
           <w:p>
             <w:pPr>
@@ -2633,7 +2546,7 @@
               <w:bottom w:val="single" w:color="BFBFBF" w:sz="4"/>
               <w:right w:val="single" w:color="BFBFBF" w:sz="4"/>
             </w:tcBorders>
-            <w:shd w:fill="EBF5FB" w:val="clear"/>
+            <w:shd w:fill="F2F2F2" w:val="clear"/>
             <w:vAlign w:val="center"/>
           </w:tcPr>
           <w:p>
@@ -2661,7 +2574,7 @@
               <w:bottom w:val="single" w:color="BFBFBF" w:sz="4"/>
               <w:right w:val="single" w:color="BFBFBF" w:sz="4"/>
             </w:tcBorders>
-            <w:shd w:fill="EBF5FB" w:val="clear"/>
+            <w:shd w:fill="F2F2F2" w:val="clear"/>
             <w:vAlign w:val="center"/>
           </w:tcPr>
           <w:p>
@@ -2705,7 +2618,7 @@
                 <w:rFonts w:ascii="Arial" w:cs="Arial" w:eastAsia="Arial" w:hAnsi="Arial"/>
                 <w:b/>
                 <w:bCs/>
-                <w:color w:val="1A3A6B"/>
+                <w:color w:val="000000"/>
                 <w:sz w:val="19"/>
                 <w:szCs w:val="19"/>
               </w:rPr>
@@ -2807,7 +2720,7 @@
               <w:bottom w:val="single" w:color="BFBFBF" w:sz="4"/>
               <w:right w:val="single" w:color="BFBFBF" w:sz="4"/>
             </w:tcBorders>
-            <w:shd w:fill="EBF5FB" w:val="clear"/>
+            <w:shd w:fill="F2F2F2" w:val="clear"/>
             <w:vAlign w:val="center"/>
           </w:tcPr>
           <w:p>
@@ -2820,7 +2733,7 @@
                 <w:rFonts w:ascii="Arial" w:cs="Arial" w:eastAsia="Arial" w:hAnsi="Arial"/>
                 <w:b/>
                 <w:bCs/>
-                <w:color w:val="1A3A6B"/>
+                <w:color w:val="000000"/>
                 <w:sz w:val="19"/>
                 <w:szCs w:val="19"/>
               </w:rPr>
@@ -2837,7 +2750,7 @@
               <w:bottom w:val="single" w:color="BFBFBF" w:sz="4"/>
               <w:right w:val="single" w:color="BFBFBF" w:sz="4"/>
             </w:tcBorders>
-            <w:shd w:fill="EBF5FB" w:val="clear"/>
+            <w:shd w:fill="F2F2F2" w:val="clear"/>
           </w:tcPr>
           <w:p>
             <w:pPr>
@@ -2864,7 +2777,7 @@
               <w:bottom w:val="single" w:color="BFBFBF" w:sz="4"/>
               <w:right w:val="single" w:color="BFBFBF" w:sz="4"/>
             </w:tcBorders>
-            <w:shd w:fill="EBF5FB" w:val="clear"/>
+            <w:shd w:fill="F2F2F2" w:val="clear"/>
             <w:vAlign w:val="center"/>
           </w:tcPr>
           <w:p>
@@ -2892,7 +2805,7 @@
               <w:bottom w:val="single" w:color="BFBFBF" w:sz="4"/>
               <w:right w:val="single" w:color="BFBFBF" w:sz="4"/>
             </w:tcBorders>
-            <w:shd w:fill="EBF5FB" w:val="clear"/>
+            <w:shd w:fill="F2F2F2" w:val="clear"/>
             <w:vAlign w:val="center"/>
           </w:tcPr>
           <w:p>
@@ -2918,12 +2831,12 @@
             <w:tcW w:type="dxa" w:w="9360"/>
             <w:gridSpan w:val="4"/>
             <w:tcBorders>
-              <w:top w:val="single" w:color="1A3A6B" w:sz="8"/>
-              <w:left w:val="single" w:color="1A3A6B" w:sz="8"/>
-              <w:bottom w:val="single" w:color="1A3A6B" w:sz="8"/>
-              <w:right w:val="single" w:color="1A3A6B" w:sz="8"/>
-            </w:tcBorders>
-            <w:shd w:fill="1A3A6B" w:val="clear"/>
+              <w:top w:val="single" w:color="000000" w:sz="8"/>
+              <w:left w:val="single" w:color="000000" w:sz="8"/>
+              <w:bottom w:val="single" w:color="000000" w:sz="8"/>
+              <w:right w:val="single" w:color="000000" w:sz="8"/>
+            </w:tcBorders>
+            <w:shd w:fill="D9D9D9" w:val="clear"/>
           </w:tcPr>
           <w:p>
             <w:pPr>
@@ -2936,7 +2849,7 @@
                 <w:rFonts w:ascii="Arial" w:cs="Arial" w:eastAsia="Arial" w:hAnsi="Arial"/>
                 <w:b/>
                 <w:bCs/>
-                <w:color w:val="FFFFFF"/>
+                <w:color w:val="000000"/>
                 <w:sz w:val="20"/>
                 <w:szCs w:val="20"/>
               </w:rPr>
@@ -2955,7 +2868,7 @@
               <w:bottom w:val="single" w:color="BFBFBF" w:sz="4"/>
               <w:right w:val="single" w:color="BFBFBF" w:sz="4"/>
             </w:tcBorders>
-            <w:shd w:fill="EBF5FB" w:val="clear"/>
+            <w:shd w:fill="F2F2F2" w:val="clear"/>
             <w:vAlign w:val="center"/>
           </w:tcPr>
           <w:p>
@@ -2968,7 +2881,7 @@
                 <w:rFonts w:ascii="Arial" w:cs="Arial" w:eastAsia="Arial" w:hAnsi="Arial"/>
                 <w:b/>
                 <w:bCs/>
-                <w:color w:val="1A3A6B"/>
+                <w:color w:val="000000"/>
                 <w:sz w:val="19"/>
                 <w:szCs w:val="19"/>
               </w:rPr>
@@ -2985,7 +2898,7 @@
               <w:bottom w:val="single" w:color="BFBFBF" w:sz="4"/>
               <w:right w:val="single" w:color="BFBFBF" w:sz="4"/>
             </w:tcBorders>
-            <w:shd w:fill="EBF5FB" w:val="clear"/>
+            <w:shd w:fill="F2F2F2" w:val="clear"/>
           </w:tcPr>
           <w:p>
             <w:pPr>
@@ -3012,7 +2925,7 @@
               <w:bottom w:val="single" w:color="BFBFBF" w:sz="4"/>
               <w:right w:val="single" w:color="BFBFBF" w:sz="4"/>
             </w:tcBorders>
-            <w:shd w:fill="EBF5FB" w:val="clear"/>
+            <w:shd w:fill="F2F2F2" w:val="clear"/>
             <w:vAlign w:val="center"/>
           </w:tcPr>
           <w:p>
@@ -3040,7 +2953,7 @@
               <w:bottom w:val="single" w:color="BFBFBF" w:sz="4"/>
               <w:right w:val="single" w:color="BFBFBF" w:sz="4"/>
             </w:tcBorders>
-            <w:shd w:fill="EBF5FB" w:val="clear"/>
+            <w:shd w:fill="F2F2F2" w:val="clear"/>
             <w:vAlign w:val="center"/>
           </w:tcPr>
           <w:p>
@@ -3083,7 +2996,7 @@
                 <w:rFonts w:ascii="Arial" w:cs="Arial" w:eastAsia="Arial" w:hAnsi="Arial"/>
                 <w:b/>
                 <w:bCs/>
-                <w:color w:val="1A3A6B"/>
+                <w:color w:val="000000"/>
                 <w:sz w:val="19"/>
                 <w:szCs w:val="19"/>
               </w:rPr>
@@ -3191,7 +3104,7 @@
     <w:p>
       <w:pPr>
         <w:pBdr>
-          <w:bottom w:val="single" w:color="2E6DB4" w:sz="6"/>
+          <w:bottom w:val="single" w:color="000000" w:sz="6"/>
         </w:pBdr>
         <w:spacing w:after="60" w:before="160"/>
       </w:pPr>
@@ -3200,7 +3113,7 @@
           <w:rFonts w:ascii="Arial" w:cs="Arial" w:eastAsia="Arial" w:hAnsi="Arial"/>
           <w:b/>
           <w:bCs/>
-          <w:color w:val="1A3A6B"/>
+          <w:color w:val="000000"/>
           <w:sz w:val="21"/>
           <w:szCs w:val="21"/>
         </w:rPr>
@@ -3246,12 +3159,12 @@
           <w:tcPr>
             <w:tcW w:type="dxa" w:w="400"/>
             <w:tcBorders>
-              <w:top w:val="single" w:color="2E6DB4" w:sz="8"/>
-              <w:left w:val="single" w:color="2E6DB4" w:sz="8"/>
-              <w:bottom w:val="single" w:color="2E6DB4" w:sz="8"/>
-              <w:right w:val="single" w:color="2E6DB4" w:sz="8"/>
-            </w:tcBorders>
-            <w:shd w:fill="2E6DB4" w:val="clear"/>
+              <w:top w:val="single" w:color="000000" w:sz="8"/>
+              <w:left w:val="single" w:color="000000" w:sz="8"/>
+              <w:bottom w:val="single" w:color="000000" w:sz="8"/>
+              <w:right w:val="single" w:color="000000" w:sz="8"/>
+            </w:tcBorders>
+            <w:shd w:fill="D9D9D9" w:val="clear"/>
           </w:tcPr>
           <w:p>
             <w:pPr>
@@ -3263,7 +3176,7 @@
                 <w:rFonts w:ascii="Arial" w:cs="Arial" w:eastAsia="Arial" w:hAnsi="Arial"/>
                 <w:b/>
                 <w:bCs/>
-                <w:color w:val="FFFFFF"/>
+                <w:color w:val="000000"/>
                 <w:sz w:val="19"/>
                 <w:szCs w:val="19"/>
               </w:rPr>
@@ -3275,12 +3188,12 @@
           <w:tcPr>
             <w:tcW w:type="dxa" w:w="3200"/>
             <w:tcBorders>
-              <w:top w:val="single" w:color="2E6DB4" w:sz="8"/>
-              <w:left w:val="single" w:color="2E6DB4" w:sz="8"/>
-              <w:bottom w:val="single" w:color="2E6DB4" w:sz="8"/>
-              <w:right w:val="single" w:color="2E6DB4" w:sz="8"/>
-            </w:tcBorders>
-            <w:shd w:fill="2E6DB4" w:val="clear"/>
+              <w:top w:val="single" w:color="000000" w:sz="8"/>
+              <w:left w:val="single" w:color="000000" w:sz="8"/>
+              <w:bottom w:val="single" w:color="000000" w:sz="8"/>
+              <w:right w:val="single" w:color="000000" w:sz="8"/>
+            </w:tcBorders>
+            <w:shd w:fill="D9D9D9" w:val="clear"/>
           </w:tcPr>
           <w:p>
             <w:pPr>
@@ -3292,7 +3205,7 @@
                 <w:rFonts w:ascii="Arial" w:cs="Arial" w:eastAsia="Arial" w:hAnsi="Arial"/>
                 <w:b/>
                 <w:bCs/>
-                <w:color w:val="FFFFFF"/>
+                <w:color w:val="000000"/>
                 <w:sz w:val="19"/>
                 <w:szCs w:val="19"/>
               </w:rPr>
@@ -3304,12 +3217,12 @@
           <w:tcPr>
             <w:tcW w:type="dxa" w:w="2200"/>
             <w:tcBorders>
-              <w:top w:val="single" w:color="2E6DB4" w:sz="8"/>
-              <w:left w:val="single" w:color="2E6DB4" w:sz="8"/>
-              <w:bottom w:val="single" w:color="2E6DB4" w:sz="8"/>
-              <w:right w:val="single" w:color="2E6DB4" w:sz="8"/>
-            </w:tcBorders>
-            <w:shd w:fill="2E6DB4" w:val="clear"/>
+              <w:top w:val="single" w:color="000000" w:sz="8"/>
+              <w:left w:val="single" w:color="000000" w:sz="8"/>
+              <w:bottom w:val="single" w:color="000000" w:sz="8"/>
+              <w:right w:val="single" w:color="000000" w:sz="8"/>
+            </w:tcBorders>
+            <w:shd w:fill="D9D9D9" w:val="clear"/>
           </w:tcPr>
           <w:p>
             <w:pPr>
@@ -3321,7 +3234,7 @@
                 <w:rFonts w:ascii="Arial" w:cs="Arial" w:eastAsia="Arial" w:hAnsi="Arial"/>
                 <w:b/>
                 <w:bCs/>
-                <w:color w:val="FFFFFF"/>
+                <w:color w:val="000000"/>
                 <w:sz w:val="19"/>
                 <w:szCs w:val="19"/>
               </w:rPr>
@@ -3333,12 +3246,12 @@
           <w:tcPr>
             <w:tcW w:type="dxa" w:w="3560"/>
             <w:tcBorders>
-              <w:top w:val="single" w:color="2E6DB4" w:sz="8"/>
-              <w:left w:val="single" w:color="2E6DB4" w:sz="8"/>
-              <w:bottom w:val="single" w:color="2E6DB4" w:sz="8"/>
-              <w:right w:val="single" w:color="2E6DB4" w:sz="8"/>
-            </w:tcBorders>
-            <w:shd w:fill="2E6DB4" w:val="clear"/>
+              <w:top w:val="single" w:color="000000" w:sz="8"/>
+              <w:left w:val="single" w:color="000000" w:sz="8"/>
+              <w:bottom w:val="single" w:color="000000" w:sz="8"/>
+              <w:right w:val="single" w:color="000000" w:sz="8"/>
+            </w:tcBorders>
+            <w:shd w:fill="D9D9D9" w:val="clear"/>
           </w:tcPr>
           <w:p>
             <w:pPr>
@@ -3350,7 +3263,7 @@
                 <w:rFonts w:ascii="Arial" w:cs="Arial" w:eastAsia="Arial" w:hAnsi="Arial"/>
                 <w:b/>
                 <w:bCs/>
-                <w:color w:val="FFFFFF"/>
+                <w:color w:val="000000"/>
                 <w:sz w:val="19"/>
                 <w:szCs w:val="19"/>
               </w:rPr>
@@ -3369,7 +3282,7 @@
               <w:bottom w:val="single" w:color="BFBFBF" w:sz="4"/>
               <w:right w:val="single" w:color="BFBFBF" w:sz="4"/>
             </w:tcBorders>
-            <w:shd w:fill="EBF5FB" w:val="clear"/>
+            <w:shd w:fill="F2F2F2" w:val="clear"/>
             <w:vAlign w:val="center"/>
           </w:tcPr>
           <w:p>
@@ -3399,7 +3312,7 @@
               <w:bottom w:val="single" w:color="BFBFBF" w:sz="4"/>
               <w:right w:val="single" w:color="BFBFBF" w:sz="4"/>
             </w:tcBorders>
-            <w:shd w:fill="EBF5FB" w:val="clear"/>
+            <w:shd w:fill="F2F2F2" w:val="clear"/>
           </w:tcPr>
           <w:p>
             <w:pPr>
@@ -3426,7 +3339,7 @@
               <w:bottom w:val="single" w:color="BFBFBF" w:sz="4"/>
               <w:right w:val="single" w:color="BFBFBF" w:sz="4"/>
             </w:tcBorders>
-            <w:shd w:fill="EBF5FB" w:val="clear"/>
+            <w:shd w:fill="F2F2F2" w:val="clear"/>
           </w:tcPr>
           <w:p>
             <w:pPr>
@@ -3453,7 +3366,7 @@
               <w:bottom w:val="single" w:color="BFBFBF" w:sz="4"/>
               <w:right w:val="single" w:color="BFBFBF" w:sz="4"/>
             </w:tcBorders>
-            <w:shd w:fill="EBF5FB" w:val="clear"/>
+            <w:shd w:fill="F2F2F2" w:val="clear"/>
           </w:tcPr>
           <w:p>
             <w:pPr>
@@ -3599,7 +3512,7 @@
               <w:bottom w:val="single" w:color="BFBFBF" w:sz="4"/>
               <w:right w:val="single" w:color="BFBFBF" w:sz="4"/>
             </w:tcBorders>
-            <w:shd w:fill="EBF5FB" w:val="clear"/>
+            <w:shd w:fill="F2F2F2" w:val="clear"/>
             <w:vAlign w:val="center"/>
           </w:tcPr>
           <w:p>
@@ -3629,7 +3542,7 @@
               <w:bottom w:val="single" w:color="BFBFBF" w:sz="4"/>
               <w:right w:val="single" w:color="BFBFBF" w:sz="4"/>
             </w:tcBorders>
-            <w:shd w:fill="EBF5FB" w:val="clear"/>
+            <w:shd w:fill="F2F2F2" w:val="clear"/>
           </w:tcPr>
           <w:p>
             <w:pPr>
@@ -3656,7 +3569,7 @@
               <w:bottom w:val="single" w:color="BFBFBF" w:sz="4"/>
               <w:right w:val="single" w:color="BFBFBF" w:sz="4"/>
             </w:tcBorders>
-            <w:shd w:fill="EBF5FB" w:val="clear"/>
+            <w:shd w:fill="F2F2F2" w:val="clear"/>
           </w:tcPr>
           <w:p>
             <w:pPr>
@@ -3683,7 +3596,7 @@
               <w:bottom w:val="single" w:color="BFBFBF" w:sz="4"/>
               <w:right w:val="single" w:color="BFBFBF" w:sz="4"/>
             </w:tcBorders>
-            <w:shd w:fill="EBF5FB" w:val="clear"/>
+            <w:shd w:fill="F2F2F2" w:val="clear"/>
           </w:tcPr>
           <w:p>
             <w:pPr>
@@ -3748,7 +3661,7 @@
     <w:p>
       <w:pPr>
         <w:pBdr>
-          <w:bottom w:val="single" w:color="2E6DB4" w:sz="6"/>
+          <w:bottom w:val="single" w:color="000000" w:sz="6"/>
         </w:pBdr>
         <w:spacing w:after="60" w:before="160"/>
       </w:pPr>
@@ -3757,7 +3670,7 @@
           <w:rFonts w:ascii="Arial" w:cs="Arial" w:eastAsia="Arial" w:hAnsi="Arial"/>
           <w:b/>
           <w:bCs/>
-          <w:color w:val="1A3A6B"/>
+          <w:color w:val="000000"/>
           <w:sz w:val="21"/>
           <w:szCs w:val="21"/>
         </w:rPr>
@@ -3802,12 +3715,12 @@
           <w:tcPr>
             <w:tcW w:type="dxa" w:w="2800"/>
             <w:tcBorders>
-              <w:top w:val="single" w:color="2E6DB4" w:sz="8"/>
-              <w:left w:val="single" w:color="2E6DB4" w:sz="8"/>
-              <w:bottom w:val="single" w:color="2E6DB4" w:sz="8"/>
-              <w:right w:val="single" w:color="2E6DB4" w:sz="8"/>
-            </w:tcBorders>
-            <w:shd w:fill="2E6DB4" w:val="clear"/>
+              <w:top w:val="single" w:color="000000" w:sz="8"/>
+              <w:left w:val="single" w:color="000000" w:sz="8"/>
+              <w:bottom w:val="single" w:color="000000" w:sz="8"/>
+              <w:right w:val="single" w:color="000000" w:sz="8"/>
+            </w:tcBorders>
+            <w:shd w:fill="D9D9D9" w:val="clear"/>
           </w:tcPr>
           <w:p>
             <w:pPr>
@@ -3819,7 +3732,7 @@
                 <w:rFonts w:ascii="Arial" w:cs="Arial" w:eastAsia="Arial" w:hAnsi="Arial"/>
                 <w:b/>
                 <w:bCs/>
-                <w:color w:val="FFFFFF"/>
+                <w:color w:val="000000"/>
                 <w:sz w:val="19"/>
                 <w:szCs w:val="19"/>
               </w:rPr>
@@ -3831,12 +3744,12 @@
           <w:tcPr>
             <w:tcW w:type="dxa" w:w="4400"/>
             <w:tcBorders>
-              <w:top w:val="single" w:color="2E6DB4" w:sz="8"/>
-              <w:left w:val="single" w:color="2E6DB4" w:sz="8"/>
-              <w:bottom w:val="single" w:color="2E6DB4" w:sz="8"/>
-              <w:right w:val="single" w:color="2E6DB4" w:sz="8"/>
-            </w:tcBorders>
-            <w:shd w:fill="2E6DB4" w:val="clear"/>
+              <w:top w:val="single" w:color="000000" w:sz="8"/>
+              <w:left w:val="single" w:color="000000" w:sz="8"/>
+              <w:bottom w:val="single" w:color="000000" w:sz="8"/>
+              <w:right w:val="single" w:color="000000" w:sz="8"/>
+            </w:tcBorders>
+            <w:shd w:fill="D9D9D9" w:val="clear"/>
           </w:tcPr>
           <w:p>
             <w:pPr>
@@ -3848,7 +3761,7 @@
                 <w:rFonts w:ascii="Arial" w:cs="Arial" w:eastAsia="Arial" w:hAnsi="Arial"/>
                 <w:b/>
                 <w:bCs/>
-                <w:color w:val="FFFFFF"/>
+                <w:color w:val="000000"/>
                 <w:sz w:val="19"/>
                 <w:szCs w:val="19"/>
               </w:rPr>
@@ -3860,12 +3773,12 @@
           <w:tcPr>
             <w:tcW w:type="dxa" w:w="2160"/>
             <w:tcBorders>
-              <w:top w:val="single" w:color="2E6DB4" w:sz="8"/>
-              <w:left w:val="single" w:color="2E6DB4" w:sz="8"/>
-              <w:bottom w:val="single" w:color="2E6DB4" w:sz="8"/>
-              <w:right w:val="single" w:color="2E6DB4" w:sz="8"/>
-            </w:tcBorders>
-            <w:shd w:fill="2E6DB4" w:val="clear"/>
+              <w:top w:val="single" w:color="000000" w:sz="8"/>
+              <w:left w:val="single" w:color="000000" w:sz="8"/>
+              <w:bottom w:val="single" w:color="000000" w:sz="8"/>
+              <w:right w:val="single" w:color="000000" w:sz="8"/>
+            </w:tcBorders>
+            <w:shd w:fill="D9D9D9" w:val="clear"/>
           </w:tcPr>
           <w:p>
             <w:pPr>
@@ -3877,7 +3790,7 @@
                 <w:rFonts w:ascii="Arial" w:cs="Arial" w:eastAsia="Arial" w:hAnsi="Arial"/>
                 <w:b/>
                 <w:bCs/>
-                <w:color w:val="FFFFFF"/>
+                <w:color w:val="000000"/>
                 <w:sz w:val="19"/>
                 <w:szCs w:val="19"/>
               </w:rPr>
@@ -3896,19 +3809,19 @@
               <w:bottom w:val="single" w:color="BFBFBF" w:sz="4"/>
               <w:right w:val="single" w:color="BFBFBF" w:sz="4"/>
             </w:tcBorders>
-            <w:shd w:fill="EBF5FB" w:val="clear"/>
-          </w:tcPr>
-          <w:p>
-            <w:pPr>
-              <w:spacing w:after="60" w:before="60"/>
-              <w:ind w:left="115"/>
-            </w:pPr>
-            <w:r>
-              <w:rPr>
-                <w:rFonts w:ascii="Arial" w:cs="Arial" w:eastAsia="Arial" w:hAnsi="Arial"/>
-                <w:b/>
-                <w:bCs/>
-                <w:color w:val="1A3A6B"/>
+            <w:shd w:fill="F2F2F2" w:val="clear"/>
+          </w:tcPr>
+          <w:p>
+            <w:pPr>
+              <w:spacing w:after="60" w:before="60"/>
+              <w:ind w:left="115"/>
+            </w:pPr>
+            <w:r>
+              <w:rPr>
+                <w:rFonts w:ascii="Arial" w:cs="Arial" w:eastAsia="Arial" w:hAnsi="Arial"/>
+                <w:b/>
+                <w:bCs/>
+                <w:color w:val="000000"/>
                 <w:sz w:val="19"/>
                 <w:szCs w:val="19"/>
               </w:rPr>
@@ -3925,7 +3838,7 @@
               <w:bottom w:val="single" w:color="BFBFBF" w:sz="4"/>
               <w:right w:val="single" w:color="BFBFBF" w:sz="4"/>
             </w:tcBorders>
-            <w:shd w:fill="EBF5FB" w:val="clear"/>
+            <w:shd w:fill="F2F2F2" w:val="clear"/>
           </w:tcPr>
           <w:p>
             <w:pPr>
@@ -3952,7 +3865,7 @@
               <w:bottom w:val="single" w:color="BFBFBF" w:sz="4"/>
               <w:right w:val="single" w:color="BFBFBF" w:sz="4"/>
             </w:tcBorders>
-            <w:shd w:fill="EBF5FB" w:val="clear"/>
+            <w:shd w:fill="F2F2F2" w:val="clear"/>
             <w:vAlign w:val="center"/>
           </w:tcPr>
           <w:p>
@@ -3994,7 +3907,7 @@
                 <w:rFonts w:ascii="Arial" w:cs="Arial" w:eastAsia="Arial" w:hAnsi="Arial"/>
                 <w:b/>
                 <w:bCs/>
-                <w:color w:val="1A3A6B"/>
+                <w:color w:val="000000"/>
                 <w:sz w:val="19"/>
                 <w:szCs w:val="19"/>
               </w:rPr>
@@ -4068,19 +3981,19 @@
               <w:bottom w:val="single" w:color="BFBFBF" w:sz="4"/>
               <w:right w:val="single" w:color="BFBFBF" w:sz="4"/>
             </w:tcBorders>
-            <w:shd w:fill="EBF5FB" w:val="clear"/>
-          </w:tcPr>
-          <w:p>
-            <w:pPr>
-              <w:spacing w:after="60" w:before="60"/>
-              <w:ind w:left="115"/>
-            </w:pPr>
-            <w:r>
-              <w:rPr>
-                <w:rFonts w:ascii="Arial" w:cs="Arial" w:eastAsia="Arial" w:hAnsi="Arial"/>
-                <w:b/>
-                <w:bCs/>
-                <w:color w:val="1A3A6B"/>
+            <w:shd w:fill="F2F2F2" w:val="clear"/>
+          </w:tcPr>
+          <w:p>
+            <w:pPr>
+              <w:spacing w:after="60" w:before="60"/>
+              <w:ind w:left="115"/>
+            </w:pPr>
+            <w:r>
+              <w:rPr>
+                <w:rFonts w:ascii="Arial" w:cs="Arial" w:eastAsia="Arial" w:hAnsi="Arial"/>
+                <w:b/>
+                <w:bCs/>
+                <w:color w:val="000000"/>
                 <w:sz w:val="19"/>
                 <w:szCs w:val="19"/>
               </w:rPr>
@@ -4097,7 +4010,7 @@
               <w:bottom w:val="single" w:color="BFBFBF" w:sz="4"/>
               <w:right w:val="single" w:color="BFBFBF" w:sz="4"/>
             </w:tcBorders>
-            <w:shd w:fill="EBF5FB" w:val="clear"/>
+            <w:shd w:fill="F2F2F2" w:val="clear"/>
           </w:tcPr>
           <w:p>
             <w:pPr>
@@ -4124,7 +4037,7 @@
               <w:bottom w:val="single" w:color="BFBFBF" w:sz="4"/>
               <w:right w:val="single" w:color="BFBFBF" w:sz="4"/>
             </w:tcBorders>
-            <w:shd w:fill="EBF5FB" w:val="clear"/>
+            <w:shd w:fill="F2F2F2" w:val="clear"/>
             <w:vAlign w:val="center"/>
           </w:tcPr>
           <w:p>
@@ -4166,7 +4079,7 @@
                 <w:rFonts w:ascii="Arial" w:cs="Arial" w:eastAsia="Arial" w:hAnsi="Arial"/>
                 <w:b/>
                 <w:bCs/>
-                <w:color w:val="1A3A6B"/>
+                <w:color w:val="000000"/>
                 <w:sz w:val="19"/>
                 <w:szCs w:val="19"/>
               </w:rPr>
@@ -4240,19 +4153,19 @@
               <w:bottom w:val="single" w:color="BFBFBF" w:sz="4"/>
               <w:right w:val="single" w:color="BFBFBF" w:sz="4"/>
             </w:tcBorders>
-            <w:shd w:fill="EBF5FB" w:val="clear"/>
-          </w:tcPr>
-          <w:p>
-            <w:pPr>
-              <w:spacing w:after="60" w:before="60"/>
-              <w:ind w:left="115"/>
-            </w:pPr>
-            <w:r>
-              <w:rPr>
-                <w:rFonts w:ascii="Arial" w:cs="Arial" w:eastAsia="Arial" w:hAnsi="Arial"/>
-                <w:b/>
-                <w:bCs/>
-                <w:color w:val="1A3A6B"/>
+            <w:shd w:fill="F2F2F2" w:val="clear"/>
+          </w:tcPr>
+          <w:p>
+            <w:pPr>
+              <w:spacing w:after="60" w:before="60"/>
+              <w:ind w:left="115"/>
+            </w:pPr>
+            <w:r>
+              <w:rPr>
+                <w:rFonts w:ascii="Arial" w:cs="Arial" w:eastAsia="Arial" w:hAnsi="Arial"/>
+                <w:b/>
+                <w:bCs/>
+                <w:color w:val="000000"/>
                 <w:sz w:val="19"/>
                 <w:szCs w:val="19"/>
               </w:rPr>
@@ -4269,7 +4182,7 @@
               <w:bottom w:val="single" w:color="BFBFBF" w:sz="4"/>
               <w:right w:val="single" w:color="BFBFBF" w:sz="4"/>
             </w:tcBorders>
-            <w:shd w:fill="EBF5FB" w:val="clear"/>
+            <w:shd w:fill="F2F2F2" w:val="clear"/>
           </w:tcPr>
           <w:p>
             <w:pPr>
@@ -4296,7 +4209,7 @@
               <w:bottom w:val="single" w:color="BFBFBF" w:sz="4"/>
               <w:right w:val="single" w:color="BFBFBF" w:sz="4"/>
             </w:tcBorders>
-            <w:shd w:fill="EBF5FB" w:val="clear"/>
+            <w:shd w:fill="F2F2F2" w:val="clear"/>
             <w:vAlign w:val="center"/>
           </w:tcPr>
           <w:p>
@@ -4338,7 +4251,7 @@
                 <w:rFonts w:ascii="Arial" w:cs="Arial" w:eastAsia="Arial" w:hAnsi="Arial"/>
                 <w:b/>
                 <w:bCs/>
-                <w:color w:val="1A3A6B"/>
+                <w:color w:val="000000"/>
                 <w:sz w:val="19"/>
                 <w:szCs w:val="19"/>
               </w:rPr>
@@ -4412,19 +4325,19 @@
               <w:bottom w:val="single" w:color="BFBFBF" w:sz="4"/>
               <w:right w:val="single" w:color="BFBFBF" w:sz="4"/>
             </w:tcBorders>
-            <w:shd w:fill="EBF5FB" w:val="clear"/>
-          </w:tcPr>
-          <w:p>
-            <w:pPr>
-              <w:spacing w:after="60" w:before="60"/>
-              <w:ind w:left="115"/>
-            </w:pPr>
-            <w:r>
-              <w:rPr>
-                <w:rFonts w:ascii="Arial" w:cs="Arial" w:eastAsia="Arial" w:hAnsi="Arial"/>
-                <w:b/>
-                <w:bCs/>
-                <w:color w:val="1A3A6B"/>
+            <w:shd w:fill="F2F2F2" w:val="clear"/>
+          </w:tcPr>
+          <w:p>
+            <w:pPr>
+              <w:spacing w:after="60" w:before="60"/>
+              <w:ind w:left="115"/>
+            </w:pPr>
+            <w:r>
+              <w:rPr>
+                <w:rFonts w:ascii="Arial" w:cs="Arial" w:eastAsia="Arial" w:hAnsi="Arial"/>
+                <w:b/>
+                <w:bCs/>
+                <w:color w:val="000000"/>
                 <w:sz w:val="19"/>
                 <w:szCs w:val="19"/>
               </w:rPr>
@@ -4441,7 +4354,7 @@
               <w:bottom w:val="single" w:color="BFBFBF" w:sz="4"/>
               <w:right w:val="single" w:color="BFBFBF" w:sz="4"/>
             </w:tcBorders>
-            <w:shd w:fill="EBF5FB" w:val="clear"/>
+            <w:shd w:fill="F2F2F2" w:val="clear"/>
           </w:tcPr>
           <w:p>
             <w:pPr>
@@ -4468,7 +4381,7 @@
               <w:bottom w:val="single" w:color="BFBFBF" w:sz="4"/>
               <w:right w:val="single" w:color="BFBFBF" w:sz="4"/>
             </w:tcBorders>
-            <w:shd w:fill="EBF5FB" w:val="clear"/>
+            <w:shd w:fill="F2F2F2" w:val="clear"/>
             <w:vAlign w:val="center"/>
           </w:tcPr>
           <w:p>
@@ -4532,7 +4445,7 @@
     <w:p>
       <w:pPr>
         <w:pBdr>
-          <w:bottom w:val="single" w:color="2E6DB4" w:sz="6"/>
+          <w:bottom w:val="single" w:color="000000" w:sz="6"/>
         </w:pBdr>
         <w:spacing w:after="60" w:before="160"/>
       </w:pPr>
@@ -4541,7 +4454,7 @@
           <w:rFonts w:ascii="Arial" w:cs="Arial" w:eastAsia="Arial" w:hAnsi="Arial"/>
           <w:b/>
           <w:bCs/>
-          <w:color w:val="1A3A6B"/>
+          <w:color w:val="000000"/>
           <w:sz w:val="21"/>
           <w:szCs w:val="21"/>
         </w:rPr>
@@ -4636,7 +4549,7 @@
     <w:p>
       <w:pPr>
         <w:pBdr>
-          <w:bottom w:val="single" w:color="2E6DB4" w:sz="6"/>
+          <w:bottom w:val="single" w:color="000000" w:sz="6"/>
         </w:pBdr>
         <w:spacing w:after="60" w:before="160"/>
       </w:pPr>
@@ -4645,7 +4558,7 @@
           <w:rFonts w:ascii="Arial" w:cs="Arial" w:eastAsia="Arial" w:hAnsi="Arial"/>
           <w:b/>
           <w:bCs/>
-          <w:color w:val="1A3A6B"/>
+          <w:color w:val="000000"/>
           <w:sz w:val="21"/>
           <w:szCs w:val="21"/>
         </w:rPr>
@@ -4701,7 +4614,7 @@
     </w:p>
     <w:p>
       <w:pPr>
-        <w:shd w:fill="2E6DB4" w:val="clear"/>
+        <w:shd w:fill="D9D9D9" w:val="clear"/>
         <w:spacing w:after="0" w:before="0"/>
         <w:ind w:left="144"/>
         <w:jc w:val="left"/>
@@ -4711,7 +4624,7 @@
           <w:rFonts w:ascii="Arial" w:cs="Arial" w:eastAsia="Arial" w:hAnsi="Arial"/>
           <w:b/>
           <w:bCs/>
-          <w:color w:val="FFFFFF"/>
+          <w:color w:val="000000"/>
           <w:sz w:val="24"/>
           <w:szCs w:val="24"/>
         </w:rPr>
@@ -4751,12 +4664,12 @@
           <w:tcPr>
             <w:tcW w:type="dxa" w:w="2000"/>
             <w:tcBorders>
-              <w:top w:val="single" w:color="2E6DB4" w:sz="8"/>
-              <w:left w:val="single" w:color="2E6DB4" w:sz="8"/>
-              <w:bottom w:val="single" w:color="2E6DB4" w:sz="8"/>
-              <w:right w:val="single" w:color="2E6DB4" w:sz="8"/>
-            </w:tcBorders>
-            <w:shd w:fill="2E6DB4" w:val="clear"/>
+              <w:top w:val="single" w:color="000000" w:sz="8"/>
+              <w:left w:val="single" w:color="000000" w:sz="8"/>
+              <w:bottom w:val="single" w:color="000000" w:sz="8"/>
+              <w:right w:val="single" w:color="000000" w:sz="8"/>
+            </w:tcBorders>
+            <w:shd w:fill="D9D9D9" w:val="clear"/>
           </w:tcPr>
           <w:p>
             <w:pPr>
@@ -4768,7 +4681,7 @@
                 <w:rFonts w:ascii="Arial" w:cs="Arial" w:eastAsia="Arial" w:hAnsi="Arial"/>
                 <w:b/>
                 <w:bCs/>
-                <w:color w:val="FFFFFF"/>
+                <w:color w:val="000000"/>
                 <w:sz w:val="19"/>
                 <w:szCs w:val="19"/>
               </w:rPr>
@@ -4780,12 +4693,12 @@
           <w:tcPr>
             <w:tcW w:type="dxa" w:w="7360"/>
             <w:tcBorders>
-              <w:top w:val="single" w:color="2E6DB4" w:sz="8"/>
-              <w:left w:val="single" w:color="2E6DB4" w:sz="8"/>
-              <w:bottom w:val="single" w:color="2E6DB4" w:sz="8"/>
-              <w:right w:val="single" w:color="2E6DB4" w:sz="8"/>
-            </w:tcBorders>
-            <w:shd w:fill="2E6DB4" w:val="clear"/>
+              <w:top w:val="single" w:color="000000" w:sz="8"/>
+              <w:left w:val="single" w:color="000000" w:sz="8"/>
+              <w:bottom w:val="single" w:color="000000" w:sz="8"/>
+              <w:right w:val="single" w:color="000000" w:sz="8"/>
+            </w:tcBorders>
+            <w:shd w:fill="D9D9D9" w:val="clear"/>
           </w:tcPr>
           <w:p>
             <w:pPr>
@@ -4797,7 +4710,7 @@
                 <w:rFonts w:ascii="Arial" w:cs="Arial" w:eastAsia="Arial" w:hAnsi="Arial"/>
                 <w:b/>
                 <w:bCs/>
-                <w:color w:val="FFFFFF"/>
+                <w:color w:val="000000"/>
                 <w:sz w:val="19"/>
                 <w:szCs w:val="19"/>
               </w:rPr>
@@ -4816,19 +4729,19 @@
               <w:bottom w:val="single" w:color="BFBFBF" w:sz="4"/>
               <w:right w:val="single" w:color="BFBFBF" w:sz="4"/>
             </w:tcBorders>
-            <w:shd w:fill="EBF5FB" w:val="clear"/>
-          </w:tcPr>
-          <w:p>
-            <w:pPr>
-              <w:spacing w:after="60" w:before="60"/>
-              <w:jc w:val="center"/>
-            </w:pPr>
-            <w:r>
-              <w:rPr>
-                <w:rFonts w:ascii="Arial" w:cs="Arial" w:eastAsia="Arial" w:hAnsi="Arial"/>
-                <w:b/>
-                <w:bCs/>
-                <w:color w:val="1A3A6B"/>
+            <w:shd w:fill="F2F2F2" w:val="clear"/>
+          </w:tcPr>
+          <w:p>
+            <w:pPr>
+              <w:spacing w:after="60" w:before="60"/>
+              <w:jc w:val="center"/>
+            </w:pPr>
+            <w:r>
+              <w:rPr>
+                <w:rFonts w:ascii="Arial" w:cs="Arial" w:eastAsia="Arial" w:hAnsi="Arial"/>
+                <w:b/>
+                <w:bCs/>
+                <w:color w:val="000000"/>
                 <w:sz w:val="19"/>
                 <w:szCs w:val="19"/>
               </w:rPr>
@@ -4845,7 +4758,7 @@
               <w:bottom w:val="single" w:color="BFBFBF" w:sz="4"/>
               <w:right w:val="single" w:color="BFBFBF" w:sz="4"/>
             </w:tcBorders>
-            <w:shd w:fill="EBF5FB" w:val="clear"/>
+            <w:shd w:fill="F2F2F2" w:val="clear"/>
           </w:tcPr>
           <w:p>
             <w:pPr>
@@ -4879,7 +4792,7 @@
     </w:p>
     <w:p>
       <w:pPr>
-        <w:shd w:fill="2E6DB4" w:val="clear"/>
+        <w:shd w:fill="D9D9D9" w:val="clear"/>
         <w:spacing w:after="0" w:before="0"/>
         <w:ind w:left="144"/>
         <w:jc w:val="left"/>
@@ -4889,7 +4802,7 @@
           <w:rFonts w:ascii="Arial" w:cs="Arial" w:eastAsia="Arial" w:hAnsi="Arial"/>
           <w:b/>
           <w:bCs/>
-          <w:color w:val="FFFFFF"/>
+          <w:color w:val="000000"/>
           <w:sz w:val="24"/>
           <w:szCs w:val="24"/>
         </w:rPr>
@@ -4931,12 +4844,12 @@
           <w:tcPr>
             <w:tcW w:type="dxa" w:w="1400"/>
             <w:tcBorders>
-              <w:top w:val="single" w:color="2E6DB4" w:sz="8"/>
-              <w:left w:val="single" w:color="2E6DB4" w:sz="8"/>
-              <w:bottom w:val="single" w:color="2E6DB4" w:sz="8"/>
-              <w:right w:val="single" w:color="2E6DB4" w:sz="8"/>
-            </w:tcBorders>
-            <w:shd w:fill="2E6DB4" w:val="clear"/>
+              <w:top w:val="single" w:color="000000" w:sz="8"/>
+              <w:left w:val="single" w:color="000000" w:sz="8"/>
+              <w:bottom w:val="single" w:color="000000" w:sz="8"/>
+              <w:right w:val="single" w:color="000000" w:sz="8"/>
+            </w:tcBorders>
+            <w:shd w:fill="D9D9D9" w:val="clear"/>
           </w:tcPr>
           <w:p>
             <w:pPr>
@@ -4948,7 +4861,7 @@
                 <w:rFonts w:ascii="Arial" w:cs="Arial" w:eastAsia="Arial" w:hAnsi="Arial"/>
                 <w:b/>
                 <w:bCs/>
-                <w:color w:val="FFFFFF"/>
+                <w:color w:val="000000"/>
                 <w:sz w:val="19"/>
                 <w:szCs w:val="19"/>
               </w:rPr>
@@ -4960,12 +4873,12 @@
           <w:tcPr>
             <w:tcW w:type="dxa" w:w="1400"/>
             <w:tcBorders>
-              <w:top w:val="single" w:color="2E6DB4" w:sz="8"/>
-              <w:left w:val="single" w:color="2E6DB4" w:sz="8"/>
-              <w:bottom w:val="single" w:color="2E6DB4" w:sz="8"/>
-              <w:right w:val="single" w:color="2E6DB4" w:sz="8"/>
-            </w:tcBorders>
-            <w:shd w:fill="2E6DB4" w:val="clear"/>
+              <w:top w:val="single" w:color="000000" w:sz="8"/>
+              <w:left w:val="single" w:color="000000" w:sz="8"/>
+              <w:bottom w:val="single" w:color="000000" w:sz="8"/>
+              <w:right w:val="single" w:color="000000" w:sz="8"/>
+            </w:tcBorders>
+            <w:shd w:fill="D9D9D9" w:val="clear"/>
           </w:tcPr>
           <w:p>
             <w:pPr>
@@ -4977,7 +4890,7 @@
                 <w:rFonts w:ascii="Arial" w:cs="Arial" w:eastAsia="Arial" w:hAnsi="Arial"/>
                 <w:b/>
                 <w:bCs/>
-                <w:color w:val="FFFFFF"/>
+                <w:color w:val="000000"/>
                 <w:sz w:val="19"/>
                 <w:szCs w:val="19"/>
               </w:rPr>
@@ -4989,12 +4902,12 @@
           <w:tcPr>
             <w:tcW w:type="dxa" w:w="3400"/>
             <w:tcBorders>
-              <w:top w:val="single" w:color="2E6DB4" w:sz="8"/>
-              <w:left w:val="single" w:color="2E6DB4" w:sz="8"/>
-              <w:bottom w:val="single" w:color="2E6DB4" w:sz="8"/>
-              <w:right w:val="single" w:color="2E6DB4" w:sz="8"/>
-            </w:tcBorders>
-            <w:shd w:fill="2E6DB4" w:val="clear"/>
+              <w:top w:val="single" w:color="000000" w:sz="8"/>
+              <w:left w:val="single" w:color="000000" w:sz="8"/>
+              <w:bottom w:val="single" w:color="000000" w:sz="8"/>
+              <w:right w:val="single" w:color="000000" w:sz="8"/>
+            </w:tcBorders>
+            <w:shd w:fill="D9D9D9" w:val="clear"/>
           </w:tcPr>
           <w:p>
             <w:pPr>
@@ -5006,7 +4919,7 @@
                 <w:rFonts w:ascii="Arial" w:cs="Arial" w:eastAsia="Arial" w:hAnsi="Arial"/>
                 <w:b/>
                 <w:bCs/>
-                <w:color w:val="FFFFFF"/>
+                <w:color w:val="000000"/>
                 <w:sz w:val="19"/>
                 <w:szCs w:val="19"/>
               </w:rPr>
@@ -5018,12 +4931,12 @@
           <w:tcPr>
             <w:tcW w:type="dxa" w:w="3160"/>
             <w:tcBorders>
-              <w:top w:val="single" w:color="2E6DB4" w:sz="8"/>
-              <w:left w:val="single" w:color="2E6DB4" w:sz="8"/>
-              <w:bottom w:val="single" w:color="2E6DB4" w:sz="8"/>
-              <w:right w:val="single" w:color="2E6DB4" w:sz="8"/>
-            </w:tcBorders>
-            <w:shd w:fill="2E6DB4" w:val="clear"/>
+              <w:top w:val="single" w:color="000000" w:sz="8"/>
+              <w:left w:val="single" w:color="000000" w:sz="8"/>
+              <w:bottom w:val="single" w:color="000000" w:sz="8"/>
+              <w:right w:val="single" w:color="000000" w:sz="8"/>
+            </w:tcBorders>
+            <w:shd w:fill="D9D9D9" w:val="clear"/>
           </w:tcPr>
           <w:p>
             <w:pPr>
@@ -5035,7 +4948,7 @@
                 <w:rFonts w:ascii="Arial" w:cs="Arial" w:eastAsia="Arial" w:hAnsi="Arial"/>
                 <w:b/>
                 <w:bCs/>
-                <w:color w:val="FFFFFF"/>
+                <w:color w:val="000000"/>
                 <w:sz w:val="19"/>
                 <w:szCs w:val="19"/>
               </w:rPr>

</xml_diff>